<commit_message>
tas58xx docs: EQ proposal v2 - raw biquads, filter maths in a library, risks
Co-Authored-By: Claude Opus 5.5 <noreply@anthropic.com>
</commit_message>
<xml_diff>
--- a/esphome/components/tas58xx/docs/TAS58xx_EQ_Control_Proposal_v2.docx
+++ b/esphome/components/tas58xx/docs/TAS58xx_EQ_Control_Proposal_v2.docx
@@ -102,6 +102,25 @@
         <w:spacing w:after="60"/>
       </w:pPr>
       <w:r>
+        <w:t xml:space="preserve">A </w:t>
+      </w:r>
+      <w:r>
+        <w:rPr>
+          <w:rFonts w:ascii="Consolas" w:hAnsi="Consolas"/>
+          <w:sz w:val="20"/>
+        </w:rPr>
+        <w:t>biquads</w:t>
+      </w:r>
+      <w:r>
+        <w:t xml:space="preserve"> list on the audio_dac for raw coefficients, for example exported from TI PurePath Console or REW. Needs no filter maths.</w:t>
+      </w:r>
+    </w:p>
+    <w:p>
+      <w:pPr>
+        <w:pStyle w:val="ListBullet"/>
+        <w:spacing w:after="60"/>
+      </w:pPr>
+      <w:r>
         <w:t xml:space="preserve">Every entry has a </w:t>
       </w:r>
       <w:r>
@@ -131,7 +150,7 @@
         <w:spacing w:after="60"/>
       </w:pPr>
       <w:r>
-        <w:t xml:space="preserve">Fixed filters and bands can all be combined on a channel, up to </w:t>
+        <w:t xml:space="preserve">Raw biquads, fixed filters and bands can all be combined on a channel, up to </w:t>
       </w:r>
       <w:r>
         <w:rPr>
@@ -279,6 +298,25 @@
       </w:r>
       <w:r>
         <w:t>, a slider that sets the frequency of a filter.</w:t>
+      </w:r>
+    </w:p>
+    <w:p>
+      <w:pPr>
+        <w:pStyle w:val="ListBullet"/>
+        <w:spacing w:after="60"/>
+      </w:pPr>
+      <w:r>
+        <w:t xml:space="preserve">New: </w:t>
+      </w:r>
+      <w:r>
+        <w:rPr>
+          <w:rFonts w:ascii="Consolas" w:hAnsi="Consolas"/>
+          <w:sz w:val="20"/>
+        </w:rPr>
+        <w:t>biquads</w:t>
+      </w:r>
+      <w:r>
+        <w:t>, raw coefficients entered in the YAML.</w:t>
       </w:r>
     </w:p>
     <w:p>
@@ -2189,6 +2227,173 @@
     </w:p>
     <w:p>
       <w:pPr>
+        <w:pStyle w:val="ListBullet"/>
+        <w:spacing w:after="60"/>
+      </w:pPr>
+      <w:r>
+        <w:t>If the range does not include 1000 Hz, a frequency slider starts at the nearest end of the range.</w:t>
+      </w:r>
+    </w:p>
+    <w:p>
+      <w:pPr>
+        <w:pStyle w:val="Heading1"/>
+      </w:pPr>
+      <w:r>
+        <w:t>Raw Biquads</w:t>
+      </w:r>
+    </w:p>
+    <w:p>
+      <w:r>
+        <w:t>For users who design their filters elsewhere, for example in TI PurePath Console or REW. Core writes the coefficients as given: no filter maths, so raw biquads work with option 2 and option 3 below, and on every platform, not only ESP32.</w:t>
+      </w:r>
+    </w:p>
+    <w:p>
+      <w:pPr>
+        <w:spacing w:before="0" w:after="0" w:line="240" w:lineRule="auto"/>
+        <w:ind w:left="113"/>
+        <w:shd w:val="clear" w:color="auto" w:fill="F2F2F2"/>
+      </w:pPr>
+      <w:r>
+        <w:rPr>
+          <w:rFonts w:ascii="Consolas" w:hAnsi="Consolas"/>
+          <w:sz w:val="18"/>
+        </w:rPr>
+        <w:t>audio_dac:</w:t>
+      </w:r>
+    </w:p>
+    <w:p>
+      <w:pPr>
+        <w:spacing w:before="0" w:after="0" w:line="240" w:lineRule="auto"/>
+        <w:ind w:left="113"/>
+        <w:shd w:val="clear" w:color="auto" w:fill="F2F2F2"/>
+      </w:pPr>
+      <w:r>
+        <w:rPr>
+          <w:rFonts w:ascii="Consolas" w:hAnsi="Consolas"/>
+          <w:sz w:val="18"/>
+        </w:rPr>
+        <w:t xml:space="preserve">  - platform: tas58xx</w:t>
+      </w:r>
+    </w:p>
+    <w:p>
+      <w:pPr>
+        <w:spacing w:before="0" w:after="0" w:line="240" w:lineRule="auto"/>
+        <w:ind w:left="113"/>
+        <w:shd w:val="clear" w:color="auto" w:fill="F2F2F2"/>
+      </w:pPr>
+      <w:r>
+        <w:rPr>
+          <w:rFonts w:ascii="Consolas" w:hAnsi="Consolas"/>
+          <w:sz w:val="18"/>
+        </w:rPr>
+        <w:t xml:space="preserve">    biquads:</w:t>
+      </w:r>
+    </w:p>
+    <w:p>
+      <w:pPr>
+        <w:spacing w:before="0" w:after="0" w:line="240" w:lineRule="auto"/>
+        <w:ind w:left="113"/>
+        <w:shd w:val="clear" w:color="auto" w:fill="F2F2F2"/>
+      </w:pPr>
+      <w:r>
+        <w:rPr>
+          <w:rFonts w:ascii="Consolas" w:hAnsi="Consolas"/>
+          <w:sz w:val="18"/>
+        </w:rPr>
+        <w:t xml:space="preserve">      - coefficients: [1.0012, -1.9874, 0.9867, -1.9874, 0.9879]   # b0 b1 b2 a1 a2</w:t>
+      </w:r>
+    </w:p>
+    <w:p>
+      <w:pPr>
+        <w:spacing w:before="0" w:after="0" w:line="240" w:lineRule="auto"/>
+        <w:ind w:left="113"/>
+        <w:shd w:val="clear" w:color="auto" w:fill="F2F2F2"/>
+      </w:pPr>
+      <w:r>
+        <w:rPr>
+          <w:rFonts w:ascii="Consolas" w:hAnsi="Consolas"/>
+          <w:sz w:val="18"/>
+        </w:rPr>
+        <w:t xml:space="preserve">        channel: both           # left | right | both, default both</w:t>
+      </w:r>
+    </w:p>
+    <w:p>
+      <w:pPr>
+        <w:spacing w:before="0" w:after="160" w:line="240" w:lineRule="auto"/>
+        <w:ind w:left="113"/>
+        <w:shd w:val="clear" w:color="auto" w:fill="F2F2F2"/>
+      </w:pPr>
+      <w:r>
+        <w:rPr>
+          <w:rFonts w:ascii="Consolas" w:hAnsi="Consolas"/>
+          <w:sz w:val="18"/>
+        </w:rPr>
+        <w:t xml:space="preserve">        always_on: true         # default true, as fixed filters</w:t>
+      </w:r>
+    </w:p>
+    <w:p>
+      <w:pPr>
+        <w:pStyle w:val="ListBullet"/>
+        <w:spacing w:after="60"/>
+      </w:pPr>
+      <w:r>
+        <w:rPr>
+          <w:b/>
+        </w:rPr>
+        <w:t>Coefficients must be designed for 96 kHz</w:t>
+      </w:r>
+      <w:r>
+        <w:t>, whatever the input sample rate: the TAS58xx DSP always runs at 96 kHz.</w:t>
+      </w:r>
+    </w:p>
+    <w:p>
+      <w:pPr>
+        <w:pStyle w:val="ListBullet"/>
+        <w:spacing w:after="60"/>
+      </w:pPr>
+      <w:r>
+        <w:t>Five values in the order b0, b1, b2, a1, a2, normalised so a0 = 1, using the standard sign convention (denominator 1 + a1 z^-1 + a2 z^-2). Core converts them to the DSP's 5.27 format and its sign convention.</w:t>
+      </w:r>
+    </w:p>
+    <w:p>
+      <w:pPr>
+        <w:pStyle w:val="ListBullet"/>
+        <w:spacing w:after="60"/>
+      </w:pPr>
+      <w:r>
+        <w:t>Python checks each value fits the 5.27 range (-16 to just under +16) and that the filter is stable (|a2| &lt; 1 and |a1| &lt; 1 + a2). This is validation only, not filter design.</w:t>
+      </w:r>
+    </w:p>
+    <w:p>
+      <w:pPr>
+        <w:pStyle w:val="ListBullet"/>
+        <w:spacing w:after="60"/>
+      </w:pPr>
+      <w:r>
+        <w:t>Raw biquads count towards the 15 biquads per channel and follow the EQ switch like any other entry.</w:t>
+      </w:r>
+    </w:p>
+    <w:p>
+      <w:pPr>
+        <w:pStyle w:val="ListBullet"/>
+        <w:spacing w:after="60"/>
+      </w:pPr>
+      <w:r>
+        <w:t xml:space="preserve">A public </w:t>
+      </w:r>
+      <w:r>
+        <w:rPr>
+          <w:rFonts w:ascii="Consolas" w:hAnsi="Consolas"/>
+          <w:sz w:val="20"/>
+        </w:rPr>
+        <w:t>set_biquad()</w:t>
+      </w:r>
+      <w:r>
+        <w:t xml:space="preserve"> method and a matching YAML action let an automation, a lambda or an external component change raw coefficients at runtime. New values are kept pending and written once the DSP is writable, using the same mechanism as the mixer mode.</w:t>
+      </w:r>
+    </w:p>
+    <w:p>
+      <w:pPr>
         <w:pStyle w:val="Heading1"/>
       </w:pPr>
       <w:r>
@@ -2324,7 +2529,7 @@
               <w:t>always_on: true</w:t>
             </w:r>
             <w:r>
-              <w:t xml:space="preserve"> (fixed filters default)</w:t>
+              <w:t xml:space="preserve"> (fixed filters and raw biquads default)</w:t>
             </w:r>
           </w:p>
         </w:tc>
@@ -2450,7 +2655,7 @@
         <w:spacing w:after="60"/>
       </w:pPr>
       <w:r>
-        <w:t>Cuts first: high pass, then low pass / notch / band pass, then shelves / equalizer / peaking. YAML order is kept within a group: fixed filters, then gain bands, then frequency bands.</w:t>
+        <w:t>Raw biquads come first, in YAML order (their filter type is not known).</w:t>
       </w:r>
     </w:p>
     <w:p>
@@ -2459,7 +2664,16 @@
         <w:spacing w:after="60"/>
       </w:pPr>
       <w:r>
-        <w:t>Fixed filters + gain bands + frequency bands must be 15 or fewer per channel, otherwise a config error.</w:t>
+        <w:t>Then cuts first: high pass, then low pass / notch / band pass, then shelves / equalizer / peaking. YAML order is kept within a group: fixed filters, then gain bands, then frequency bands.</w:t>
+      </w:r>
+    </w:p>
+    <w:p>
+      <w:pPr>
+        <w:pStyle w:val="ListBullet"/>
+        <w:spacing w:after="60"/>
+      </w:pPr>
+      <w:r>
+        <w:t>Raw biquads + fixed filters + gain bands + frequency bands must be 15 or fewer per channel, otherwise a config error.</w:t>
       </w:r>
     </w:p>
     <w:p>
@@ -3627,17 +3841,163 @@
         <w:t>frequency_bands</w:t>
       </w:r>
       <w:r>
-        <w:t xml:space="preserve"> can change the frequency of any filter at runtime, so every filter's coefficient formula and the conversion to the DSP's 5.27 fixed point format must run on the device. Only </w:t>
+        <w:t xml:space="preserve"> can change the frequency of any filter at runtime, so every filter's coefficient formula and the conversion to the DSP's 5.27 fixed point format must run on the device.</w:t>
+      </w:r>
+    </w:p>
+    <w:p>
+      <w:pPr>
+        <w:pStyle w:val="ListBullet"/>
+        <w:spacing w:after="60"/>
+      </w:pPr>
+      <w:r>
+        <w:rPr>
+          <w:b/>
+        </w:rPr>
+        <w:t>All coefficient maths lives in one library, run on the device.</w:t>
+      </w:r>
+      <w:r>
+        <w:t xml:space="preserve"> Python only validates. Calculating fixed filters in Python at compile time would need a second copy of the maths (Python cannot call the ESP32 library), for no real gain: the library is linked as soon as there is a slider, and calculating 30 biquads at boot takes well under a millisecond.</w:t>
+      </w:r>
+    </w:p>
+    <w:p>
+      <w:pPr>
+        <w:pStyle w:val="ListBullet"/>
+        <w:spacing w:after="60"/>
+      </w:pPr>
+      <w:r>
+        <w:t>The library is plain C/C++ with no ESPHome code: biquad design in double precision matching TI PurePath Console for all 8 filter types, and conversion to a fixed point format given as a parameter (5.27 for the TAS58xx), so other DACs could use it. It has its own tests against PurePath Console reference coefficients.</w:t>
+      </w:r>
+    </w:p>
+    <w:p>
+      <w:pPr>
+        <w:pStyle w:val="ListBullet"/>
+        <w:spacing w:after="60"/>
+      </w:pPr>
+      <w:r>
+        <w:t xml:space="preserve">It is published on the ESP Component Registry as </w:t>
       </w:r>
       <w:r>
         <w:rPr>
           <w:rFonts w:ascii="Consolas" w:hAnsi="Consolas"/>
           <w:sz w:val="20"/>
         </w:rPr>
-        <w:t>fixed_filters</w:t>
-      </w:r>
-      <w:r>
-        <w:t xml:space="preserve"> could be calculated in Python at compile time. EQ is ESP32 only.</w:t>
+        <w:t>mrtoy-me/&lt;name&gt;</w:t>
+      </w:r>
+      <w:r>
+        <w:t xml:space="preserve">: sign in with GitHub, add </w:t>
+      </w:r>
+      <w:r>
+        <w:rPr>
+          <w:rFonts w:ascii="Consolas" w:hAnsi="Consolas"/>
+          <w:sz w:val="20"/>
+        </w:rPr>
+        <w:t>idf_component.yml</w:t>
+      </w:r>
+      <w:r>
+        <w:t xml:space="preserve">, </w:t>
+      </w:r>
+      <w:r>
+        <w:rPr>
+          <w:rFonts w:ascii="Consolas" w:hAnsi="Consolas"/>
+          <w:sz w:val="20"/>
+        </w:rPr>
+        <w:t>CMakeLists.txt</w:t>
+      </w:r>
+      <w:r>
+        <w:t xml:space="preserve"> and a licence, upload with Espressif's tool or GitHub action. Espressif does not review uploads.</w:t>
+      </w:r>
+    </w:p>
+    <w:p>
+      <w:pPr>
+        <w:pStyle w:val="Heading2"/>
+      </w:pPr>
+      <w:r>
+        <w:t>Option 2: EQ in core, maths in the library (chosen)</w:t>
+      </w:r>
+    </w:p>
+    <w:p>
+      <w:pPr>
+        <w:pStyle w:val="ListBullet"/>
+        <w:spacing w:after="60"/>
+      </w:pPr>
+      <w:r>
+        <w:t xml:space="preserve">Core tas58xx: the v2 YAML and entities, validation, biquad assignment, EQ switch, raw biquads, and the register writes through the existing </w:t>
+      </w:r>
+      <w:r>
+        <w:rPr>
+          <w:rFonts w:ascii="Consolas" w:hAnsi="Consolas"/>
+          <w:sz w:val="20"/>
+        </w:rPr>
+        <w:t>write_dsp_()</w:t>
+      </w:r>
+      <w:r>
+        <w:t xml:space="preserve"> mechanism.</w:t>
+      </w:r>
+    </w:p>
+    <w:p>
+      <w:pPr>
+        <w:pStyle w:val="ListBullet"/>
+        <w:spacing w:after="60"/>
+      </w:pPr>
+      <w:r>
+        <w:t xml:space="preserve">Core pulls the library in with </w:t>
+      </w:r>
+      <w:r>
+        <w:rPr>
+          <w:rFonts w:ascii="Consolas" w:hAnsi="Consolas"/>
+          <w:sz w:val="20"/>
+        </w:rPr>
+        <w:t>add_idf_component</w:t>
+      </w:r>
+      <w:r>
+        <w:t xml:space="preserve"> and lists it in </w:t>
+      </w:r>
+      <w:r>
+        <w:rPr>
+          <w:rFonts w:ascii="Consolas" w:hAnsi="Consolas"/>
+          <w:sz w:val="20"/>
+        </w:rPr>
+        <w:t>esphome/idf_component.yml</w:t>
+      </w:r>
+      <w:r>
+        <w:t>. EQ (fixed filters and bands) is ESP32 only.</w:t>
+      </w:r>
+    </w:p>
+    <w:p>
+      <w:pPr>
+        <w:pStyle w:val="ListBullet"/>
+        <w:spacing w:after="60"/>
+      </w:pPr>
+      <w:r>
+        <w:t xml:space="preserve">Precedent: espectre (esphome/esphome#19801, merged 2026-10-07) is a thin core component on top of its author's own registry library, </w:t>
+      </w:r>
+      <w:r>
+        <w:rPr>
+          <w:rFonts w:ascii="Consolas" w:hAnsi="Consolas"/>
+          <w:sz w:val="20"/>
+        </w:rPr>
+        <w:t>francescopace/espectre</w:t>
+      </w:r>
+      <w:r>
+        <w:t xml:space="preserve">; sendspin uses </w:t>
+      </w:r>
+      <w:r>
+        <w:rPr>
+          <w:rFonts w:ascii="Consolas" w:hAnsi="Consolas"/>
+          <w:sz w:val="20"/>
+        </w:rPr>
+        <w:t>sendspin/sendspin-cpp</w:t>
+      </w:r>
+      <w:r>
+        <w:t xml:space="preserve"> the same way.</w:t>
+      </w:r>
+    </w:p>
+    <w:p>
+      <w:pPr>
+        <w:pStyle w:val="Heading2"/>
+      </w:pPr>
+      <w:r>
+        <w:t>Likely Risks: Option 2</w:t>
       </w:r>
     </w:p>
     <w:tbl>
@@ -3648,14 +4008,13 @@
         <w:tblLook w:firstColumn="1" w:firstRow="1" w:lastColumn="0" w:lastRow="0" w:noHBand="0" w:noVBand="1" w:val="04A0"/>
       </w:tblPr>
       <w:tblGrid>
-        <w:gridCol w:w="3024"/>
-        <w:gridCol w:w="3024"/>
-        <w:gridCol w:w="3024"/>
+        <w:gridCol w:w="4536"/>
+        <w:gridCol w:w="4536"/>
       </w:tblGrid>
       <w:tr>
         <w:tc>
           <w:tcPr>
-            <w:tcW w:type="dxa" w:w="1814"/>
+            <w:tcW w:type="dxa" w:w="3969"/>
             <w:shd w:val="clear" w:color="auto" w:fill="D9E2F3"/>
           </w:tcPr>
           <w:p>
@@ -3666,13 +4025,13 @@
               <w:rPr>
                 <w:b/>
               </w:rPr>
-              <w:t>Option</w:t>
+              <w:t>Risk</w:t>
             </w:r>
           </w:p>
         </w:tc>
         <w:tc>
           <w:tcPr>
-            <w:tcW w:type="dxa" w:w="2835"/>
+            <w:tcW w:type="dxa" w:w="5102"/>
             <w:shd w:val="clear" w:color="auto" w:fill="D9E2F3"/>
           </w:tcPr>
           <w:p>
@@ -3683,13 +4042,298 @@
               <w:rPr>
                 <w:b/>
               </w:rPr>
-              <w:t>How</w:t>
+              <w:t>Consequence</w:t>
+            </w:r>
+          </w:p>
+        </w:tc>
+      </w:tr>
+      <w:tr>
+        <w:tc>
+          <w:tcPr>
+            <w:tcW w:type="dxa" w:w="3969"/>
+          </w:tcPr>
+          <w:p>
+            <w:pPr>
+              <w:spacing w:after="0"/>
+            </w:pPr>
+            <w:r>
+              <w:t>Maintainers refuse a dependency not owned by ESPHome</w:t>
             </w:r>
           </w:p>
         </w:tc>
         <w:tc>
           <w:tcPr>
-            <w:tcW w:type="dxa" w:w="4422"/>
+            <w:tcW w:type="dxa" w:w="5102"/>
+          </w:tcPr>
+          <w:p>
+            <w:pPr>
+              <w:spacing w:after="0"/>
+            </w:pPr>
+            <w:r>
+              <w:t>Move to option 3. The library and raw biquads are kept; the ESPHome EQ layer moves to an external component.</w:t>
+            </w:r>
+          </w:p>
+        </w:tc>
+      </w:tr>
+      <w:tr>
+        <w:tc>
+          <w:tcPr>
+            <w:tcW w:type="dxa" w:w="3969"/>
+          </w:tcPr>
+          <w:p>
+            <w:pPr>
+              <w:spacing w:after="0"/>
+            </w:pPr>
+            <w:r>
+              <w:t>Maintainers ask for the library to be hosted under the esphome-libs organisation</w:t>
+            </w:r>
+          </w:p>
+        </w:tc>
+        <w:tc>
+          <w:tcPr>
+            <w:tcW w:type="dxa" w:w="5102"/>
+          </w:tcPr>
+          <w:p>
+            <w:pPr>
+              <w:spacing w:after="0"/>
+            </w:pPr>
+            <w:r>
+              <w:t>Shared ownership: releases need their review, so fixes are slower. Otherwise fine.</w:t>
+            </w:r>
+          </w:p>
+        </w:tc>
+      </w:tr>
+      <w:tr>
+        <w:tc>
+          <w:tcPr>
+            <w:tcW w:type="dxa" w:w="3969"/>
+          </w:tcPr>
+          <w:p>
+            <w:pPr>
+              <w:spacing w:after="0"/>
+            </w:pPr>
+            <w:r>
+              <w:t>Every library fix needs a release plus a core PR to bump the version</w:t>
+            </w:r>
+          </w:p>
+        </w:tc>
+        <w:tc>
+          <w:tcPr>
+            <w:tcW w:type="dxa" w:w="5102"/>
+          </w:tcPr>
+          <w:p>
+            <w:pPr>
+              <w:spacing w:after="0"/>
+            </w:pPr>
+            <w:r>
+              <w:t>Slower fixes, two reviews per change.</w:t>
+            </w:r>
+          </w:p>
+        </w:tc>
+      </w:tr>
+      <w:tr>
+        <w:tc>
+          <w:tcPr>
+            <w:tcW w:type="dxa" w:w="3969"/>
+          </w:tcPr>
+          <w:p>
+            <w:pPr>
+              <w:spacing w:after="0"/>
+            </w:pPr>
+            <w:r>
+              <w:t>The ESPHome EQ layer is still large (YAML, entities, biquad assignment)</w:t>
+            </w:r>
+          </w:p>
+        </w:tc>
+        <w:tc>
+          <w:tcPr>
+            <w:tcW w:type="dxa" w:w="5102"/>
+          </w:tcPr>
+          <w:p>
+            <w:pPr>
+              <w:spacing w:after="0"/>
+            </w:pPr>
+            <w:r>
+              <w:t>Several PRs over months, one open at a time.</w:t>
+            </w:r>
+          </w:p>
+        </w:tc>
+      </w:tr>
+      <w:tr>
+        <w:tc>
+          <w:tcPr>
+            <w:tcW w:type="dxa" w:w="3969"/>
+          </w:tcPr>
+          <w:p>
+            <w:pPr>
+              <w:spacing w:after="0"/>
+            </w:pPr>
+            <w:r>
+              <w:t>ESP32 has no double precision hardware</w:t>
+            </w:r>
+          </w:p>
+        </w:tc>
+        <w:tc>
+          <w:tcPr>
+            <w:tcW w:type="dxa" w:w="5102"/>
+          </w:tcPr>
+          <w:p>
+            <w:pPr>
+              <w:spacing w:after="0"/>
+            </w:pPr>
+            <w:r>
+              <w:t>Coefficient calculation is slower, but it only runs at boot and on slider changes: negligible.</w:t>
+            </w:r>
+          </w:p>
+        </w:tc>
+      </w:tr>
+      <w:tr>
+        <w:tc>
+          <w:tcPr>
+            <w:tcW w:type="dxa" w:w="3969"/>
+          </w:tcPr>
+          <w:p>
+            <w:pPr>
+              <w:spacing w:after="0"/>
+            </w:pPr>
+            <w:r>
+              <w:t>EQ is ESP32 only (the library is an ESP-IDF component)</w:t>
+            </w:r>
+          </w:p>
+        </w:tc>
+        <w:tc>
+          <w:tcPr>
+            <w:tcW w:type="dxa" w:w="5102"/>
+          </w:tcPr>
+          <w:p>
+            <w:pPr>
+              <w:spacing w:after="0"/>
+            </w:pPr>
+            <w:r>
+              <w:t>Fixed filters and bands give a config error on other platforms; raw biquads still work everywhere.</w:t>
+            </w:r>
+          </w:p>
+        </w:tc>
+      </w:tr>
+    </w:tbl>
+    <w:p/>
+    <w:p>
+      <w:pPr>
+        <w:pStyle w:val="Heading2"/>
+      </w:pPr>
+      <w:r>
+        <w:t>Option 3: core feature, EQ sliders in an external component (fallback)</w:t>
+      </w:r>
+    </w:p>
+    <w:p>
+      <w:pPr>
+        <w:pStyle w:val="ListBullet"/>
+        <w:spacing w:after="60"/>
+      </w:pPr>
+      <w:r>
+        <w:t xml:space="preserve">Core tas58xx: raw biquads with </w:t>
+      </w:r>
+      <w:r>
+        <w:rPr>
+          <w:rFonts w:ascii="Consolas" w:hAnsi="Consolas"/>
+          <w:sz w:val="20"/>
+        </w:rPr>
+        <w:t>set_biquad()</w:t>
+      </w:r>
+      <w:r>
+        <w:t xml:space="preserve"> and its YAML action, plus the EQ switch. This is one maths-free feature with its own users, so the public API is not a hook without an in-tree user.</w:t>
+      </w:r>
+    </w:p>
+    <w:p>
+      <w:pPr>
+        <w:pStyle w:val="ListBullet"/>
+        <w:spacing w:after="60"/>
+      </w:pPr>
+      <w:r>
+        <w:t xml:space="preserve">An ESPHome external component (added by each user under </w:t>
+      </w:r>
+      <w:r>
+        <w:rPr>
+          <w:rFonts w:ascii="Consolas" w:hAnsi="Consolas"/>
+          <w:sz w:val="20"/>
+        </w:rPr>
+        <w:t>external_components:</w:t>
+      </w:r>
+      <w:r>
+        <w:t xml:space="preserve">) provides the fixed filters, bands and sliders, using the same registry library and feeding coefficients to </w:t>
+      </w:r>
+      <w:r>
+        <w:rPr>
+          <w:rFonts w:ascii="Consolas" w:hAnsi="Consolas"/>
+          <w:sz w:val="20"/>
+        </w:rPr>
+        <w:t>set_biquad()</w:t>
+      </w:r>
+      <w:r>
+        <w:t>.</w:t>
+      </w:r>
+    </w:p>
+    <w:p>
+      <w:pPr>
+        <w:pStyle w:val="ListBullet"/>
+        <w:spacing w:after="60"/>
+      </w:pPr>
+      <w:r>
+        <w:t xml:space="preserve">No "DSP writable" notification is needed: </w:t>
+      </w:r>
+      <w:r>
+        <w:rPr>
+          <w:rFonts w:ascii="Consolas" w:hAnsi="Consolas"/>
+          <w:sz w:val="20"/>
+        </w:rPr>
+        <w:t>set_biquad()</w:t>
+      </w:r>
+      <w:r>
+        <w:t xml:space="preserve"> keeps values pending and </w:t>
+      </w:r>
+      <w:r>
+        <w:rPr>
+          <w:rFonts w:ascii="Consolas" w:hAnsi="Consolas"/>
+          <w:sz w:val="20"/>
+        </w:rPr>
+        <w:t>write_dsp_()</w:t>
+      </w:r>
+      <w:r>
+        <w:t xml:space="preserve"> writes them when the DSP is writable.</w:t>
+      </w:r>
+    </w:p>
+    <w:p>
+      <w:pPr>
+        <w:pStyle w:val="ListBullet"/>
+        <w:spacing w:after="60"/>
+      </w:pPr>
+      <w:r>
+        <w:t>Only users who add the external component get sliders. That is acceptable: it is for those really interested.</w:t>
+      </w:r>
+    </w:p>
+    <w:p>
+      <w:pPr>
+        <w:pStyle w:val="Heading2"/>
+      </w:pPr>
+      <w:r>
+        <w:t>Likely Risks: Option 3</w:t>
+      </w:r>
+    </w:p>
+    <w:tbl>
+      <w:tblPr>
+        <w:tblStyle w:val="TableGrid"/>
+        <w:tblW w:type="auto" w:w="0"/>
+        <w:jc w:val="left"/>
+        <w:tblLook w:firstColumn="1" w:firstRow="1" w:lastColumn="0" w:lastRow="0" w:noHBand="0" w:noVBand="1" w:val="04A0"/>
+      </w:tblPr>
+      <w:tblGrid>
+        <w:gridCol w:w="4536"/>
+        <w:gridCol w:w="4536"/>
+      </w:tblGrid>
+      <w:tr>
+        <w:tc>
+          <w:tcPr>
+            <w:tcW w:type="dxa" w:w="3969"/>
             <w:shd w:val="clear" w:color="auto" w:fill="D9E2F3"/>
           </w:tcPr>
           <w:p>
@@ -3700,7 +4344,24 @@
               <w:rPr>
                 <w:b/>
               </w:rPr>
-              <w:t>Assessment</w:t>
+              <w:t>Risk</w:t>
+            </w:r>
+          </w:p>
+        </w:tc>
+        <w:tc>
+          <w:tcPr>
+            <w:tcW w:type="dxa" w:w="5102"/>
+            <w:shd w:val="clear" w:color="auto" w:fill="D9E2F3"/>
+          </w:tcPr>
+          <w:p>
+            <w:pPr>
+              <w:spacing w:after="0"/>
+            </w:pPr>
+            <w:r>
+              <w:rPr>
+                <w:b/>
+              </w:rPr>
+              <w:t>Consequence</w:t>
             </w:r>
           </w:p>
         </w:tc>
@@ -3708,47 +4369,37 @@
       <w:tr>
         <w:tc>
           <w:tcPr>
-            <w:tcW w:type="dxa" w:w="1814"/>
+            <w:tcW w:type="dxa" w:w="3969"/>
           </w:tcPr>
           <w:p>
             <w:pPr>
               <w:spacing w:after="0"/>
             </w:pPr>
             <w:r>
-              <w:t>1. Espressif ESP-DSP</w:t>
+              <w:t xml:space="preserve">Raw biquads or </w:t>
+            </w:r>
+            <w:r>
+              <w:rPr>
+                <w:rFonts w:ascii="Consolas" w:hAnsi="Consolas"/>
+                <w:sz w:val="20"/>
+              </w:rPr>
+              <w:t>set_biquad()</w:t>
+            </w:r>
+            <w:r>
+              <w:t xml:space="preserve"> rejected as not needed in core</w:t>
             </w:r>
           </w:p>
         </w:tc>
         <w:tc>
           <w:tcPr>
-            <w:tcW w:type="dxa" w:w="2835"/>
+            <w:tcW w:type="dxa" w:w="5102"/>
           </w:tcPr>
           <w:p>
             <w:pPr>
               <w:spacing w:after="0"/>
             </w:pPr>
             <w:r>
-              <w:t xml:space="preserve">ESP Component Registry, </w:t>
-            </w:r>
-            <w:r>
-              <w:rPr>
-                <w:rFonts w:ascii="Consolas" w:hAnsi="Consolas"/>
-                <w:sz w:val="20"/>
-              </w:rPr>
-              <w:t>dsps_biquad_gen_*</w:t>
-            </w:r>
-          </w:p>
-        </w:tc>
-        <w:tc>
-          <w:tcPr>
-            <w:tcW w:type="dxa" w:w="4422"/>
-          </w:tcPr>
-          <w:p>
-            <w:pPr>
-              <w:spacing w:after="0"/>
-            </w:pPr>
-            <w:r>
-              <w:t>Standard cookbook formulas only; not TI PurePath Console's conventions (notch / band pass by bandwidth) or the 5.27 conversion. Saves little code. Desk check against PurePath reference coefficients to confirm.</w:t>
+              <w:t>Only the fork remains, as a full replacement of the tas58xx component (today's situation).</w:t>
             </w:r>
           </w:p>
         </w:tc>
@@ -3756,47 +4407,34 @@
       <w:tr>
         <w:tc>
           <w:tcPr>
-            <w:tcW w:type="dxa" w:w="1814"/>
+            <w:tcW w:type="dxa" w:w="3969"/>
           </w:tcPr>
           <w:p>
             <w:pPr>
               <w:spacing w:after="0"/>
             </w:pPr>
             <w:r>
-              <w:t>2. Own library</w:t>
+              <w:t xml:space="preserve">Reviewers keep raw biquads but drop the public action / </w:t>
+            </w:r>
+            <w:r>
+              <w:rPr>
+                <w:rFonts w:ascii="Consolas" w:hAnsi="Consolas"/>
+                <w:sz w:val="20"/>
+              </w:rPr>
+              <w:t>set_biquad()</w:t>
             </w:r>
           </w:p>
         </w:tc>
         <w:tc>
           <w:tcPr>
-            <w:tcW w:type="dxa" w:w="2835"/>
+            <w:tcW w:type="dxa" w:w="5102"/>
           </w:tcPr>
           <w:p>
             <w:pPr>
               <w:spacing w:after="0"/>
             </w:pPr>
             <w:r>
-              <w:t xml:space="preserve">Published on the ESP Component Registry (like esp-audio-libs), pulled in with </w:t>
-            </w:r>
-            <w:r>
-              <w:rPr>
-                <w:rFonts w:ascii="Consolas" w:hAnsi="Consolas"/>
-                <w:sz w:val="20"/>
-              </w:rPr>
-              <w:t>add_idf_component</w:t>
-            </w:r>
-          </w:p>
-        </w:tc>
-        <w:tc>
-          <w:tcPr>
-            <w:tcW w:type="dxa" w:w="4422"/>
-          </w:tcPr>
-          <w:p>
-            <w:pPr>
-              <w:spacing w:after="0"/>
-            </w:pPr>
-            <w:r>
-              <w:t>Keeps the helpers out of core, reusable by others, tested separately. Open: will maintainers accept a dependency not owned by ESPHome, and the publishing and maintenance it needs. Investigate.</w:t>
+              <w:t>The external component cannot feed coefficients and must replace the whole component, as the fork does.</w:t>
             </w:r>
           </w:p>
         </w:tc>
@@ -3804,40 +4442,27 @@
       <w:tr>
         <w:tc>
           <w:tcPr>
-            <w:tcW w:type="dxa" w:w="1814"/>
+            <w:tcW w:type="dxa" w:w="3969"/>
           </w:tcPr>
           <w:p>
             <w:pPr>
               <w:spacing w:after="0"/>
             </w:pPr>
             <w:r>
-              <w:t>3. External component</w:t>
+              <w:t>RAM for pending coefficients questioned (up to 15 x 2 x 5 values, about 600 bytes)</w:t>
             </w:r>
           </w:p>
         </w:tc>
         <w:tc>
           <w:tcPr>
-            <w:tcW w:type="dxa" w:w="2835"/>
+            <w:tcW w:type="dxa" w:w="5102"/>
           </w:tcPr>
           <w:p>
             <w:pPr>
               <w:spacing w:after="0"/>
             </w:pPr>
             <w:r>
-              <w:t>Core tas58xx exposes a DSP write API; an external component adds the EQ</w:t>
-            </w:r>
-          </w:p>
-        </w:tc>
-        <w:tc>
-          <w:tcPr>
-            <w:tcW w:type="dxa" w:w="4422"/>
-          </w:tcPr>
-          <w:p>
-            <w:pPr>
-              <w:spacing w:after="0"/>
-            </w:pPr>
-            <w:r>
-              <w:t>Technically possible, but core reviewers usually reject hooks with no in-tree user, and it gives little over the fork.</w:t>
+              <w:t>Store only the raw biquads actually used, allocated at setup.</w:t>
             </w:r>
           </w:p>
         </w:tc>
@@ -3845,40 +4470,55 @@
       <w:tr>
         <w:tc>
           <w:tcPr>
-            <w:tcW w:type="dxa" w:w="1814"/>
+            <w:tcW w:type="dxa" w:w="3969"/>
           </w:tcPr>
           <w:p>
             <w:pPr>
               <w:spacing w:after="0"/>
             </w:pPr>
             <w:r>
-              <w:t>4. All in core</w:t>
+              <w:t>Later ESPHome refactors change core tas58xx</w:t>
             </w:r>
           </w:p>
         </w:tc>
         <w:tc>
           <w:tcPr>
-            <w:tcW w:type="dxa" w:w="2835"/>
+            <w:tcW w:type="dxa" w:w="5102"/>
           </w:tcPr>
           <w:p>
             <w:pPr>
               <w:spacing w:after="0"/>
             </w:pPr>
             <w:r>
-              <w:t>Helpers in esphome/components/tas58xx</w:t>
+              <w:t>The external component must follow ESPHome dev releases to keep working.</w:t>
             </w:r>
           </w:p>
         </w:tc>
+      </w:tr>
+      <w:tr>
         <w:tc>
           <w:tcPr>
-            <w:tcW w:type="dxa" w:w="4422"/>
+            <w:tcW w:type="dxa" w:w="3969"/>
           </w:tcPr>
           <w:p>
             <w:pPr>
               <w:spacing w:after="0"/>
             </w:pPr>
             <w:r>
-              <w:t>Simplest, but likely too much code for core review now that every filter runs on the device.</w:t>
+              <w:t>Coefficient sign conventions confuse users (exports differ)</w:t>
+            </w:r>
+          </w:p>
+        </w:tc>
+        <w:tc>
+          <w:tcPr>
+            <w:tcW w:type="dxa" w:w="5102"/>
+          </w:tcPr>
+          <w:p>
+            <w:pPr>
+              <w:spacing w:after="0"/>
+            </w:pPr>
+            <w:r>
+              <w:t>Wrong or unstable filters; reduced by the stability check, a clear convention and documented exports.</w:t>
             </w:r>
           </w:p>
         </w:tc>
@@ -3886,14 +4526,86 @@
     </w:tbl>
     <w:p/>
     <w:p>
+      <w:pPr>
+        <w:pStyle w:val="Heading2"/>
+      </w:pPr>
+      <w:r>
+        <w:t>Other Options</w:t>
+      </w:r>
+    </w:p>
+    <w:p>
+      <w:pPr>
+        <w:pStyle w:val="ListBullet"/>
+        <w:spacing w:after="60"/>
+      </w:pPr>
       <w:r>
         <w:rPr>
           <w:b/>
         </w:rPr>
-        <w:t>Recommendation:</w:t>
-      </w:r>
-      <w:r>
-        <w:t xml:space="preserve"> investigate option 2 first, with the option 1 desk check alongside (ESP-DSP could be used inside the library if it matches). Option 3 is not pursued. Option 4 is the fallback.</w:t>
+        <w:t>1. Espressif ESP-DSP:</w:t>
+      </w:r>
+      <w:r>
+        <w:t xml:space="preserve"> out. Single precision float only, so it cannot match PurePath Console in 5.27 (27 fraction bits, a float has 24); no notch or band pass by bandwidth.</w:t>
+      </w:r>
+    </w:p>
+    <w:p>
+      <w:pPr>
+        <w:pStyle w:val="ListBullet"/>
+        <w:spacing w:after="60"/>
+      </w:pPr>
+      <w:r>
+        <w:rPr>
+          <w:b/>
+        </w:rPr>
+        <w:t>5. Existing external libraries:</w:t>
+      </w:r>
+      <w:r>
+        <w:t xml:space="preserve"> out. </w:t>
+      </w:r>
+      <w:r>
+        <w:rPr>
+          <w:rFonts w:ascii="Consolas" w:hAnsi="Consolas"/>
+          <w:sz w:val="20"/>
+        </w:rPr>
+        <w:t>esp_audio_effects</w:t>
+      </w:r>
+      <w:r>
+        <w:t xml:space="preserve"> EQ is a closed binary that processes the audio itself; </w:t>
+      </w:r>
+      <w:r>
+        <w:rPr>
+          <w:rFonts w:ascii="Consolas" w:hAnsi="Consolas"/>
+          <w:sz w:val="20"/>
+        </w:rPr>
+        <w:t>iir1</w:t>
+      </w:r>
+      <w:r>
+        <w:t xml:space="preserve"> is a full processing library, not an IDF component, without PurePath Console's conventions; </w:t>
+      </w:r>
+      <w:r>
+        <w:rPr>
+          <w:rFonts w:ascii="Consolas" w:hAnsi="Consolas"/>
+          <w:sz w:val="20"/>
+        </w:rPr>
+        <w:t>esp-audio-libs</w:t>
+      </w:r>
+      <w:r>
+        <w:t xml:space="preserve"> was reduced to its resampler.</w:t>
+      </w:r>
+    </w:p>
+    <w:p>
+      <w:pPr>
+        <w:pStyle w:val="ListBullet"/>
+        <w:spacing w:after="60"/>
+      </w:pPr>
+      <w:r>
+        <w:rPr>
+          <w:b/>
+        </w:rPr>
+        <w:t>4. All maths in core:</w:t>
+      </w:r>
+      <w:r>
+        <w:t xml:space="preserve"> only as a last resort. It is likely too much code for core review, and acceptance cannot be known before a PR.</w:t>
       </w:r>
     </w:p>
     <w:p>
@@ -4017,6 +4729,43 @@
       </w:r>
       <w:r>
         <w:t>), to copy filters from TI PurePath Console.</w:t>
+      </w:r>
+    </w:p>
+    <w:p>
+      <w:pPr>
+        <w:pStyle w:val="ListBullet"/>
+        <w:spacing w:after="60"/>
+      </w:pPr>
+      <w:r>
+        <w:t>Raw biquads: confirm the coefficient order and sign convention of PurePath Console and REW exports, and whether to accept their export format directly.</w:t>
+      </w:r>
+    </w:p>
+    <w:p>
+      <w:pPr>
+        <w:pStyle w:val="ListBullet"/>
+        <w:spacing w:after="60"/>
+      </w:pPr>
+      <w:r>
+        <w:t xml:space="preserve">Raw biquads: the name and options of the YAML action for </w:t>
+      </w:r>
+      <w:r>
+        <w:rPr>
+          <w:rFonts w:ascii="Consolas" w:hAnsi="Consolas"/>
+          <w:sz w:val="20"/>
+        </w:rPr>
+        <w:t>set_biquad()</w:t>
+      </w:r>
+      <w:r>
+        <w:t>.</w:t>
+      </w:r>
+    </w:p>
+    <w:p>
+      <w:pPr>
+        <w:pStyle w:val="ListBullet"/>
+        <w:spacing w:after="60"/>
+      </w:pPr>
+      <w:r>
+        <w:t>The library's name.</w:t>
       </w:r>
     </w:p>
     <w:sectPr>

</xml_diff>

<commit_message>
tas58xx docs: EQ proposal v2 - raw biquad YAML examples
Co-Authored-By: Claude Opus 5.5 <noreply@anthropic.com>
</commit_message>
<xml_diff>
--- a/esphome/components/tas58xx/docs/TAS58xx_EQ_Control_Proposal_v2.docx
+++ b/esphome/components/tas58xx/docs/TAS58xx_EQ_Control_Proposal_v2.docx
@@ -1,4782 +1,3 @@
-
-<file path=word/document.xml><?xml version="1.0" encoding="utf-8"?>
-<w:document xmlns:wpc="http://schemas.microsoft.com/office/word/2010/wordprocessingCanvas" xmlns:mo="http://schemas.microsoft.com/office/mac/office/2008/main" xmlns:mc="http://schemas.openxmlformats.org/markup-compatibility/2006" xmlns:mv="urn:schemas-microsoft-com:mac:vml" xmlns:o="urn:schemas-microsoft-com:office:office" xmlns:r="http://schemas.openxmlformats.org/officeDocument/2006/relationships" xmlns:m="http://schemas.openxmlformats.org/officeDocument/2006/math" xmlns:v="urn:schemas-microsoft-com:vml" xmlns:wp14="http://schemas.microsoft.com/office/word/2010/wordprocessingDrawing" xmlns:wp="http://schemas.openxmlformats.org/drawingml/2006/wordprocessingDrawing" xmlns:w10="urn:schemas-microsoft-com:office:word" xmlns:w="http://schemas.openxmlformats.org/wordprocessingml/2006/main" xmlns:w14="http://schemas.microsoft.com/office/word/2010/wordml" xmlns:wpg="http://schemas.microsoft.com/office/word/2010/wordprocessingGroup" xmlns:wpi="http://schemas.microsoft.com/office/word/2010/wordprocessingInk" xmlns:wne="http://schemas.microsoft.com/office/word/2006/wordml" xmlns:wps="http://schemas.microsoft.com/office/word/2010/wordprocessingShape" mc:Ignorable="w14 wp14">
-  <w:body>
-    <w:p>
-      <w:pPr>
-        <w:pStyle w:val="Title"/>
-      </w:pPr>
-      <w:r>
-        <w:t>TAS58xx EQ Control Proposal v2</w:t>
-      </w:r>
-    </w:p>
-    <w:p>
-      <w:r>
-        <w:t>Simpler EQ control for the tas58xx component. Proposal by @mrtoy-me for review and comment. Replaces v1.</w:t>
-      </w:r>
-    </w:p>
-    <w:p>
-      <w:pPr>
-        <w:pStyle w:val="Heading1"/>
-      </w:pPr>
-      <w:r>
-        <w:t>Summary</w:t>
-      </w:r>
-    </w:p>
-    <w:p>
-      <w:pPr>
-        <w:pStyle w:val="ListBullet"/>
-        <w:spacing w:after="60"/>
-      </w:pPr>
-      <w:r>
-        <w:rPr>
-          <w:rFonts w:ascii="Consolas" w:hAnsi="Consolas"/>
-          <w:sz w:val="20"/>
-        </w:rPr>
-        <w:t>eq_mode</w:t>
-      </w:r>
-      <w:r>
-        <w:t xml:space="preserve"> becomes a </w:t>
-      </w:r>
-      <w:r>
-        <w:rPr>
-          <w:b/>
-        </w:rPr>
-        <w:t>switch</w:t>
-      </w:r>
-      <w:r>
-        <w:t xml:space="preserve"> (On / Off). On at first boot, then the last setting is restored.</w:t>
-      </w:r>
-    </w:p>
-    <w:p>
-      <w:pPr>
-        <w:pStyle w:val="ListBullet"/>
-        <w:spacing w:after="60"/>
-      </w:pPr>
-      <w:r>
-        <w:t xml:space="preserve">One </w:t>
-      </w:r>
-      <w:r>
-        <w:rPr>
-          <w:rFonts w:ascii="Consolas" w:hAnsi="Consolas"/>
-          <w:sz w:val="20"/>
-        </w:rPr>
-        <w:t>fixed_filters</w:t>
-      </w:r>
-      <w:r>
-        <w:t xml:space="preserve"> list on the audio_dac (no slider). Any filter type can be used.</w:t>
-      </w:r>
-    </w:p>
-    <w:p>
-      <w:pPr>
-        <w:pStyle w:val="ListBullet"/>
-        <w:spacing w:after="60"/>
-      </w:pPr>
-      <w:r>
-        <w:t xml:space="preserve">Two slider lists on the number platform: </w:t>
-      </w:r>
-      <w:r>
-        <w:rPr>
-          <w:rFonts w:ascii="Consolas" w:hAnsi="Consolas"/>
-          <w:sz w:val="20"/>
-        </w:rPr>
-        <w:t>gain_bands</w:t>
-      </w:r>
-      <w:r>
-        <w:t xml:space="preserve"> (the slider sets the gain) and </w:t>
-      </w:r>
-      <w:r>
-        <w:rPr>
-          <w:rFonts w:ascii="Consolas" w:hAnsi="Consolas"/>
-          <w:sz w:val="20"/>
-        </w:rPr>
-        <w:t>frequency_bands</w:t>
-      </w:r>
-      <w:r>
-        <w:t xml:space="preserve"> (the slider sets the frequency).</w:t>
-      </w:r>
-    </w:p>
-    <w:p>
-      <w:pPr>
-        <w:pStyle w:val="ListBullet"/>
-        <w:spacing w:after="60"/>
-      </w:pPr>
-      <w:r>
-        <w:t xml:space="preserve">A </w:t>
-      </w:r>
-      <w:r>
-        <w:rPr>
-          <w:rFonts w:ascii="Consolas" w:hAnsi="Consolas"/>
-          <w:sz w:val="20"/>
-        </w:rPr>
-        <w:t>biquads</w:t>
-      </w:r>
-      <w:r>
-        <w:t xml:space="preserve"> list on the audio_dac for raw coefficients, for example exported from TI PurePath Console or REW. Needs no filter maths.</w:t>
-      </w:r>
-    </w:p>
-    <w:p>
-      <w:pPr>
-        <w:pStyle w:val="ListBullet"/>
-        <w:spacing w:after="60"/>
-      </w:pPr>
-      <w:r>
-        <w:t xml:space="preserve">Every entry has a </w:t>
-      </w:r>
-      <w:r>
-        <w:rPr>
-          <w:rFonts w:ascii="Consolas" w:hAnsi="Consolas"/>
-          <w:sz w:val="20"/>
-        </w:rPr>
-        <w:t>channel</w:t>
-      </w:r>
-      <w:r>
-        <w:t xml:space="preserve"> (left, right or both) and an </w:t>
-      </w:r>
-      <w:r>
-        <w:rPr>
-          <w:rFonts w:ascii="Consolas" w:hAnsi="Consolas"/>
-          <w:sz w:val="20"/>
-        </w:rPr>
-        <w:t>always_on</w:t>
-      </w:r>
-      <w:r>
-        <w:t xml:space="preserve"> option.</w:t>
-      </w:r>
-    </w:p>
-    <w:p>
-      <w:pPr>
-        <w:pStyle w:val="ListBullet"/>
-        <w:spacing w:after="60"/>
-      </w:pPr>
-      <w:r>
-        <w:t xml:space="preserve">Raw biquads, fixed filters and bands can all be combined on a channel, up to </w:t>
-      </w:r>
-      <w:r>
-        <w:rPr>
-          <w:b/>
-        </w:rPr>
-        <w:t>15 biquads per channel</w:t>
-      </w:r>
-      <w:r>
-        <w:t>.</w:t>
-      </w:r>
-    </w:p>
-    <w:p>
-      <w:pPr>
-        <w:pStyle w:val="Heading2"/>
-      </w:pPr>
-      <w:r>
-        <w:t>Changes from v1</w:t>
-      </w:r>
-    </w:p>
-    <w:p>
-      <w:pPr>
-        <w:pStyle w:val="ListBullet"/>
-        <w:spacing w:after="60"/>
-      </w:pPr>
-      <w:r>
-        <w:t>EQ presets are removed.</w:t>
-      </w:r>
-    </w:p>
-    <w:p>
-      <w:pPr>
-        <w:pStyle w:val="ListBullet"/>
-        <w:spacing w:after="60"/>
-      </w:pPr>
-      <w:r>
-        <w:rPr>
-          <w:rFonts w:ascii="Consolas" w:hAnsi="Consolas"/>
-          <w:sz w:val="20"/>
-        </w:rPr>
-        <w:t>left_fixed_filters</w:t>
-      </w:r>
-      <w:r>
-        <w:t xml:space="preserve"> and </w:t>
-      </w:r>
-      <w:r>
-        <w:rPr>
-          <w:rFonts w:ascii="Consolas" w:hAnsi="Consolas"/>
-          <w:sz w:val="20"/>
-        </w:rPr>
-        <w:t>right_fixed_filters</w:t>
-      </w:r>
-      <w:r>
-        <w:t xml:space="preserve"> become one </w:t>
-      </w:r>
-      <w:r>
-        <w:rPr>
-          <w:rFonts w:ascii="Consolas" w:hAnsi="Consolas"/>
-          <w:sz w:val="20"/>
-        </w:rPr>
-        <w:t>fixed_filters</w:t>
-      </w:r>
-      <w:r>
-        <w:t xml:space="preserve"> list with a </w:t>
-      </w:r>
-      <w:r>
-        <w:rPr>
-          <w:rFonts w:ascii="Consolas" w:hAnsi="Consolas"/>
-          <w:sz w:val="20"/>
-        </w:rPr>
-        <w:t>channel</w:t>
-      </w:r>
-      <w:r>
-        <w:t xml:space="preserve"> option. Fixed filters can now be any filter type, not only notch and band pass.</w:t>
-      </w:r>
-    </w:p>
-    <w:p>
-      <w:pPr>
-        <w:pStyle w:val="ListBullet"/>
-        <w:spacing w:after="60"/>
-      </w:pPr>
-      <w:r>
-        <w:rPr>
-          <w:rFonts w:ascii="Consolas" w:hAnsi="Consolas"/>
-          <w:sz w:val="20"/>
-        </w:rPr>
-        <w:t>stereo_bands</w:t>
-      </w:r>
-      <w:r>
-        <w:t xml:space="preserve">, </w:t>
-      </w:r>
-      <w:r>
-        <w:rPr>
-          <w:rFonts w:ascii="Consolas" w:hAnsi="Consolas"/>
-          <w:sz w:val="20"/>
-        </w:rPr>
-        <w:t>left_bands</w:t>
-      </w:r>
-      <w:r>
-        <w:t xml:space="preserve"> and </w:t>
-      </w:r>
-      <w:r>
-        <w:rPr>
-          <w:rFonts w:ascii="Consolas" w:hAnsi="Consolas"/>
-          <w:sz w:val="20"/>
-        </w:rPr>
-        <w:t>right_bands</w:t>
-      </w:r>
-      <w:r>
-        <w:t xml:space="preserve"> become </w:t>
-      </w:r>
-      <w:r>
-        <w:rPr>
-          <w:rFonts w:ascii="Consolas" w:hAnsi="Consolas"/>
-          <w:sz w:val="20"/>
-        </w:rPr>
-        <w:t>gain_bands</w:t>
-      </w:r>
-      <w:r>
-        <w:t xml:space="preserve"> with a </w:t>
-      </w:r>
-      <w:r>
-        <w:rPr>
-          <w:rFonts w:ascii="Consolas" w:hAnsi="Consolas"/>
-          <w:sz w:val="20"/>
-        </w:rPr>
-        <w:t>channel</w:t>
-      </w:r>
-      <w:r>
-        <w:t xml:space="preserve"> option.</w:t>
-      </w:r>
-    </w:p>
-    <w:p>
-      <w:pPr>
-        <w:pStyle w:val="ListBullet"/>
-        <w:spacing w:after="60"/>
-      </w:pPr>
-      <w:r>
-        <w:t xml:space="preserve">New: </w:t>
-      </w:r>
-      <w:r>
-        <w:rPr>
-          <w:rFonts w:ascii="Consolas" w:hAnsi="Consolas"/>
-          <w:sz w:val="20"/>
-        </w:rPr>
-        <w:t>frequency_bands</w:t>
-      </w:r>
-      <w:r>
-        <w:t>, a slider that sets the frequency of a filter.</w:t>
-      </w:r>
-    </w:p>
-    <w:p>
-      <w:pPr>
-        <w:pStyle w:val="ListBullet"/>
-        <w:spacing w:after="60"/>
-      </w:pPr>
-      <w:r>
-        <w:t xml:space="preserve">New: </w:t>
-      </w:r>
-      <w:r>
-        <w:rPr>
-          <w:rFonts w:ascii="Consolas" w:hAnsi="Consolas"/>
-          <w:sz w:val="20"/>
-        </w:rPr>
-        <w:t>biquads</w:t>
-      </w:r>
-      <w:r>
-        <w:t>, raw coefficients entered in the YAML.</w:t>
-      </w:r>
-    </w:p>
-    <w:p>
-      <w:pPr>
-        <w:pStyle w:val="ListBullet"/>
-        <w:spacing w:after="60"/>
-      </w:pPr>
-      <w:r>
-        <w:rPr>
-          <w:rFonts w:ascii="Consolas" w:hAnsi="Consolas"/>
-          <w:sz w:val="20"/>
-        </w:rPr>
-        <w:t>fixed_filters_always_on</w:t>
-      </w:r>
-      <w:r>
-        <w:t xml:space="preserve"> is replaced by an </w:t>
-      </w:r>
-      <w:r>
-        <w:rPr>
-          <w:rFonts w:ascii="Consolas" w:hAnsi="Consolas"/>
-          <w:sz w:val="20"/>
-        </w:rPr>
-        <w:t>always_on</w:t>
-      </w:r>
-      <w:r>
-        <w:t xml:space="preserve"> option on each entry.</w:t>
-      </w:r>
-    </w:p>
-    <w:p>
-      <w:pPr>
-        <w:pStyle w:val="ListBullet"/>
-        <w:spacing w:after="60"/>
-      </w:pPr>
-      <w:r>
-        <w:t xml:space="preserve">PBTL: </w:t>
-      </w:r>
-      <w:r>
-        <w:rPr>
-          <w:rFonts w:ascii="Consolas" w:hAnsi="Consolas"/>
-          <w:sz w:val="20"/>
-        </w:rPr>
-        <w:t>channel: right</w:t>
-      </w:r>
-      <w:r>
-        <w:t xml:space="preserve"> is a config error (v1 gave a warning).</w:t>
-      </w:r>
-    </w:p>
-    <w:p>
-      <w:pPr>
-        <w:pStyle w:val="Heading1"/>
-      </w:pPr>
-      <w:r>
-        <w:t>YAML</w:t>
-      </w:r>
-    </w:p>
-    <w:p>
-      <w:pPr>
-        <w:spacing w:before="0" w:after="0" w:line="240" w:lineRule="auto"/>
-        <w:ind w:left="113"/>
-        <w:shd w:val="clear" w:color="auto" w:fill="F2F2F2"/>
-      </w:pPr>
-      <w:r>
-        <w:rPr>
-          <w:rFonts w:ascii="Consolas" w:hAnsi="Consolas"/>
-          <w:sz w:val="18"/>
-        </w:rPr>
-        <w:t>audio_dac:</w:t>
-      </w:r>
-    </w:p>
-    <w:p>
-      <w:pPr>
-        <w:spacing w:before="0" w:after="0" w:line="240" w:lineRule="auto"/>
-        <w:ind w:left="113"/>
-        <w:shd w:val="clear" w:color="auto" w:fill="F2F2F2"/>
-      </w:pPr>
-      <w:r>
-        <w:rPr>
-          <w:rFonts w:ascii="Consolas" w:hAnsi="Consolas"/>
-          <w:sz w:val="18"/>
-        </w:rPr>
-        <w:t xml:space="preserve">  - platform: tas58xx</w:t>
-      </w:r>
-    </w:p>
-    <w:p>
-      <w:pPr>
-        <w:spacing w:before="0" w:after="0" w:line="240" w:lineRule="auto"/>
-        <w:ind w:left="113"/>
-        <w:shd w:val="clear" w:color="auto" w:fill="F2F2F2"/>
-      </w:pPr>
-      <w:r>
-        <w:rPr>
-          <w:rFonts w:ascii="Consolas" w:hAnsi="Consolas"/>
-          <w:sz w:val="18"/>
-        </w:rPr>
-        <w:t xml:space="preserve">    id: dac1</w:t>
-      </w:r>
-    </w:p>
-    <w:p>
-      <w:pPr>
-        <w:spacing w:before="0" w:after="0" w:line="240" w:lineRule="auto"/>
-        <w:ind w:left="113"/>
-        <w:shd w:val="clear" w:color="auto" w:fill="F2F2F2"/>
-      </w:pPr>
-      <w:r>
-        <w:rPr>
-          <w:rFonts w:ascii="Consolas" w:hAnsi="Consolas"/>
-          <w:sz w:val="18"/>
-        </w:rPr>
-        <w:t xml:space="preserve">    fixed_filters:              # optional, no slider; any filter type</w:t>
-      </w:r>
-    </w:p>
-    <w:p>
-      <w:pPr>
-        <w:spacing w:before="0" w:after="0" w:line="240" w:lineRule="auto"/>
-        <w:ind w:left="113"/>
-        <w:shd w:val="clear" w:color="auto" w:fill="F2F2F2"/>
-      </w:pPr>
-      <w:r>
-        <w:rPr>
-          <w:rFonts w:ascii="Consolas" w:hAnsi="Consolas"/>
-          <w:sz w:val="18"/>
-        </w:rPr>
-        <w:t xml:space="preserve">      - eq_filter: notch</w:t>
-      </w:r>
-    </w:p>
-    <w:p>
-      <w:pPr>
-        <w:spacing w:before="0" w:after="0" w:line="240" w:lineRule="auto"/>
-        <w:ind w:left="113"/>
-        <w:shd w:val="clear" w:color="auto" w:fill="F2F2F2"/>
-      </w:pPr>
-      <w:r>
-        <w:rPr>
-          <w:rFonts w:ascii="Consolas" w:hAnsi="Consolas"/>
-          <w:sz w:val="18"/>
-        </w:rPr>
-        <w:t xml:space="preserve">        frequency: 50Hz</w:t>
-      </w:r>
-    </w:p>
-    <w:p>
-      <w:pPr>
-        <w:spacing w:before="0" w:after="0" w:line="240" w:lineRule="auto"/>
-        <w:ind w:left="113"/>
-        <w:shd w:val="clear" w:color="auto" w:fill="F2F2F2"/>
-      </w:pPr>
-      <w:r>
-        <w:rPr>
-          <w:rFonts w:ascii="Consolas" w:hAnsi="Consolas"/>
-          <w:sz w:val="18"/>
-        </w:rPr>
-        <w:t xml:space="preserve">        q_factor: 10.0</w:t>
-      </w:r>
-    </w:p>
-    <w:p>
-      <w:pPr>
-        <w:spacing w:before="0" w:after="0" w:line="240" w:lineRule="auto"/>
-        <w:ind w:left="113"/>
-        <w:shd w:val="clear" w:color="auto" w:fill="F2F2F2"/>
-      </w:pPr>
-      <w:r>
-        <w:rPr>
-          <w:rFonts w:ascii="Consolas" w:hAnsi="Consolas"/>
-          <w:sz w:val="18"/>
-        </w:rPr>
-        <w:t xml:space="preserve">        channel: both           # left | right | both, default both</w:t>
-      </w:r>
-    </w:p>
-    <w:p>
-      <w:pPr>
-        <w:spacing w:before="0" w:after="0" w:line="240" w:lineRule="auto"/>
-        <w:ind w:left="113"/>
-        <w:shd w:val="clear" w:color="auto" w:fill="F2F2F2"/>
-      </w:pPr>
-      <w:r>
-        <w:rPr>
-          <w:rFonts w:ascii="Consolas" w:hAnsi="Consolas"/>
-          <w:sz w:val="18"/>
-        </w:rPr>
-        <w:t xml:space="preserve">        always_on: true         # default true for fixed filters</w:t>
-      </w:r>
-    </w:p>
-    <w:p>
-      <w:pPr>
-        <w:spacing w:before="0" w:after="0" w:line="240" w:lineRule="auto"/>
-        <w:ind w:left="113"/>
-        <w:shd w:val="clear" w:color="auto" w:fill="F2F2F2"/>
-      </w:pPr>
-      <w:r>
-        <w:rPr>
-          <w:rFonts w:ascii="Consolas" w:hAnsi="Consolas"/>
-          <w:sz w:val="18"/>
-        </w:rPr>
-        <w:t xml:space="preserve">      - eq_filter: peaking</w:t>
-      </w:r>
-    </w:p>
-    <w:p>
-      <w:pPr>
-        <w:spacing w:before="0" w:after="0" w:line="240" w:lineRule="auto"/>
-        <w:ind w:left="113"/>
-        <w:shd w:val="clear" w:color="auto" w:fill="F2F2F2"/>
-      </w:pPr>
-      <w:r>
-        <w:rPr>
-          <w:rFonts w:ascii="Consolas" w:hAnsi="Consolas"/>
-          <w:sz w:val="18"/>
-        </w:rPr>
-        <w:t xml:space="preserve">        frequency: 120Hz</w:t>
-      </w:r>
-    </w:p>
-    <w:p>
-      <w:pPr>
-        <w:spacing w:before="0" w:after="0" w:line="240" w:lineRule="auto"/>
-        <w:ind w:left="113"/>
-        <w:shd w:val="clear" w:color="auto" w:fill="F2F2F2"/>
-      </w:pPr>
-      <w:r>
-        <w:rPr>
-          <w:rFonts w:ascii="Consolas" w:hAnsi="Consolas"/>
-          <w:sz w:val="18"/>
-        </w:rPr>
-        <w:t xml:space="preserve">        q_factor: 1.0</w:t>
-      </w:r>
-    </w:p>
-    <w:p>
-      <w:pPr>
-        <w:spacing w:before="0" w:after="0" w:line="240" w:lineRule="auto"/>
-        <w:ind w:left="113"/>
-        <w:shd w:val="clear" w:color="auto" w:fill="F2F2F2"/>
-      </w:pPr>
-      <w:r>
-        <w:rPr>
-          <w:rFonts w:ascii="Consolas" w:hAnsi="Consolas"/>
-          <w:sz w:val="18"/>
-        </w:rPr>
-        <w:t xml:space="preserve">        gain: -4dB              # only for filters with a gain input</w:t>
-      </w:r>
-    </w:p>
-    <w:p>
-      <w:pPr>
-        <w:spacing w:before="0" w:after="0" w:line="240" w:lineRule="auto"/>
-        <w:ind w:left="113"/>
-        <w:shd w:val="clear" w:color="auto" w:fill="F2F2F2"/>
-      </w:pPr>
-      <w:r>
-        <w:rPr>
-          <w:rFonts w:ascii="Consolas" w:hAnsi="Consolas"/>
-          <w:sz w:val="18"/>
-        </w:rPr>
-        <w:t xml:space="preserve">        channel: left</w:t>
-      </w:r>
-    </w:p>
-    <w:p>
-      <w:pPr>
-        <w:spacing w:before="0" w:after="0" w:line="240" w:lineRule="auto"/>
-        <w:ind w:left="113"/>
-        <w:shd w:val="clear" w:color="auto" w:fill="F2F2F2"/>
-      </w:pPr>
-      <w:r>
-        <w:rPr>
-          <w:rFonts w:ascii="Consolas" w:hAnsi="Consolas"/>
-          <w:sz w:val="18"/>
-        </w:rPr>
-        <w:t xml:space="preserve">        always_on: false</w:t>
-      </w:r>
-    </w:p>
-    <w:p>
-      <w:pPr>
-        <w:spacing w:before="0" w:after="0" w:line="240" w:lineRule="auto"/>
-        <w:ind w:left="113"/>
-        <w:shd w:val="clear" w:color="auto" w:fill="F2F2F2"/>
-      </w:pPr>
-      <w:r>
-        <w:rPr>
-          <w:rFonts w:ascii="Consolas" w:hAnsi="Consolas"/>
-          <w:sz w:val="18"/>
-        </w:rPr>
-        <w:t xml:space="preserve"> </w:t>
-      </w:r>
-    </w:p>
-    <w:p>
-      <w:pPr>
-        <w:spacing w:before="0" w:after="0" w:line="240" w:lineRule="auto"/>
-        <w:ind w:left="113"/>
-        <w:shd w:val="clear" w:color="auto" w:fill="F2F2F2"/>
-      </w:pPr>
-      <w:r>
-        <w:rPr>
-          <w:rFonts w:ascii="Consolas" w:hAnsi="Consolas"/>
-          <w:sz w:val="18"/>
-        </w:rPr>
-        <w:t>switch:</w:t>
-      </w:r>
-    </w:p>
-    <w:p>
-      <w:pPr>
-        <w:spacing w:before="0" w:after="0" w:line="240" w:lineRule="auto"/>
-        <w:ind w:left="113"/>
-        <w:shd w:val="clear" w:color="auto" w:fill="F2F2F2"/>
-      </w:pPr>
-      <w:r>
-        <w:rPr>
-          <w:rFonts w:ascii="Consolas" w:hAnsi="Consolas"/>
-          <w:sz w:val="18"/>
-        </w:rPr>
-        <w:t xml:space="preserve">  - platform: tas58xx</w:t>
-      </w:r>
-    </w:p>
-    <w:p>
-      <w:pPr>
-        <w:spacing w:before="0" w:after="0" w:line="240" w:lineRule="auto"/>
-        <w:ind w:left="113"/>
-        <w:shd w:val="clear" w:color="auto" w:fill="F2F2F2"/>
-      </w:pPr>
-      <w:r>
-        <w:rPr>
-          <w:rFonts w:ascii="Consolas" w:hAnsi="Consolas"/>
-          <w:sz w:val="18"/>
-        </w:rPr>
-        <w:t xml:space="preserve">    eq_mode:</w:t>
-      </w:r>
-    </w:p>
-    <w:p>
-      <w:pPr>
-        <w:spacing w:before="0" w:after="0" w:line="240" w:lineRule="auto"/>
-        <w:ind w:left="113"/>
-        <w:shd w:val="clear" w:color="auto" w:fill="F2F2F2"/>
-      </w:pPr>
-      <w:r>
-        <w:rPr>
-          <w:rFonts w:ascii="Consolas" w:hAnsi="Consolas"/>
-          <w:sz w:val="18"/>
-        </w:rPr>
-        <w:t xml:space="preserve">      name: EQ</w:t>
-      </w:r>
-    </w:p>
-    <w:p>
-      <w:pPr>
-        <w:spacing w:before="0" w:after="0" w:line="240" w:lineRule="auto"/>
-        <w:ind w:left="113"/>
-        <w:shd w:val="clear" w:color="auto" w:fill="F2F2F2"/>
-      </w:pPr>
-      <w:r>
-        <w:rPr>
-          <w:rFonts w:ascii="Consolas" w:hAnsi="Consolas"/>
-          <w:sz w:val="18"/>
-        </w:rPr>
-        <w:t xml:space="preserve">      restore_mode: RESTORE_DEFAULT_ON  # default</w:t>
-      </w:r>
-    </w:p>
-    <w:p>
-      <w:pPr>
-        <w:spacing w:before="0" w:after="0" w:line="240" w:lineRule="auto"/>
-        <w:ind w:left="113"/>
-        <w:shd w:val="clear" w:color="auto" w:fill="F2F2F2"/>
-      </w:pPr>
-      <w:r>
-        <w:rPr>
-          <w:rFonts w:ascii="Consolas" w:hAnsi="Consolas"/>
-          <w:sz w:val="18"/>
-        </w:rPr>
-        <w:t xml:space="preserve"> </w:t>
-      </w:r>
-    </w:p>
-    <w:p>
-      <w:pPr>
-        <w:spacing w:before="0" w:after="0" w:line="240" w:lineRule="auto"/>
-        <w:ind w:left="113"/>
-        <w:shd w:val="clear" w:color="auto" w:fill="F2F2F2"/>
-      </w:pPr>
-      <w:r>
-        <w:rPr>
-          <w:rFonts w:ascii="Consolas" w:hAnsi="Consolas"/>
-          <w:sz w:val="18"/>
-        </w:rPr>
-        <w:t>number:</w:t>
-      </w:r>
-    </w:p>
-    <w:p>
-      <w:pPr>
-        <w:spacing w:before="0" w:after="0" w:line="240" w:lineRule="auto"/>
-        <w:ind w:left="113"/>
-        <w:shd w:val="clear" w:color="auto" w:fill="F2F2F2"/>
-      </w:pPr>
-      <w:r>
-        <w:rPr>
-          <w:rFonts w:ascii="Consolas" w:hAnsi="Consolas"/>
-          <w:sz w:val="18"/>
-        </w:rPr>
-        <w:t xml:space="preserve">  - platform: tas58xx</w:t>
-      </w:r>
-    </w:p>
-    <w:p>
-      <w:pPr>
-        <w:spacing w:before="0" w:after="0" w:line="240" w:lineRule="auto"/>
-        <w:ind w:left="113"/>
-        <w:shd w:val="clear" w:color="auto" w:fill="F2F2F2"/>
-      </w:pPr>
-      <w:r>
-        <w:rPr>
-          <w:rFonts w:ascii="Consolas" w:hAnsi="Consolas"/>
-          <w:sz w:val="18"/>
-        </w:rPr>
-        <w:t xml:space="preserve">    tas58xx_id: dac1</w:t>
-      </w:r>
-    </w:p>
-    <w:p>
-      <w:pPr>
-        <w:spacing w:before="0" w:after="0" w:line="240" w:lineRule="auto"/>
-        <w:ind w:left="113"/>
-        <w:shd w:val="clear" w:color="auto" w:fill="F2F2F2"/>
-      </w:pPr>
-      <w:r>
-        <w:rPr>
-          <w:rFonts w:ascii="Consolas" w:hAnsi="Consolas"/>
-          <w:sz w:val="18"/>
-        </w:rPr>
-        <w:t xml:space="preserve">    gain_bands:                 # slider = gain; filters with a gain input only</w:t>
-      </w:r>
-    </w:p>
-    <w:p>
-      <w:pPr>
-        <w:spacing w:before="0" w:after="0" w:line="240" w:lineRule="auto"/>
-        <w:ind w:left="113"/>
-        <w:shd w:val="clear" w:color="auto" w:fill="F2F2F2"/>
-      </w:pPr>
-      <w:r>
-        <w:rPr>
-          <w:rFonts w:ascii="Consolas" w:hAnsi="Consolas"/>
-          <w:sz w:val="18"/>
-        </w:rPr>
-        <w:t xml:space="preserve">      - name: Bass</w:t>
-      </w:r>
-    </w:p>
-    <w:p>
-      <w:pPr>
-        <w:spacing w:before="0" w:after="0" w:line="240" w:lineRule="auto"/>
-        <w:ind w:left="113"/>
-        <w:shd w:val="clear" w:color="auto" w:fill="F2F2F2"/>
-      </w:pPr>
-      <w:r>
-        <w:rPr>
-          <w:rFonts w:ascii="Consolas" w:hAnsi="Consolas"/>
-          <w:sz w:val="18"/>
-        </w:rPr>
-        <w:t xml:space="preserve">        eq_filter: low_shelf</w:t>
-      </w:r>
-    </w:p>
-    <w:p>
-      <w:pPr>
-        <w:spacing w:before="0" w:after="0" w:line="240" w:lineRule="auto"/>
-        <w:ind w:left="113"/>
-        <w:shd w:val="clear" w:color="auto" w:fill="F2F2F2"/>
-      </w:pPr>
-      <w:r>
-        <w:rPr>
-          <w:rFonts w:ascii="Consolas" w:hAnsi="Consolas"/>
-          <w:sz w:val="18"/>
-        </w:rPr>
-        <w:t xml:space="preserve">        frequency: 100Hz</w:t>
-      </w:r>
-    </w:p>
-    <w:p>
-      <w:pPr>
-        <w:spacing w:before="0" w:after="0" w:line="240" w:lineRule="auto"/>
-        <w:ind w:left="113"/>
-        <w:shd w:val="clear" w:color="auto" w:fill="F2F2F2"/>
-      </w:pPr>
-      <w:r>
-        <w:rPr>
-          <w:rFonts w:ascii="Consolas" w:hAnsi="Consolas"/>
-          <w:sz w:val="18"/>
-        </w:rPr>
-        <w:t xml:space="preserve">        q_factor: 0.707</w:t>
-      </w:r>
-    </w:p>
-    <w:p>
-      <w:pPr>
-        <w:spacing w:before="0" w:after="0" w:line="240" w:lineRule="auto"/>
-        <w:ind w:left="113"/>
-        <w:shd w:val="clear" w:color="auto" w:fill="F2F2F2"/>
-      </w:pPr>
-      <w:r>
-        <w:rPr>
-          <w:rFonts w:ascii="Consolas" w:hAnsi="Consolas"/>
-          <w:sz w:val="18"/>
-        </w:rPr>
-        <w:t xml:space="preserve">        channel: both</w:t>
-      </w:r>
-    </w:p>
-    <w:p>
-      <w:pPr>
-        <w:spacing w:before="0" w:after="0" w:line="240" w:lineRule="auto"/>
-        <w:ind w:left="113"/>
-        <w:shd w:val="clear" w:color="auto" w:fill="F2F2F2"/>
-      </w:pPr>
-      <w:r>
-        <w:rPr>
-          <w:rFonts w:ascii="Consolas" w:hAnsi="Consolas"/>
-          <w:sz w:val="18"/>
-        </w:rPr>
-        <w:t xml:space="preserve">        always_on: false        # default false for bands</w:t>
-      </w:r>
-    </w:p>
-    <w:p>
-      <w:pPr>
-        <w:spacing w:before="0" w:after="0" w:line="240" w:lineRule="auto"/>
-        <w:ind w:left="113"/>
-        <w:shd w:val="clear" w:color="auto" w:fill="F2F2F2"/>
-      </w:pPr>
-      <w:r>
-        <w:rPr>
-          <w:rFonts w:ascii="Consolas" w:hAnsi="Consolas"/>
-          <w:sz w:val="18"/>
-        </w:rPr>
-        <w:t xml:space="preserve">      - name: Mid</w:t>
-      </w:r>
-    </w:p>
-    <w:p>
-      <w:pPr>
-        <w:spacing w:before="0" w:after="0" w:line="240" w:lineRule="auto"/>
-        <w:ind w:left="113"/>
-        <w:shd w:val="clear" w:color="auto" w:fill="F2F2F2"/>
-      </w:pPr>
-      <w:r>
-        <w:rPr>
-          <w:rFonts w:ascii="Consolas" w:hAnsi="Consolas"/>
-          <w:sz w:val="18"/>
-        </w:rPr>
-        <w:t xml:space="preserve">        eq_filter: peaking</w:t>
-      </w:r>
-    </w:p>
-    <w:p>
-      <w:pPr>
-        <w:spacing w:before="0" w:after="0" w:line="240" w:lineRule="auto"/>
-        <w:ind w:left="113"/>
-        <w:shd w:val="clear" w:color="auto" w:fill="F2F2F2"/>
-      </w:pPr>
-      <w:r>
-        <w:rPr>
-          <w:rFonts w:ascii="Consolas" w:hAnsi="Consolas"/>
-          <w:sz w:val="18"/>
-        </w:rPr>
-        <w:t xml:space="preserve">        frequency: 1kHz</w:t>
-      </w:r>
-    </w:p>
-    <w:p>
-      <w:pPr>
-        <w:spacing w:before="0" w:after="0" w:line="240" w:lineRule="auto"/>
-        <w:ind w:left="113"/>
-        <w:shd w:val="clear" w:color="auto" w:fill="F2F2F2"/>
-      </w:pPr>
-      <w:r>
-        <w:rPr>
-          <w:rFonts w:ascii="Consolas" w:hAnsi="Consolas"/>
-          <w:sz w:val="18"/>
-        </w:rPr>
-        <w:t xml:space="preserve">        q_factor: 2.0</w:t>
-      </w:r>
-    </w:p>
-    <w:p>
-      <w:pPr>
-        <w:spacing w:before="0" w:after="0" w:line="240" w:lineRule="auto"/>
-        <w:ind w:left="113"/>
-        <w:shd w:val="clear" w:color="auto" w:fill="F2F2F2"/>
-      </w:pPr>
-      <w:r>
-        <w:rPr>
-          <w:rFonts w:ascii="Consolas" w:hAnsi="Consolas"/>
-          <w:sz w:val="18"/>
-        </w:rPr>
-        <w:t xml:space="preserve">        channel: both</w:t>
-      </w:r>
-    </w:p>
-    <w:p>
-      <w:pPr>
-        <w:spacing w:before="0" w:after="0" w:line="240" w:lineRule="auto"/>
-        <w:ind w:left="113"/>
-        <w:shd w:val="clear" w:color="auto" w:fill="F2F2F2"/>
-      </w:pPr>
-      <w:r>
-        <w:rPr>
-          <w:rFonts w:ascii="Consolas" w:hAnsi="Consolas"/>
-          <w:sz w:val="18"/>
-        </w:rPr>
-        <w:t xml:space="preserve">        always_on: true</w:t>
-      </w:r>
-    </w:p>
-    <w:p>
-      <w:pPr>
-        <w:spacing w:before="0" w:after="0" w:line="240" w:lineRule="auto"/>
-        <w:ind w:left="113"/>
-        <w:shd w:val="clear" w:color="auto" w:fill="F2F2F2"/>
-      </w:pPr>
-      <w:r>
-        <w:rPr>
-          <w:rFonts w:ascii="Consolas" w:hAnsi="Consolas"/>
-          <w:sz w:val="18"/>
-        </w:rPr>
-        <w:t xml:space="preserve">    frequency_bands:            # slider = frequency; any filter type</w:t>
-      </w:r>
-    </w:p>
-    <w:p>
-      <w:pPr>
-        <w:spacing w:before="0" w:after="0" w:line="240" w:lineRule="auto"/>
-        <w:ind w:left="113"/>
-        <w:shd w:val="clear" w:color="auto" w:fill="F2F2F2"/>
-      </w:pPr>
-      <w:r>
-        <w:rPr>
-          <w:rFonts w:ascii="Consolas" w:hAnsi="Consolas"/>
-          <w:sz w:val="18"/>
-        </w:rPr>
-        <w:t xml:space="preserve">      - name: Crossover</w:t>
-      </w:r>
-    </w:p>
-    <w:p>
-      <w:pPr>
-        <w:spacing w:before="0" w:after="0" w:line="240" w:lineRule="auto"/>
-        <w:ind w:left="113"/>
-        <w:shd w:val="clear" w:color="auto" w:fill="F2F2F2"/>
-      </w:pPr>
-      <w:r>
-        <w:rPr>
-          <w:rFonts w:ascii="Consolas" w:hAnsi="Consolas"/>
-          <w:sz w:val="18"/>
-        </w:rPr>
-        <w:t xml:space="preserve">        eq_filter: high_pass</w:t>
-      </w:r>
-    </w:p>
-    <w:p>
-      <w:pPr>
-        <w:spacing w:before="0" w:after="0" w:line="240" w:lineRule="auto"/>
-        <w:ind w:left="113"/>
-        <w:shd w:val="clear" w:color="auto" w:fill="F2F2F2"/>
-      </w:pPr>
-      <w:r>
-        <w:rPr>
-          <w:rFonts w:ascii="Consolas" w:hAnsi="Consolas"/>
-          <w:sz w:val="18"/>
-        </w:rPr>
-        <w:t xml:space="preserve">        gain: 0dB               # only for filters with a gain input</w:t>
-      </w:r>
-    </w:p>
-    <w:p>
-      <w:pPr>
-        <w:spacing w:before="0" w:after="0" w:line="240" w:lineRule="auto"/>
-        <w:ind w:left="113"/>
-        <w:shd w:val="clear" w:color="auto" w:fill="F2F2F2"/>
-      </w:pPr>
-      <w:r>
-        <w:rPr>
-          <w:rFonts w:ascii="Consolas" w:hAnsi="Consolas"/>
-          <w:sz w:val="18"/>
-        </w:rPr>
-        <w:t xml:space="preserve">        q_factor: 0.707</w:t>
-      </w:r>
-    </w:p>
-    <w:p>
-      <w:pPr>
-        <w:spacing w:before="0" w:after="0" w:line="240" w:lineRule="auto"/>
-        <w:ind w:left="113"/>
-        <w:shd w:val="clear" w:color="auto" w:fill="F2F2F2"/>
-      </w:pPr>
-      <w:r>
-        <w:rPr>
-          <w:rFonts w:ascii="Consolas" w:hAnsi="Consolas"/>
-          <w:sz w:val="18"/>
-        </w:rPr>
-        <w:t xml:space="preserve">        channel: right</w:t>
-      </w:r>
-    </w:p>
-    <w:p>
-      <w:pPr>
-        <w:spacing w:before="0" w:after="0" w:line="240" w:lineRule="auto"/>
-        <w:ind w:left="113"/>
-        <w:shd w:val="clear" w:color="auto" w:fill="F2F2F2"/>
-      </w:pPr>
-      <w:r>
-        <w:rPr>
-          <w:rFonts w:ascii="Consolas" w:hAnsi="Consolas"/>
-          <w:sz w:val="18"/>
-        </w:rPr>
-        <w:t xml:space="preserve">        always_on: true</w:t>
-      </w:r>
-    </w:p>
-    <w:p>
-      <w:pPr>
-        <w:spacing w:before="0" w:after="0" w:line="240" w:lineRule="auto"/>
-        <w:ind w:left="113"/>
-        <w:shd w:val="clear" w:color="auto" w:fill="F2F2F2"/>
-      </w:pPr>
-      <w:r>
-        <w:rPr>
-          <w:rFonts w:ascii="Consolas" w:hAnsi="Consolas"/>
-          <w:sz w:val="18"/>
-        </w:rPr>
-        <w:t xml:space="preserve">      - name: Notch</w:t>
-      </w:r>
-    </w:p>
-    <w:p>
-      <w:pPr>
-        <w:spacing w:before="0" w:after="0" w:line="240" w:lineRule="auto"/>
-        <w:ind w:left="113"/>
-        <w:shd w:val="clear" w:color="auto" w:fill="F2F2F2"/>
-      </w:pPr>
-      <w:r>
-        <w:rPr>
-          <w:rFonts w:ascii="Consolas" w:hAnsi="Consolas"/>
-          <w:sz w:val="18"/>
-        </w:rPr>
-        <w:t xml:space="preserve">        eq_filter: notch</w:t>
-      </w:r>
-    </w:p>
-    <w:p>
-      <w:pPr>
-        <w:spacing w:before="0" w:after="0" w:line="240" w:lineRule="auto"/>
-        <w:ind w:left="113"/>
-        <w:shd w:val="clear" w:color="auto" w:fill="F2F2F2"/>
-      </w:pPr>
-      <w:r>
-        <w:rPr>
-          <w:rFonts w:ascii="Consolas" w:hAnsi="Consolas"/>
-          <w:sz w:val="18"/>
-        </w:rPr>
-        <w:t xml:space="preserve">        q_factor: 8.0</w:t>
-      </w:r>
-    </w:p>
-    <w:p>
-      <w:pPr>
-        <w:spacing w:before="0" w:after="0" w:line="240" w:lineRule="auto"/>
-        <w:ind w:left="113"/>
-        <w:shd w:val="clear" w:color="auto" w:fill="F2F2F2"/>
-      </w:pPr>
-      <w:r>
-        <w:rPr>
-          <w:rFonts w:ascii="Consolas" w:hAnsi="Consolas"/>
-          <w:sz w:val="18"/>
-        </w:rPr>
-        <w:t xml:space="preserve">        channel: left</w:t>
-      </w:r>
-    </w:p>
-    <w:p>
-      <w:pPr>
-        <w:spacing w:before="0" w:after="160" w:line="240" w:lineRule="auto"/>
-        <w:ind w:left="113"/>
-        <w:shd w:val="clear" w:color="auto" w:fill="F2F2F2"/>
-      </w:pPr>
-      <w:r>
-        <w:rPr>
-          <w:rFonts w:ascii="Consolas" w:hAnsi="Consolas"/>
-          <w:sz w:val="18"/>
-        </w:rPr>
-        <w:t xml:space="preserve">        always_on: false</w:t>
-      </w:r>
-    </w:p>
-    <w:p>
-      <w:r>
-        <w:rPr>
-          <w:rFonts w:ascii="Consolas" w:hAnsi="Consolas"/>
-          <w:sz w:val="20"/>
-        </w:rPr>
-        <w:t>channel</w:t>
-      </w:r>
-      <w:r>
-        <w:t xml:space="preserve"> and </w:t>
-      </w:r>
-      <w:r>
-        <w:rPr>
-          <w:rFonts w:ascii="Consolas" w:hAnsi="Consolas"/>
-          <w:sz w:val="20"/>
-        </w:rPr>
-        <w:t>always_on</w:t>
-      </w:r>
-      <w:r>
-        <w:t xml:space="preserve"> are written out in this example even where they are the default.</w:t>
-      </w:r>
-    </w:p>
-    <w:p>
-      <w:pPr>
-        <w:pStyle w:val="Heading1"/>
-      </w:pPr>
-      <w:r>
-        <w:t>Entry Options</w:t>
-      </w:r>
-    </w:p>
-    <w:tbl>
-      <w:tblPr>
-        <w:tblStyle w:val="TableGrid"/>
-        <w:tblW w:type="auto" w:w="0"/>
-        <w:jc w:val="left"/>
-        <w:tblLook w:firstColumn="1" w:firstRow="1" w:lastColumn="0" w:lastRow="0" w:noHBand="0" w:noVBand="1" w:val="04A0"/>
-      </w:tblPr>
-      <w:tblGrid>
-        <w:gridCol w:w="2268"/>
-        <w:gridCol w:w="2268"/>
-        <w:gridCol w:w="2268"/>
-        <w:gridCol w:w="2268"/>
-      </w:tblGrid>
-      <w:tr>
-        <w:tc>
-          <w:tcPr>
-            <w:tcW w:type="dxa" w:w="1474"/>
-            <w:shd w:val="clear" w:color="auto" w:fill="D9E2F3"/>
-          </w:tcPr>
-          <w:p>
-            <w:pPr>
-              <w:spacing w:after="0"/>
-            </w:pPr>
-            <w:r>
-              <w:rPr>
-                <w:b/>
-              </w:rPr>
-              <w:t>Option</w:t>
-            </w:r>
-          </w:p>
-        </w:tc>
-        <w:tc>
-          <w:tcPr>
-            <w:tcW w:type="dxa" w:w="2381"/>
-            <w:shd w:val="clear" w:color="auto" w:fill="D9E2F3"/>
-          </w:tcPr>
-          <w:p>
-            <w:pPr>
-              <w:spacing w:after="0"/>
-            </w:pPr>
-            <w:r>
-              <w:rPr>
-                <w:b/>
-              </w:rPr>
-              <w:t>fixed_filters</w:t>
-            </w:r>
-          </w:p>
-        </w:tc>
-        <w:tc>
-          <w:tcPr>
-            <w:tcW w:type="dxa" w:w="2608"/>
-            <w:shd w:val="clear" w:color="auto" w:fill="D9E2F3"/>
-          </w:tcPr>
-          <w:p>
-            <w:pPr>
-              <w:spacing w:after="0"/>
-            </w:pPr>
-            <w:r>
-              <w:rPr>
-                <w:b/>
-              </w:rPr>
-              <w:t>gain_bands</w:t>
-            </w:r>
-          </w:p>
-        </w:tc>
-        <w:tc>
-          <w:tcPr>
-            <w:tcW w:type="dxa" w:w="2608"/>
-            <w:shd w:val="clear" w:color="auto" w:fill="D9E2F3"/>
-          </w:tcPr>
-          <w:p>
-            <w:pPr>
-              <w:spacing w:after="0"/>
-            </w:pPr>
-            <w:r>
-              <w:rPr>
-                <w:b/>
-              </w:rPr>
-              <w:t>frequency_bands</w:t>
-            </w:r>
-          </w:p>
-        </w:tc>
-      </w:tr>
-      <w:tr>
-        <w:tc>
-          <w:tcPr>
-            <w:tcW w:type="dxa" w:w="1474"/>
-          </w:tcPr>
-          <w:p>
-            <w:pPr>
-              <w:spacing w:after="0"/>
-            </w:pPr>
-            <w:r>
-              <w:rPr>
-                <w:rFonts w:ascii="Consolas" w:hAnsi="Consolas"/>
-                <w:sz w:val="20"/>
-              </w:rPr>
-              <w:t>eq_filter</w:t>
-            </w:r>
-          </w:p>
-        </w:tc>
-        <w:tc>
-          <w:tcPr>
-            <w:tcW w:type="dxa" w:w="2381"/>
-          </w:tcPr>
-          <w:p>
-            <w:pPr>
-              <w:spacing w:after="0"/>
-            </w:pPr>
-            <w:r>
-              <w:t>required, any filter</w:t>
-            </w:r>
-          </w:p>
-        </w:tc>
-        <w:tc>
-          <w:tcPr>
-            <w:tcW w:type="dxa" w:w="2608"/>
-          </w:tcPr>
-          <w:p>
-            <w:pPr>
-              <w:spacing w:after="0"/>
-            </w:pPr>
-            <w:r>
-              <w:t xml:space="preserve">optional, default </w:t>
-            </w:r>
-            <w:r>
-              <w:rPr>
-                <w:rFonts w:ascii="Consolas" w:hAnsi="Consolas"/>
-                <w:sz w:val="20"/>
-              </w:rPr>
-              <w:t>equalizer</w:t>
-            </w:r>
-            <w:r>
-              <w:t>; filters with a gain input only</w:t>
-            </w:r>
-          </w:p>
-        </w:tc>
-        <w:tc>
-          <w:tcPr>
-            <w:tcW w:type="dxa" w:w="2608"/>
-          </w:tcPr>
-          <w:p>
-            <w:pPr>
-              <w:spacing w:after="0"/>
-            </w:pPr>
-            <w:r>
-              <w:t xml:space="preserve">optional, default </w:t>
-            </w:r>
-            <w:r>
-              <w:rPr>
-                <w:rFonts w:ascii="Consolas" w:hAnsi="Consolas"/>
-                <w:sz w:val="20"/>
-              </w:rPr>
-              <w:t>equalizer</w:t>
-            </w:r>
-            <w:r>
-              <w:t>; any filter</w:t>
-            </w:r>
-          </w:p>
-        </w:tc>
-      </w:tr>
-      <w:tr>
-        <w:tc>
-          <w:tcPr>
-            <w:tcW w:type="dxa" w:w="1474"/>
-          </w:tcPr>
-          <w:p>
-            <w:pPr>
-              <w:spacing w:after="0"/>
-            </w:pPr>
-            <w:r>
-              <w:rPr>
-                <w:rFonts w:ascii="Consolas" w:hAnsi="Consolas"/>
-                <w:sz w:val="20"/>
-              </w:rPr>
-              <w:t>frequency</w:t>
-            </w:r>
-          </w:p>
-        </w:tc>
-        <w:tc>
-          <w:tcPr>
-            <w:tcW w:type="dxa" w:w="2381"/>
-          </w:tcPr>
-          <w:p>
-            <w:pPr>
-              <w:spacing w:after="0"/>
-            </w:pPr>
-            <w:r>
-              <w:t>required, 20 Hz to 16 kHz</w:t>
-            </w:r>
-          </w:p>
-        </w:tc>
-        <w:tc>
-          <w:tcPr>
-            <w:tcW w:type="dxa" w:w="2608"/>
-          </w:tcPr>
-          <w:p>
-            <w:pPr>
-              <w:spacing w:after="0"/>
-            </w:pPr>
-            <w:r>
-              <w:t>required, 20 Hz to 16 kHz</w:t>
-            </w:r>
-          </w:p>
-        </w:tc>
-        <w:tc>
-          <w:tcPr>
-            <w:tcW w:type="dxa" w:w="2608"/>
-          </w:tcPr>
-          <w:p>
-            <w:pPr>
-              <w:spacing w:after="0"/>
-            </w:pPr>
-            <w:r>
-              <w:t>the slider; starts at 1000 Hz</w:t>
-            </w:r>
-          </w:p>
-        </w:tc>
-      </w:tr>
-      <w:tr>
-        <w:tc>
-          <w:tcPr>
-            <w:tcW w:type="dxa" w:w="1474"/>
-          </w:tcPr>
-          <w:p>
-            <w:pPr>
-              <w:spacing w:after="0"/>
-            </w:pPr>
-            <w:r>
-              <w:rPr>
-                <w:rFonts w:ascii="Consolas" w:hAnsi="Consolas"/>
-                <w:sz w:val="20"/>
-              </w:rPr>
-              <w:t>gain</w:t>
-            </w:r>
-          </w:p>
-        </w:tc>
-        <w:tc>
-          <w:tcPr>
-            <w:tcW w:type="dxa" w:w="2381"/>
-          </w:tcPr>
-          <w:p>
-            <w:pPr>
-              <w:spacing w:after="0"/>
-            </w:pPr>
-            <w:r>
-              <w:t>optional, default 0 dB; filters with a gain input only</w:t>
-            </w:r>
-          </w:p>
-        </w:tc>
-        <w:tc>
-          <w:tcPr>
-            <w:tcW w:type="dxa" w:w="2608"/>
-          </w:tcPr>
-          <w:p>
-            <w:pPr>
-              <w:spacing w:after="0"/>
-            </w:pPr>
-            <w:r>
-              <w:t>the slider; starts at 0 dB</w:t>
-            </w:r>
-          </w:p>
-        </w:tc>
-        <w:tc>
-          <w:tcPr>
-            <w:tcW w:type="dxa" w:w="2608"/>
-          </w:tcPr>
-          <w:p>
-            <w:pPr>
-              <w:spacing w:after="0"/>
-            </w:pPr>
-            <w:r>
-              <w:t>optional, default 0 dB; filters with a gain input only</w:t>
-            </w:r>
-          </w:p>
-        </w:tc>
-      </w:tr>
-      <w:tr>
-        <w:tc>
-          <w:tcPr>
-            <w:tcW w:type="dxa" w:w="1474"/>
-          </w:tcPr>
-          <w:p>
-            <w:pPr>
-              <w:spacing w:after="0"/>
-            </w:pPr>
-            <w:r>
-              <w:rPr>
-                <w:rFonts w:ascii="Consolas" w:hAnsi="Consolas"/>
-                <w:sz w:val="20"/>
-              </w:rPr>
-              <w:t>q_factor</w:t>
-            </w:r>
-          </w:p>
-        </w:tc>
-        <w:tc>
-          <w:tcPr>
-            <w:tcW w:type="dxa" w:w="2381"/>
-          </w:tcPr>
-          <w:p>
-            <w:pPr>
-              <w:spacing w:after="0"/>
-            </w:pPr>
-            <w:r>
-              <w:t>optional, default per filter (table below)</w:t>
-            </w:r>
-          </w:p>
-        </w:tc>
-        <w:tc>
-          <w:tcPr>
-            <w:tcW w:type="dxa" w:w="2608"/>
-          </w:tcPr>
-          <w:p>
-            <w:pPr>
-              <w:spacing w:after="0"/>
-            </w:pPr>
-            <w:r>
-              <w:t>optional, default per filter</w:t>
-            </w:r>
-          </w:p>
-        </w:tc>
-        <w:tc>
-          <w:tcPr>
-            <w:tcW w:type="dxa" w:w="2608"/>
-          </w:tcPr>
-          <w:p>
-            <w:pPr>
-              <w:spacing w:after="0"/>
-            </w:pPr>
-            <w:r>
-              <w:t>optional, default per filter</w:t>
-            </w:r>
-          </w:p>
-        </w:tc>
-      </w:tr>
-      <w:tr>
-        <w:tc>
-          <w:tcPr>
-            <w:tcW w:type="dxa" w:w="1474"/>
-          </w:tcPr>
-          <w:p>
-            <w:pPr>
-              <w:spacing w:after="0"/>
-            </w:pPr>
-            <w:r>
-              <w:rPr>
-                <w:rFonts w:ascii="Consolas" w:hAnsi="Consolas"/>
-                <w:sz w:val="20"/>
-              </w:rPr>
-              <w:t>channel</w:t>
-            </w:r>
-          </w:p>
-        </w:tc>
-        <w:tc>
-          <w:tcPr>
-            <w:tcW w:type="dxa" w:w="2381"/>
-          </w:tcPr>
-          <w:p>
-            <w:pPr>
-              <w:spacing w:after="0"/>
-            </w:pPr>
-            <w:r>
-              <w:t xml:space="preserve">optional, default </w:t>
-            </w:r>
-            <w:r>
-              <w:rPr>
-                <w:rFonts w:ascii="Consolas" w:hAnsi="Consolas"/>
-                <w:sz w:val="20"/>
-              </w:rPr>
-              <w:t>both</w:t>
-            </w:r>
-          </w:p>
-        </w:tc>
-        <w:tc>
-          <w:tcPr>
-            <w:tcW w:type="dxa" w:w="2608"/>
-          </w:tcPr>
-          <w:p>
-            <w:pPr>
-              <w:spacing w:after="0"/>
-            </w:pPr>
-            <w:r>
-              <w:t xml:space="preserve">optional, default </w:t>
-            </w:r>
-            <w:r>
-              <w:rPr>
-                <w:rFonts w:ascii="Consolas" w:hAnsi="Consolas"/>
-                <w:sz w:val="20"/>
-              </w:rPr>
-              <w:t>both</w:t>
-            </w:r>
-          </w:p>
-        </w:tc>
-        <w:tc>
-          <w:tcPr>
-            <w:tcW w:type="dxa" w:w="2608"/>
-          </w:tcPr>
-          <w:p>
-            <w:pPr>
-              <w:spacing w:after="0"/>
-            </w:pPr>
-            <w:r>
-              <w:t xml:space="preserve">optional, default </w:t>
-            </w:r>
-            <w:r>
-              <w:rPr>
-                <w:rFonts w:ascii="Consolas" w:hAnsi="Consolas"/>
-                <w:sz w:val="20"/>
-              </w:rPr>
-              <w:t>both</w:t>
-            </w:r>
-          </w:p>
-        </w:tc>
-      </w:tr>
-      <w:tr>
-        <w:tc>
-          <w:tcPr>
-            <w:tcW w:type="dxa" w:w="1474"/>
-          </w:tcPr>
-          <w:p>
-            <w:pPr>
-              <w:spacing w:after="0"/>
-            </w:pPr>
-            <w:r>
-              <w:rPr>
-                <w:rFonts w:ascii="Consolas" w:hAnsi="Consolas"/>
-                <w:sz w:val="20"/>
-              </w:rPr>
-              <w:t>always_on</w:t>
-            </w:r>
-          </w:p>
-        </w:tc>
-        <w:tc>
-          <w:tcPr>
-            <w:tcW w:type="dxa" w:w="2381"/>
-          </w:tcPr>
-          <w:p>
-            <w:pPr>
-              <w:spacing w:after="0"/>
-            </w:pPr>
-            <w:r>
-              <w:t xml:space="preserve">optional, default </w:t>
-            </w:r>
-            <w:r>
-              <w:rPr>
-                <w:b/>
-              </w:rPr>
-              <w:t>true</w:t>
-            </w:r>
-          </w:p>
-        </w:tc>
-        <w:tc>
-          <w:tcPr>
-            <w:tcW w:type="dxa" w:w="2608"/>
-          </w:tcPr>
-          <w:p>
-            <w:pPr>
-              <w:spacing w:after="0"/>
-            </w:pPr>
-            <w:r>
-              <w:t xml:space="preserve">optional, default </w:t>
-            </w:r>
-            <w:r>
-              <w:rPr>
-                <w:b/>
-              </w:rPr>
-              <w:t>false</w:t>
-            </w:r>
-          </w:p>
-        </w:tc>
-        <w:tc>
-          <w:tcPr>
-            <w:tcW w:type="dxa" w:w="2608"/>
-          </w:tcPr>
-          <w:p>
-            <w:pPr>
-              <w:spacing w:after="0"/>
-            </w:pPr>
-            <w:r>
-              <w:t xml:space="preserve">optional, default </w:t>
-            </w:r>
-            <w:r>
-              <w:rPr>
-                <w:b/>
-              </w:rPr>
-              <w:t>false</w:t>
-            </w:r>
-          </w:p>
-        </w:tc>
-      </w:tr>
-    </w:tbl>
-    <w:p/>
-    <w:p>
-      <w:pPr>
-        <w:pStyle w:val="ListBullet"/>
-        <w:spacing w:after="60"/>
-      </w:pPr>
-      <w:r>
-        <w:t xml:space="preserve">The options allowed depend on </w:t>
-      </w:r>
-      <w:r>
-        <w:rPr>
-          <w:rFonts w:ascii="Consolas" w:hAnsi="Consolas"/>
-          <w:sz w:val="20"/>
-        </w:rPr>
-        <w:t>eq_filter</w:t>
-      </w:r>
-      <w:r>
-        <w:t xml:space="preserve">: for example </w:t>
-      </w:r>
-      <w:r>
-        <w:rPr>
-          <w:rFonts w:ascii="Consolas" w:hAnsi="Consolas"/>
-          <w:sz w:val="20"/>
-        </w:rPr>
-        <w:t>gain</w:t>
-      </w:r>
-      <w:r>
-        <w:t xml:space="preserve"> on a notch is a config error.</w:t>
-      </w:r>
-    </w:p>
-    <w:p>
-      <w:pPr>
-        <w:pStyle w:val="ListBullet"/>
-        <w:spacing w:after="60"/>
-      </w:pPr>
-      <w:r>
-        <w:t xml:space="preserve">Each band is a full ESPHome number, so standard options such as </w:t>
-      </w:r>
-      <w:r>
-        <w:rPr>
-          <w:rFonts w:ascii="Consolas" w:hAnsi="Consolas"/>
-          <w:sz w:val="20"/>
-        </w:rPr>
-        <w:t>id</w:t>
-      </w:r>
-      <w:r>
-        <w:t xml:space="preserve">, </w:t>
-      </w:r>
-      <w:r>
-        <w:rPr>
-          <w:rFonts w:ascii="Consolas" w:hAnsi="Consolas"/>
-          <w:sz w:val="20"/>
-        </w:rPr>
-        <w:t>icon</w:t>
-      </w:r>
-      <w:r>
-        <w:t xml:space="preserve">, </w:t>
-      </w:r>
-      <w:r>
-        <w:rPr>
-          <w:rFonts w:ascii="Consolas" w:hAnsi="Consolas"/>
-          <w:sz w:val="20"/>
-        </w:rPr>
-        <w:t>mode</w:t>
-      </w:r>
-      <w:r>
-        <w:t xml:space="preserve"> and </w:t>
-      </w:r>
-      <w:r>
-        <w:rPr>
-          <w:rFonts w:ascii="Consolas" w:hAnsi="Consolas"/>
-          <w:sz w:val="20"/>
-        </w:rPr>
-        <w:t>entity_category</w:t>
-      </w:r>
-      <w:r>
-        <w:t xml:space="preserve"> can be added.</w:t>
-      </w:r>
-    </w:p>
-    <w:p>
-      <w:pPr>
-        <w:pStyle w:val="ListBullet"/>
-        <w:spacing w:after="60"/>
-      </w:pPr>
-      <w:r>
-        <w:t>A band's last value is restored at boot. Before anything is saved, gain sliders start at 0 dB and frequency sliders at 1000 Hz. There is no initial value option for now.</w:t>
-      </w:r>
-    </w:p>
-    <w:p>
-      <w:pPr>
-        <w:pStyle w:val="Heading2"/>
-      </w:pPr>
-      <w:r>
-        <w:t>Filters</w:t>
-      </w:r>
-    </w:p>
-    <w:tbl>
-      <w:tblPr>
-        <w:tblStyle w:val="TableGrid"/>
-        <w:tblW w:type="auto" w:w="0"/>
-        <w:jc w:val="left"/>
-        <w:tblLook w:firstColumn="1" w:firstRow="1" w:lastColumn="0" w:lastRow="0" w:noHBand="0" w:noVBand="1" w:val="04A0"/>
-      </w:tblPr>
-      <w:tblGrid>
-        <w:gridCol w:w="2268"/>
-        <w:gridCol w:w="2268"/>
-        <w:gridCol w:w="2268"/>
-        <w:gridCol w:w="2268"/>
-      </w:tblGrid>
-      <w:tr>
-        <w:tc>
-          <w:tcPr>
-            <w:tcW w:type="dxa" w:w="2608"/>
-            <w:shd w:val="clear" w:color="auto" w:fill="D9E2F3"/>
-          </w:tcPr>
-          <w:p>
-            <w:pPr>
-              <w:spacing w:after="0"/>
-            </w:pPr>
-            <w:r>
-              <w:rPr>
-                <w:b/>
-              </w:rPr>
-              <w:t>eq_filter</w:t>
-            </w:r>
-          </w:p>
-        </w:tc>
-        <w:tc>
-          <w:tcPr>
-            <w:tcW w:type="dxa" w:w="1134"/>
-            <w:shd w:val="clear" w:color="auto" w:fill="D9E2F3"/>
-          </w:tcPr>
-          <w:p>
-            <w:pPr>
-              <w:spacing w:after="0"/>
-            </w:pPr>
-            <w:r>
-              <w:rPr>
-                <w:b/>
-              </w:rPr>
-              <w:t>Gain input</w:t>
-            </w:r>
-          </w:p>
-        </w:tc>
-        <w:tc>
-          <w:tcPr>
-            <w:tcW w:type="dxa" w:w="1587"/>
-            <w:shd w:val="clear" w:color="auto" w:fill="D9E2F3"/>
-          </w:tcPr>
-          <w:p>
-            <w:pPr>
-              <w:spacing w:after="0"/>
-            </w:pPr>
-            <w:r>
-              <w:rPr>
-                <w:b/>
-              </w:rPr>
-              <w:t>Default q_factor</w:t>
-            </w:r>
-          </w:p>
-        </w:tc>
-        <w:tc>
-          <w:tcPr>
-            <w:tcW w:type="dxa" w:w="3742"/>
-            <w:shd w:val="clear" w:color="auto" w:fill="D9E2F3"/>
-          </w:tcPr>
-          <w:p>
-            <w:pPr>
-              <w:spacing w:after="0"/>
-            </w:pPr>
-            <w:r>
-              <w:rPr>
-                <w:b/>
-              </w:rPr>
-              <w:t>Why</w:t>
-            </w:r>
-          </w:p>
-        </w:tc>
-      </w:tr>
-      <w:tr>
-        <w:tc>
-          <w:tcPr>
-            <w:tcW w:type="dxa" w:w="2608"/>
-          </w:tcPr>
-          <w:p>
-            <w:pPr>
-              <w:spacing w:after="0"/>
-            </w:pPr>
-            <w:r>
-              <w:rPr>
-                <w:rFonts w:ascii="Consolas" w:hAnsi="Consolas"/>
-                <w:sz w:val="20"/>
-              </w:rPr>
-              <w:t>equalizer</w:t>
-            </w:r>
-            <w:r>
-              <w:t xml:space="preserve"> (default), </w:t>
-            </w:r>
-            <w:r>
-              <w:rPr>
-                <w:rFonts w:ascii="Consolas" w:hAnsi="Consolas"/>
-                <w:sz w:val="20"/>
-              </w:rPr>
-              <w:t>peaking</w:t>
-            </w:r>
-          </w:p>
-        </w:tc>
-        <w:tc>
-          <w:tcPr>
-            <w:tcW w:type="dxa" w:w="1134"/>
-          </w:tcPr>
-          <w:p>
-            <w:pPr>
-              <w:spacing w:after="0"/>
-            </w:pPr>
-            <w:r>
-              <w:t>yes</w:t>
-            </w:r>
-          </w:p>
-        </w:tc>
-        <w:tc>
-          <w:tcPr>
-            <w:tcW w:type="dxa" w:w="1587"/>
-          </w:tcPr>
-          <w:p>
-            <w:pPr>
-              <w:spacing w:after="0"/>
-            </w:pPr>
-            <w:r>
-              <w:t>2.144908</w:t>
-            </w:r>
-          </w:p>
-        </w:tc>
-        <w:tc>
-          <w:tcPr>
-            <w:tcW w:type="dxa" w:w="3742"/>
-          </w:tcPr>
-          <w:p>
-            <w:pPr>
-              <w:spacing w:after="0"/>
-            </w:pPr>
-            <w:r>
-              <w:t>2/3-octave constant Q, the ISO 15 band graphic EQ</w:t>
-            </w:r>
-          </w:p>
-        </w:tc>
-      </w:tr>
-      <w:tr>
-        <w:tc>
-          <w:tcPr>
-            <w:tcW w:type="dxa" w:w="2608"/>
-          </w:tcPr>
-          <w:p>
-            <w:pPr>
-              <w:spacing w:after="0"/>
-            </w:pPr>
-            <w:r>
-              <w:rPr>
-                <w:rFonts w:ascii="Consolas" w:hAnsi="Consolas"/>
-                <w:sz w:val="20"/>
-              </w:rPr>
-              <w:t>low_shelf</w:t>
-            </w:r>
-            <w:r>
-              <w:t xml:space="preserve">, </w:t>
-            </w:r>
-            <w:r>
-              <w:rPr>
-                <w:rFonts w:ascii="Consolas" w:hAnsi="Consolas"/>
-                <w:sz w:val="20"/>
-              </w:rPr>
-              <w:t>high_shelf</w:t>
-            </w:r>
-          </w:p>
-        </w:tc>
-        <w:tc>
-          <w:tcPr>
-            <w:tcW w:type="dxa" w:w="1134"/>
-          </w:tcPr>
-          <w:p>
-            <w:pPr>
-              <w:spacing w:after="0"/>
-            </w:pPr>
-            <w:r>
-              <w:t>yes</w:t>
-            </w:r>
-          </w:p>
-        </w:tc>
-        <w:tc>
-          <w:tcPr>
-            <w:tcW w:type="dxa" w:w="1587"/>
-          </w:tcPr>
-          <w:p>
-            <w:pPr>
-              <w:spacing w:after="0"/>
-            </w:pPr>
-            <w:r>
-              <w:t>0.707</w:t>
-            </w:r>
-          </w:p>
-        </w:tc>
-        <w:tc>
-          <w:tcPr>
-            <w:tcW w:type="dxa" w:w="3742"/>
-          </w:tcPr>
-          <w:p>
-            <w:pPr>
-              <w:spacing w:after="0"/>
-            </w:pPr>
-            <w:r>
-              <w:t>standard shelf (RBJ slope 1)</w:t>
-            </w:r>
-          </w:p>
-        </w:tc>
-      </w:tr>
-      <w:tr>
-        <w:tc>
-          <w:tcPr>
-            <w:tcW w:type="dxa" w:w="2608"/>
-          </w:tcPr>
-          <w:p>
-            <w:pPr>
-              <w:spacing w:after="0"/>
-            </w:pPr>
-            <w:r>
-              <w:rPr>
-                <w:rFonts w:ascii="Consolas" w:hAnsi="Consolas"/>
-                <w:sz w:val="20"/>
-              </w:rPr>
-              <w:t>low_pass</w:t>
-            </w:r>
-            <w:r>
-              <w:t xml:space="preserve">, </w:t>
-            </w:r>
-            <w:r>
-              <w:rPr>
-                <w:rFonts w:ascii="Consolas" w:hAnsi="Consolas"/>
-                <w:sz w:val="20"/>
-              </w:rPr>
-              <w:t>high_pass</w:t>
-            </w:r>
-          </w:p>
-        </w:tc>
-        <w:tc>
-          <w:tcPr>
-            <w:tcW w:type="dxa" w:w="1134"/>
-          </w:tcPr>
-          <w:p>
-            <w:pPr>
-              <w:spacing w:after="0"/>
-            </w:pPr>
-            <w:r>
-              <w:t>yes</w:t>
-            </w:r>
-          </w:p>
-        </w:tc>
-        <w:tc>
-          <w:tcPr>
-            <w:tcW w:type="dxa" w:w="1587"/>
-          </w:tcPr>
-          <w:p>
-            <w:pPr>
-              <w:spacing w:after="0"/>
-            </w:pPr>
-            <w:r>
-              <w:t>0.707</w:t>
-            </w:r>
-          </w:p>
-        </w:tc>
-        <w:tc>
-          <w:tcPr>
-            <w:tcW w:type="dxa" w:w="3742"/>
-          </w:tcPr>
-          <w:p>
-            <w:pPr>
-              <w:spacing w:after="0"/>
-            </w:pPr>
-            <w:r>
-              <w:t>Butterworth, the industry standard</w:t>
-            </w:r>
-          </w:p>
-        </w:tc>
-      </w:tr>
-      <w:tr>
-        <w:tc>
-          <w:tcPr>
-            <w:tcW w:type="dxa" w:w="2608"/>
-          </w:tcPr>
-          <w:p>
-            <w:pPr>
-              <w:spacing w:after="0"/>
-            </w:pPr>
-            <w:r>
-              <w:rPr>
-                <w:rFonts w:ascii="Consolas" w:hAnsi="Consolas"/>
-                <w:sz w:val="20"/>
-              </w:rPr>
-              <w:t>notch</w:t>
-            </w:r>
-            <w:r>
-              <w:t xml:space="preserve">, </w:t>
-            </w:r>
-            <w:r>
-              <w:rPr>
-                <w:rFonts w:ascii="Consolas" w:hAnsi="Consolas"/>
-                <w:sz w:val="20"/>
-              </w:rPr>
-              <w:t>band_pass</w:t>
-            </w:r>
-          </w:p>
-        </w:tc>
-        <w:tc>
-          <w:tcPr>
-            <w:tcW w:type="dxa" w:w="1134"/>
-          </w:tcPr>
-          <w:p>
-            <w:pPr>
-              <w:spacing w:after="0"/>
-            </w:pPr>
-            <w:r>
-              <w:t>no</w:t>
-            </w:r>
-          </w:p>
-        </w:tc>
-        <w:tc>
-          <w:tcPr>
-            <w:tcW w:type="dxa" w:w="1587"/>
-          </w:tcPr>
-          <w:p>
-            <w:pPr>
-              <w:spacing w:after="0"/>
-            </w:pPr>
-            <w:r>
-              <w:t>required</w:t>
-            </w:r>
-          </w:p>
-        </w:tc>
-        <w:tc>
-          <w:tcPr>
-            <w:tcW w:type="dxa" w:w="3742"/>
-          </w:tcPr>
-          <w:p>
-            <w:pPr>
-              <w:spacing w:after="0"/>
-            </w:pPr>
-            <w:r>
-              <w:t>no common default: it depends on what is removed or isolated</w:t>
-            </w:r>
-          </w:p>
-        </w:tc>
-      </w:tr>
-    </w:tbl>
-    <w:p/>
-    <w:p>
-      <w:pPr>
-        <w:pStyle w:val="ListBullet"/>
-        <w:spacing w:after="60"/>
-      </w:pPr>
-      <w:r>
-        <w:rPr>
-          <w:rFonts w:ascii="Consolas" w:hAnsi="Consolas"/>
-          <w:sz w:val="20"/>
-        </w:rPr>
-        <w:t>q_factor</w:t>
-      </w:r>
-      <w:r>
-        <w:t xml:space="preserve"> is the only width input: it is the norm for parametric EQ (DAWs, miniDSP, Equalizer APO, REW, AutoEQ), so values can be copied straight in.</w:t>
-      </w:r>
-    </w:p>
-    <w:p>
-      <w:pPr>
-        <w:pStyle w:val="ListBullet"/>
-        <w:spacing w:after="60"/>
-      </w:pPr>
-      <w:r>
-        <w:t xml:space="preserve">Gain limits are as v1: -24 to +24 dB, +18 dB for </w:t>
-      </w:r>
-      <w:r>
-        <w:rPr>
-          <w:rFonts w:ascii="Consolas" w:hAnsi="Consolas"/>
-          <w:sz w:val="20"/>
-        </w:rPr>
-        <w:t>high_shelf</w:t>
-      </w:r>
-      <w:r>
-        <w:t xml:space="preserve"> and </w:t>
-      </w:r>
-      <w:r>
-        <w:rPr>
-          <w:rFonts w:ascii="Consolas" w:hAnsi="Consolas"/>
-          <w:sz w:val="20"/>
-        </w:rPr>
-        <w:t>high_pass</w:t>
-      </w:r>
-      <w:r>
-        <w:t>.</w:t>
-      </w:r>
-    </w:p>
-    <w:p>
-      <w:pPr>
-        <w:pStyle w:val="Heading2"/>
-      </w:pPr>
-      <w:r>
-        <w:t>Slider Ranges (number platform)</w:t>
-      </w:r>
-    </w:p>
-    <w:p>
-      <w:pPr>
-        <w:spacing w:before="0" w:after="0" w:line="240" w:lineRule="auto"/>
-        <w:ind w:left="113"/>
-        <w:shd w:val="clear" w:color="auto" w:fill="F2F2F2"/>
-      </w:pPr>
-      <w:r>
-        <w:rPr>
-          <w:rFonts w:ascii="Consolas" w:hAnsi="Consolas"/>
-          <w:sz w:val="18"/>
-        </w:rPr>
-        <w:t>number:</w:t>
-      </w:r>
-    </w:p>
-    <w:p>
-      <w:pPr>
-        <w:spacing w:before="0" w:after="0" w:line="240" w:lineRule="auto"/>
-        <w:ind w:left="113"/>
-        <w:shd w:val="clear" w:color="auto" w:fill="F2F2F2"/>
-      </w:pPr>
-      <w:r>
-        <w:rPr>
-          <w:rFonts w:ascii="Consolas" w:hAnsi="Consolas"/>
-          <w:sz w:val="18"/>
-        </w:rPr>
-        <w:t xml:space="preserve">  - platform: tas58xx</w:t>
-      </w:r>
-    </w:p>
-    <w:p>
-      <w:pPr>
-        <w:spacing w:before="0" w:after="0" w:line="240" w:lineRule="auto"/>
-        <w:ind w:left="113"/>
-        <w:shd w:val="clear" w:color="auto" w:fill="F2F2F2"/>
-      </w:pPr>
-      <w:r>
-        <w:rPr>
-          <w:rFonts w:ascii="Consolas" w:hAnsi="Consolas"/>
-          <w:sz w:val="18"/>
-        </w:rPr>
-        <w:t xml:space="preserve">    gain_min: -15dB             # gain_bands slider range</w:t>
-      </w:r>
-    </w:p>
-    <w:p>
-      <w:pPr>
-        <w:spacing w:before="0" w:after="0" w:line="240" w:lineRule="auto"/>
-        <w:ind w:left="113"/>
-        <w:shd w:val="clear" w:color="auto" w:fill="F2F2F2"/>
-      </w:pPr>
-      <w:r>
-        <w:rPr>
-          <w:rFonts w:ascii="Consolas" w:hAnsi="Consolas"/>
-          <w:sz w:val="18"/>
-        </w:rPr>
-        <w:t xml:space="preserve">    gain_max: 15dB</w:t>
-      </w:r>
-    </w:p>
-    <w:p>
-      <w:pPr>
-        <w:spacing w:before="0" w:after="0" w:line="240" w:lineRule="auto"/>
-        <w:ind w:left="113"/>
-        <w:shd w:val="clear" w:color="auto" w:fill="F2F2F2"/>
-      </w:pPr>
-      <w:r>
-        <w:rPr>
-          <w:rFonts w:ascii="Consolas" w:hAnsi="Consolas"/>
-          <w:sz w:val="18"/>
-        </w:rPr>
-        <w:t xml:space="preserve">    frequency_min: 20Hz         # frequency_bands slider range, default 20 Hz</w:t>
-      </w:r>
-    </w:p>
-    <w:p>
-      <w:pPr>
-        <w:spacing w:before="0" w:after="0" w:line="240" w:lineRule="auto"/>
-        <w:ind w:left="113"/>
-        <w:shd w:val="clear" w:color="auto" w:fill="F2F2F2"/>
-      </w:pPr>
-      <w:r>
-        <w:rPr>
-          <w:rFonts w:ascii="Consolas" w:hAnsi="Consolas"/>
-          <w:sz w:val="18"/>
-        </w:rPr>
-        <w:t xml:space="preserve">    frequency_max: 16kHz        # default 16 kHz</w:t>
-      </w:r>
-    </w:p>
-    <w:p>
-      <w:pPr>
-        <w:spacing w:before="0" w:after="160" w:line="240" w:lineRule="auto"/>
-        <w:ind w:left="113"/>
-        <w:shd w:val="clear" w:color="auto" w:fill="F2F2F2"/>
-      </w:pPr>
-      <w:r>
-        <w:rPr>
-          <w:rFonts w:ascii="Consolas" w:hAnsi="Consolas"/>
-          <w:sz w:val="18"/>
-        </w:rPr>
-        <w:t xml:space="preserve">    frequency_step: 10Hz        # default 10 Hz</w:t>
-      </w:r>
-    </w:p>
-    <w:p>
-      <w:pPr>
-        <w:pStyle w:val="ListBullet"/>
-        <w:spacing w:after="60"/>
-      </w:pPr>
-      <w:r>
-        <w:t>The ranges are set once for the platform, not per band, to keep it simple for now.</w:t>
-      </w:r>
-    </w:p>
-    <w:p>
-      <w:pPr>
-        <w:pStyle w:val="ListBullet"/>
-        <w:spacing w:after="60"/>
-      </w:pPr>
-      <w:r>
-        <w:t xml:space="preserve">A 10 Hz step gives 1600 positions: fine at high frequencies, coarse in the bass (20, 30, 40 Hz). </w:t>
-      </w:r>
-      <w:r>
-        <w:rPr>
-          <w:rFonts w:ascii="Consolas" w:hAnsi="Consolas"/>
-          <w:sz w:val="20"/>
-        </w:rPr>
-        <w:t>mode: box</w:t>
-      </w:r>
-      <w:r>
-        <w:t xml:space="preserve"> lets a value be typed.</w:t>
-      </w:r>
-    </w:p>
-    <w:p>
-      <w:pPr>
-        <w:pStyle w:val="ListBullet"/>
-        <w:spacing w:after="60"/>
-      </w:pPr>
-      <w:r>
-        <w:t>If the range does not include 1000 Hz, a frequency slider starts at the nearest end of the range.</w:t>
-      </w:r>
-    </w:p>
-    <w:p>
-      <w:pPr>
-        <w:pStyle w:val="Heading1"/>
-      </w:pPr>
-      <w:r>
-        <w:t>Raw Biquads</w:t>
-      </w:r>
-    </w:p>
-    <w:p>
-      <w:r>
-        <w:t>For users who design their filters elsewhere, for example in TI PurePath Console or REW. Core writes the coefficients as given: no filter maths, so raw biquads work with option 2 and option 3 below, and on every platform, not only ESP32.</w:t>
-      </w:r>
-    </w:p>
-    <w:p>
-      <w:pPr>
-        <w:spacing w:before="0" w:after="0" w:line="240" w:lineRule="auto"/>
-        <w:ind w:left="113"/>
-        <w:shd w:val="clear" w:color="auto" w:fill="F2F2F2"/>
-      </w:pPr>
-      <w:r>
-        <w:rPr>
-          <w:rFonts w:ascii="Consolas" w:hAnsi="Consolas"/>
-          <w:sz w:val="18"/>
-        </w:rPr>
-        <w:t>audio_dac:</w:t>
-      </w:r>
-    </w:p>
-    <w:p>
-      <w:pPr>
-        <w:spacing w:before="0" w:after="0" w:line="240" w:lineRule="auto"/>
-        <w:ind w:left="113"/>
-        <w:shd w:val="clear" w:color="auto" w:fill="F2F2F2"/>
-      </w:pPr>
-      <w:r>
-        <w:rPr>
-          <w:rFonts w:ascii="Consolas" w:hAnsi="Consolas"/>
-          <w:sz w:val="18"/>
-        </w:rPr>
-        <w:t xml:space="preserve">  - platform: tas58xx</w:t>
-      </w:r>
-    </w:p>
-    <w:p>
-      <w:pPr>
-        <w:spacing w:before="0" w:after="0" w:line="240" w:lineRule="auto"/>
-        <w:ind w:left="113"/>
-        <w:shd w:val="clear" w:color="auto" w:fill="F2F2F2"/>
-      </w:pPr>
-      <w:r>
-        <w:rPr>
-          <w:rFonts w:ascii="Consolas" w:hAnsi="Consolas"/>
-          <w:sz w:val="18"/>
-        </w:rPr>
-        <w:t xml:space="preserve">    biquads:</w:t>
-      </w:r>
-    </w:p>
-    <w:p>
-      <w:pPr>
-        <w:spacing w:before="0" w:after="0" w:line="240" w:lineRule="auto"/>
-        <w:ind w:left="113"/>
-        <w:shd w:val="clear" w:color="auto" w:fill="F2F2F2"/>
-      </w:pPr>
-      <w:r>
-        <w:rPr>
-          <w:rFonts w:ascii="Consolas" w:hAnsi="Consolas"/>
-          <w:sz w:val="18"/>
-        </w:rPr>
-        <w:t xml:space="preserve">      - coefficients: [1.0012, -1.9874, 0.9867, -1.9874, 0.9879]   # b0 b1 b2 a1 a2</w:t>
-      </w:r>
-    </w:p>
-    <w:p>
-      <w:pPr>
-        <w:spacing w:before="0" w:after="0" w:line="240" w:lineRule="auto"/>
-        <w:ind w:left="113"/>
-        <w:shd w:val="clear" w:color="auto" w:fill="F2F2F2"/>
-      </w:pPr>
-      <w:r>
-        <w:rPr>
-          <w:rFonts w:ascii="Consolas" w:hAnsi="Consolas"/>
-          <w:sz w:val="18"/>
-        </w:rPr>
-        <w:t xml:space="preserve">        channel: both           # left | right | both, default both</w:t>
-      </w:r>
-    </w:p>
-    <w:p>
-      <w:pPr>
-        <w:spacing w:before="0" w:after="160" w:line="240" w:lineRule="auto"/>
-        <w:ind w:left="113"/>
-        <w:shd w:val="clear" w:color="auto" w:fill="F2F2F2"/>
-      </w:pPr>
-      <w:r>
-        <w:rPr>
-          <w:rFonts w:ascii="Consolas" w:hAnsi="Consolas"/>
-          <w:sz w:val="18"/>
-        </w:rPr>
-        <w:t xml:space="preserve">        always_on: true         # default true, as fixed filters</w:t>
-      </w:r>
-    </w:p>
-    <w:p>
-      <w:pPr>
-        <w:pStyle w:val="ListBullet"/>
-        <w:spacing w:after="60"/>
-      </w:pPr>
-      <w:r>
-        <w:rPr>
-          <w:b/>
-        </w:rPr>
-        <w:t>Coefficients must be designed for 96 kHz</w:t>
-      </w:r>
-      <w:r>
-        <w:t>, whatever the input sample rate: the TAS58xx DSP always runs at 96 kHz.</w:t>
-      </w:r>
-    </w:p>
-    <w:p>
-      <w:pPr>
-        <w:pStyle w:val="ListBullet"/>
-        <w:spacing w:after="60"/>
-      </w:pPr>
-      <w:r>
-        <w:t>Five values in the order b0, b1, b2, a1, a2, normalised so a0 = 1, using the standard sign convention (denominator 1 + a1 z^-1 + a2 z^-2). Core converts them to the DSP's 5.27 format and its sign convention.</w:t>
-      </w:r>
-    </w:p>
-    <w:p>
-      <w:pPr>
-        <w:pStyle w:val="ListBullet"/>
-        <w:spacing w:after="60"/>
-      </w:pPr>
-      <w:r>
-        <w:t>Python checks each value fits the 5.27 range (-16 to just under +16) and that the filter is stable (|a2| &lt; 1 and |a1| &lt; 1 + a2). This is validation only, not filter design.</w:t>
-      </w:r>
-    </w:p>
-    <w:p>
-      <w:pPr>
-        <w:pStyle w:val="ListBullet"/>
-        <w:spacing w:after="60"/>
-      </w:pPr>
-      <w:r>
-        <w:t>Raw biquads count towards the 15 biquads per channel and follow the EQ switch like any other entry.</w:t>
-      </w:r>
-    </w:p>
-    <w:p>
-      <w:pPr>
-        <w:pStyle w:val="ListBullet"/>
-        <w:spacing w:after="60"/>
-      </w:pPr>
-      <w:r>
-        <w:t xml:space="preserve">A public </w:t>
-      </w:r>
-      <w:r>
-        <w:rPr>
-          <w:rFonts w:ascii="Consolas" w:hAnsi="Consolas"/>
-          <w:sz w:val="20"/>
-        </w:rPr>
-        <w:t>set_biquad()</w:t>
-      </w:r>
-      <w:r>
-        <w:t xml:space="preserve"> method and a matching YAML action let an automation, a lambda or an external component change raw coefficients at runtime. New values are kept pending and written once the DSP is writable, using the same mechanism as the mixer mode.</w:t>
-      </w:r>
-    </w:p>
-    <w:p>
-      <w:pPr>
-        <w:pStyle w:val="Heading1"/>
-      </w:pPr>
-      <w:r>
-        <w:t>EQ Switch</w:t>
-      </w:r>
-    </w:p>
-    <w:tbl>
-      <w:tblPr>
-        <w:tblStyle w:val="TableGrid"/>
-        <w:tblW w:type="auto" w:w="0"/>
-        <w:jc w:val="left"/>
-        <w:tblLook w:firstColumn="1" w:firstRow="1" w:lastColumn="0" w:lastRow="0" w:noHBand="0" w:noVBand="1" w:val="04A0"/>
-      </w:tblPr>
-      <w:tblGrid>
-        <w:gridCol w:w="3024"/>
-        <w:gridCol w:w="3024"/>
-        <w:gridCol w:w="3024"/>
-      </w:tblGrid>
-      <w:tr>
-        <w:tc>
-          <w:tcPr>
-            <w:tcW w:type="dxa" w:w="3402"/>
-            <w:shd w:val="clear" w:color="auto" w:fill="D9E2F3"/>
-          </w:tcPr>
-          <w:p>
-            <w:pPr>
-              <w:spacing w:after="0"/>
-            </w:pPr>
-            <w:r>
-              <w:rPr>
-                <w:b/>
-              </w:rPr>
-            </w:r>
-          </w:p>
-        </w:tc>
-        <w:tc>
-          <w:tcPr>
-            <w:tcW w:type="dxa" w:w="2551"/>
-            <w:shd w:val="clear" w:color="auto" w:fill="D9E2F3"/>
-          </w:tcPr>
-          <w:p>
-            <w:pPr>
-              <w:spacing w:after="0"/>
-            </w:pPr>
-            <w:r>
-              <w:rPr>
-                <w:b/>
-              </w:rPr>
-              <w:t>EQ On</w:t>
-            </w:r>
-          </w:p>
-        </w:tc>
-        <w:tc>
-          <w:tcPr>
-            <w:tcW w:type="dxa" w:w="3118"/>
-            <w:shd w:val="clear" w:color="auto" w:fill="D9E2F3"/>
-          </w:tcPr>
-          <w:p>
-            <w:pPr>
-              <w:spacing w:after="0"/>
-            </w:pPr>
-            <w:r>
-              <w:rPr>
-                <w:b/>
-              </w:rPr>
-              <w:t>EQ Off</w:t>
-            </w:r>
-          </w:p>
-        </w:tc>
-      </w:tr>
-      <w:tr>
-        <w:tc>
-          <w:tcPr>
-            <w:tcW w:type="dxa" w:w="3402"/>
-          </w:tcPr>
-          <w:p>
-            <w:pPr>
-              <w:spacing w:after="0"/>
-            </w:pPr>
-            <w:r>
-              <w:rPr>
-                <w:rFonts w:ascii="Consolas" w:hAnsi="Consolas"/>
-                <w:sz w:val="20"/>
-              </w:rPr>
-              <w:t>always_on: false</w:t>
-            </w:r>
-            <w:r>
-              <w:t xml:space="preserve"> (bands default)</w:t>
-            </w:r>
-          </w:p>
-        </w:tc>
-        <w:tc>
-          <w:tcPr>
-            <w:tcW w:type="dxa" w:w="2551"/>
-          </w:tcPr>
-          <w:p>
-            <w:pPr>
-              <w:spacing w:after="0"/>
-            </w:pPr>
-            <w:r>
-              <w:t>active</w:t>
-            </w:r>
-          </w:p>
-        </w:tc>
-        <w:tc>
-          <w:tcPr>
-            <w:tcW w:type="dxa" w:w="3118"/>
-          </w:tcPr>
-          <w:p>
-            <w:pPr>
-              <w:spacing w:after="0"/>
-            </w:pPr>
-            <w:r>
-              <w:t>flat</w:t>
-            </w:r>
-          </w:p>
-        </w:tc>
-      </w:tr>
-      <w:tr>
-        <w:tc>
-          <w:tcPr>
-            <w:tcW w:type="dxa" w:w="3402"/>
-          </w:tcPr>
-          <w:p>
-            <w:pPr>
-              <w:spacing w:after="0"/>
-            </w:pPr>
-            <w:r>
-              <w:rPr>
-                <w:rFonts w:ascii="Consolas" w:hAnsi="Consolas"/>
-                <w:sz w:val="20"/>
-              </w:rPr>
-              <w:t>always_on: true</w:t>
-            </w:r>
-            <w:r>
-              <w:t xml:space="preserve"> (fixed filters and raw biquads default)</w:t>
-            </w:r>
-          </w:p>
-        </w:tc>
-        <w:tc>
-          <w:tcPr>
-            <w:tcW w:type="dxa" w:w="2551"/>
-          </w:tcPr>
-          <w:p>
-            <w:pPr>
-              <w:spacing w:after="0"/>
-            </w:pPr>
-            <w:r>
-              <w:t>active</w:t>
-            </w:r>
-          </w:p>
-        </w:tc>
-        <w:tc>
-          <w:tcPr>
-            <w:tcW w:type="dxa" w:w="3118"/>
-          </w:tcPr>
-          <w:p>
-            <w:pPr>
-              <w:spacing w:after="0"/>
-            </w:pPr>
-            <w:r>
-              <w:rPr>
-                <w:b/>
-              </w:rPr>
-              <w:t>active</w:t>
-            </w:r>
-          </w:p>
-        </w:tc>
-      </w:tr>
-    </w:tbl>
-    <w:p/>
-    <w:p>
-      <w:pPr>
-        <w:pStyle w:val="ListBullet"/>
-        <w:spacing w:after="60"/>
-      </w:pPr>
-      <w:r>
-        <w:t xml:space="preserve">How Off is done is chosen when the YAML is compiled: with no </w:t>
-      </w:r>
-      <w:r>
-        <w:rPr>
-          <w:rFonts w:ascii="Consolas" w:hAnsi="Consolas"/>
-          <w:sz w:val="20"/>
-        </w:rPr>
-        <w:t>always_on: true</w:t>
-      </w:r>
-      <w:r>
-        <w:t xml:space="preserve"> entries, the DSP bypass flag (one write, no click); otherwise the </w:t>
-      </w:r>
-      <w:r>
-        <w:rPr>
-          <w:rFonts w:ascii="Consolas" w:hAnsi="Consolas"/>
-          <w:sz w:val="20"/>
-        </w:rPr>
-        <w:t>always_on: false</w:t>
-      </w:r>
-      <w:r>
-        <w:t xml:space="preserve"> biquads are written as all pass.</w:t>
-      </w:r>
-    </w:p>
-    <w:p>
-      <w:pPr>
-        <w:pStyle w:val="ListBullet"/>
-        <w:spacing w:after="60"/>
-      </w:pPr>
-      <w:r>
-        <w:t>A gain or frequency changed while EQ is Off is kept and takes effect when EQ is turned On.</w:t>
-      </w:r>
-    </w:p>
-    <w:p>
-      <w:pPr>
-        <w:pStyle w:val="ListBullet"/>
-        <w:spacing w:after="60"/>
-      </w:pPr>
-      <w:r>
-        <w:t xml:space="preserve">The switch is required when any entry has </w:t>
-      </w:r>
-      <w:r>
-        <w:rPr>
-          <w:rFonts w:ascii="Consolas" w:hAnsi="Consolas"/>
-          <w:sz w:val="20"/>
-        </w:rPr>
-        <w:t>always_on: false</w:t>
-      </w:r>
-      <w:r>
-        <w:t>. Otherwise a warning says it is not used.</w:t>
-      </w:r>
-    </w:p>
-    <w:p>
-      <w:pPr>
-        <w:pStyle w:val="Heading1"/>
-      </w:pPr>
-      <w:r>
-        <w:t>Biquads on Each Channel</w:t>
-      </w:r>
-    </w:p>
-    <w:p>
-      <w:pPr>
-        <w:pStyle w:val="ListBullet"/>
-        <w:spacing w:after="60"/>
-      </w:pPr>
-      <w:r>
-        <w:t xml:space="preserve">An entry with </w:t>
-      </w:r>
-      <w:r>
-        <w:rPr>
-          <w:rFonts w:ascii="Consolas" w:hAnsi="Consolas"/>
-          <w:sz w:val="20"/>
-        </w:rPr>
-        <w:t>channel: both</w:t>
-      </w:r>
-      <w:r>
-        <w:t xml:space="preserve"> uses one biquad on each channel; its slider writes both.</w:t>
-      </w:r>
-    </w:p>
-    <w:p>
-      <w:pPr>
-        <w:pStyle w:val="ListBullet"/>
-        <w:spacing w:after="60"/>
-      </w:pPr>
-      <w:r>
-        <w:t>Raw biquads come first, in YAML order (their filter type is not known).</w:t>
-      </w:r>
-    </w:p>
-    <w:p>
-      <w:pPr>
-        <w:pStyle w:val="ListBullet"/>
-        <w:spacing w:after="60"/>
-      </w:pPr>
-      <w:r>
-        <w:t>Then cuts first: high pass, then low pass / notch / band pass, then shelves / equalizer / peaking. YAML order is kept within a group: fixed filters, then gain bands, then frequency bands.</w:t>
-      </w:r>
-    </w:p>
-    <w:p>
-      <w:pPr>
-        <w:pStyle w:val="ListBullet"/>
-        <w:spacing w:after="60"/>
-      </w:pPr>
-      <w:r>
-        <w:t>Raw biquads + fixed filters + gain bands + frequency bands must be 15 or fewer per channel, otherwise a config error.</w:t>
-      </w:r>
-    </w:p>
-    <w:p>
-      <w:pPr>
-        <w:pStyle w:val="ListBullet"/>
-        <w:spacing w:after="60"/>
-      </w:pPr>
-      <w:r>
-        <w:t xml:space="preserve">An entry with </w:t>
-      </w:r>
-      <w:r>
-        <w:rPr>
-          <w:rFonts w:ascii="Consolas" w:hAnsi="Consolas"/>
-          <w:sz w:val="20"/>
-        </w:rPr>
-        <w:t>channel: both</w:t>
-      </w:r>
-      <w:r>
-        <w:t xml:space="preserve"> can sit at a different biquad on each channel.</w:t>
-      </w:r>
-    </w:p>
-    <w:p>
-      <w:pPr>
-        <w:pStyle w:val="Heading1"/>
-      </w:pPr>
-      <w:r>
-        <w:t>Examples</w:t>
-      </w:r>
-    </w:p>
-    <w:p>
-      <w:pPr>
-        <w:pStyle w:val="Heading2"/>
-      </w:pPr>
-      <w:r>
-        <w:t>Stereo</w:t>
-      </w:r>
-    </w:p>
-    <w:p>
-      <w:r>
-        <w:t>Both speakers get the same EQ from one set of sliders.</w:t>
-      </w:r>
-    </w:p>
-    <w:p>
-      <w:pPr>
-        <w:spacing w:before="0" w:after="0" w:line="240" w:lineRule="auto"/>
-        <w:ind w:left="113"/>
-        <w:shd w:val="clear" w:color="auto" w:fill="F2F2F2"/>
-      </w:pPr>
-      <w:r>
-        <w:rPr>
-          <w:rFonts w:ascii="Consolas" w:hAnsi="Consolas"/>
-          <w:sz w:val="18"/>
-        </w:rPr>
-        <w:t>number:</w:t>
-      </w:r>
-    </w:p>
-    <w:p>
-      <w:pPr>
-        <w:spacing w:before="0" w:after="0" w:line="240" w:lineRule="auto"/>
-        <w:ind w:left="113"/>
-        <w:shd w:val="clear" w:color="auto" w:fill="F2F2F2"/>
-      </w:pPr>
-      <w:r>
-        <w:rPr>
-          <w:rFonts w:ascii="Consolas" w:hAnsi="Consolas"/>
-          <w:sz w:val="18"/>
-        </w:rPr>
-        <w:t xml:space="preserve">  - platform: tas58xx</w:t>
-      </w:r>
-    </w:p>
-    <w:p>
-      <w:pPr>
-        <w:spacing w:before="0" w:after="0" w:line="240" w:lineRule="auto"/>
-        <w:ind w:left="113"/>
-        <w:shd w:val="clear" w:color="auto" w:fill="F2F2F2"/>
-      </w:pPr>
-      <w:r>
-        <w:rPr>
-          <w:rFonts w:ascii="Consolas" w:hAnsi="Consolas"/>
-          <w:sz w:val="18"/>
-        </w:rPr>
-        <w:t xml:space="preserve">    gain_bands:                 # channel: both is the default</w:t>
-      </w:r>
-    </w:p>
-    <w:p>
-      <w:pPr>
-        <w:spacing w:before="0" w:after="0" w:line="240" w:lineRule="auto"/>
-        <w:ind w:left="113"/>
-        <w:shd w:val="clear" w:color="auto" w:fill="F2F2F2"/>
-      </w:pPr>
-      <w:r>
-        <w:rPr>
-          <w:rFonts w:ascii="Consolas" w:hAnsi="Consolas"/>
-          <w:sz w:val="18"/>
-        </w:rPr>
-        <w:t xml:space="preserve">      - name: 25Hz</w:t>
-      </w:r>
-    </w:p>
-    <w:p>
-      <w:pPr>
-        <w:spacing w:before="0" w:after="0" w:line="240" w:lineRule="auto"/>
-        <w:ind w:left="113"/>
-        <w:shd w:val="clear" w:color="auto" w:fill="F2F2F2"/>
-      </w:pPr>
-      <w:r>
-        <w:rPr>
-          <w:rFonts w:ascii="Consolas" w:hAnsi="Consolas"/>
-          <w:sz w:val="18"/>
-        </w:rPr>
-        <w:t xml:space="preserve">        frequency: 25Hz</w:t>
-      </w:r>
-    </w:p>
-    <w:p>
-      <w:pPr>
-        <w:spacing w:before="0" w:after="0" w:line="240" w:lineRule="auto"/>
-        <w:ind w:left="113"/>
-        <w:shd w:val="clear" w:color="auto" w:fill="F2F2F2"/>
-      </w:pPr>
-      <w:r>
-        <w:rPr>
-          <w:rFonts w:ascii="Consolas" w:hAnsi="Consolas"/>
-          <w:sz w:val="18"/>
-        </w:rPr>
-        <w:t xml:space="preserve">      # ... ISO 2/3-octave centres ...</w:t>
-      </w:r>
-    </w:p>
-    <w:p>
-      <w:pPr>
-        <w:spacing w:before="0" w:after="0" w:line="240" w:lineRule="auto"/>
-        <w:ind w:left="113"/>
-        <w:shd w:val="clear" w:color="auto" w:fill="F2F2F2"/>
-      </w:pPr>
-      <w:r>
-        <w:rPr>
-          <w:rFonts w:ascii="Consolas" w:hAnsi="Consolas"/>
-          <w:sz w:val="18"/>
-        </w:rPr>
-        <w:t xml:space="preserve">      - name: 16kHz</w:t>
-      </w:r>
-    </w:p>
-    <w:p>
-      <w:pPr>
-        <w:spacing w:before="0" w:after="160" w:line="240" w:lineRule="auto"/>
-        <w:ind w:left="113"/>
-        <w:shd w:val="clear" w:color="auto" w:fill="F2F2F2"/>
-      </w:pPr>
-      <w:r>
-        <w:rPr>
-          <w:rFonts w:ascii="Consolas" w:hAnsi="Consolas"/>
-          <w:sz w:val="18"/>
-        </w:rPr>
-        <w:t xml:space="preserve">        frequency: 16kHz</w:t>
-      </w:r>
-    </w:p>
-    <w:p>
-      <w:pPr>
-        <w:pStyle w:val="Heading2"/>
-      </w:pPr>
-      <w:r>
-        <w:t>Bi-amp (woofer left, tweeter right)</w:t>
-      </w:r>
-    </w:p>
-    <w:p>
-      <w:r>
-        <w:t xml:space="preserve">The crossover is made of fixed filters, two Butterworth biquads per side (Linkwitz-Riley 24 dB/octave). With </w:t>
-      </w:r>
-      <w:r>
-        <w:rPr>
-          <w:rFonts w:ascii="Consolas" w:hAnsi="Consolas"/>
-          <w:sz w:val="20"/>
-        </w:rPr>
-        <w:t>always_on: true</w:t>
-      </w:r>
-      <w:r>
-        <w:t xml:space="preserve"> (the default) it stays in place when EQ is Off, so the tweeter never gets full range (v1 needed a warning for this).</w:t>
-      </w:r>
-    </w:p>
-    <w:p>
-      <w:pPr>
-        <w:spacing w:before="0" w:after="0" w:line="240" w:lineRule="auto"/>
-        <w:ind w:left="113"/>
-        <w:shd w:val="clear" w:color="auto" w:fill="F2F2F2"/>
-      </w:pPr>
-      <w:r>
-        <w:rPr>
-          <w:rFonts w:ascii="Consolas" w:hAnsi="Consolas"/>
-          <w:sz w:val="18"/>
-        </w:rPr>
-        <w:t>audio_dac:</w:t>
-      </w:r>
-    </w:p>
-    <w:p>
-      <w:pPr>
-        <w:spacing w:before="0" w:after="0" w:line="240" w:lineRule="auto"/>
-        <w:ind w:left="113"/>
-        <w:shd w:val="clear" w:color="auto" w:fill="F2F2F2"/>
-      </w:pPr>
-      <w:r>
-        <w:rPr>
-          <w:rFonts w:ascii="Consolas" w:hAnsi="Consolas"/>
-          <w:sz w:val="18"/>
-        </w:rPr>
-        <w:t xml:space="preserve">  - platform: tas58xx</w:t>
-      </w:r>
-    </w:p>
-    <w:p>
-      <w:pPr>
-        <w:spacing w:before="0" w:after="0" w:line="240" w:lineRule="auto"/>
-        <w:ind w:left="113"/>
-        <w:shd w:val="clear" w:color="auto" w:fill="F2F2F2"/>
-      </w:pPr>
-      <w:r>
-        <w:rPr>
-          <w:rFonts w:ascii="Consolas" w:hAnsi="Consolas"/>
-          <w:sz w:val="18"/>
-        </w:rPr>
-        <w:t xml:space="preserve">    fixed_filters:</w:t>
-      </w:r>
-    </w:p>
-    <w:p>
-      <w:pPr>
-        <w:spacing w:before="0" w:after="0" w:line="240" w:lineRule="auto"/>
-        <w:ind w:left="113"/>
-        <w:shd w:val="clear" w:color="auto" w:fill="F2F2F2"/>
-      </w:pPr>
-      <w:r>
-        <w:rPr>
-          <w:rFonts w:ascii="Consolas" w:hAnsi="Consolas"/>
-          <w:sz w:val="18"/>
-        </w:rPr>
-        <w:t xml:space="preserve">      - {eq_filter: low_pass, frequency: 2kHz, channel: left}</w:t>
-      </w:r>
-    </w:p>
-    <w:p>
-      <w:pPr>
-        <w:spacing w:before="0" w:after="0" w:line="240" w:lineRule="auto"/>
-        <w:ind w:left="113"/>
-        <w:shd w:val="clear" w:color="auto" w:fill="F2F2F2"/>
-      </w:pPr>
-      <w:r>
-        <w:rPr>
-          <w:rFonts w:ascii="Consolas" w:hAnsi="Consolas"/>
-          <w:sz w:val="18"/>
-        </w:rPr>
-        <w:t xml:space="preserve">      - {eq_filter: low_pass, frequency: 2kHz, channel: left}</w:t>
-      </w:r>
-    </w:p>
-    <w:p>
-      <w:pPr>
-        <w:spacing w:before="0" w:after="0" w:line="240" w:lineRule="auto"/>
-        <w:ind w:left="113"/>
-        <w:shd w:val="clear" w:color="auto" w:fill="F2F2F2"/>
-      </w:pPr>
-      <w:r>
-        <w:rPr>
-          <w:rFonts w:ascii="Consolas" w:hAnsi="Consolas"/>
-          <w:sz w:val="18"/>
-        </w:rPr>
-        <w:t xml:space="preserve">      - {eq_filter: high_pass, frequency: 2kHz, channel: right}</w:t>
-      </w:r>
-    </w:p>
-    <w:p>
-      <w:pPr>
-        <w:spacing w:before="0" w:after="0" w:line="240" w:lineRule="auto"/>
-        <w:ind w:left="113"/>
-        <w:shd w:val="clear" w:color="auto" w:fill="F2F2F2"/>
-      </w:pPr>
-      <w:r>
-        <w:rPr>
-          <w:rFonts w:ascii="Consolas" w:hAnsi="Consolas"/>
-          <w:sz w:val="18"/>
-        </w:rPr>
-        <w:t xml:space="preserve">      - {eq_filter: high_pass, frequency: 2kHz, channel: right}</w:t>
-      </w:r>
-    </w:p>
-    <w:p>
-      <w:pPr>
-        <w:spacing w:before="0" w:after="0" w:line="240" w:lineRule="auto"/>
-        <w:ind w:left="113"/>
-        <w:shd w:val="clear" w:color="auto" w:fill="F2F2F2"/>
-      </w:pPr>
-      <w:r>
-        <w:rPr>
-          <w:rFonts w:ascii="Consolas" w:hAnsi="Consolas"/>
-          <w:sz w:val="18"/>
-        </w:rPr>
-        <w:t xml:space="preserve"> </w:t>
-      </w:r>
-    </w:p>
-    <w:p>
-      <w:pPr>
-        <w:spacing w:before="0" w:after="0" w:line="240" w:lineRule="auto"/>
-        <w:ind w:left="113"/>
-        <w:shd w:val="clear" w:color="auto" w:fill="F2F2F2"/>
-      </w:pPr>
-      <w:r>
-        <w:rPr>
-          <w:rFonts w:ascii="Consolas" w:hAnsi="Consolas"/>
-          <w:sz w:val="18"/>
-        </w:rPr>
-        <w:t>number:</w:t>
-      </w:r>
-    </w:p>
-    <w:p>
-      <w:pPr>
-        <w:spacing w:before="0" w:after="0" w:line="240" w:lineRule="auto"/>
-        <w:ind w:left="113"/>
-        <w:shd w:val="clear" w:color="auto" w:fill="F2F2F2"/>
-      </w:pPr>
-      <w:r>
-        <w:rPr>
-          <w:rFonts w:ascii="Consolas" w:hAnsi="Consolas"/>
-          <w:sz w:val="18"/>
-        </w:rPr>
-        <w:t xml:space="preserve">  - platform: tas58xx</w:t>
-      </w:r>
-    </w:p>
-    <w:p>
-      <w:pPr>
-        <w:spacing w:before="0" w:after="0" w:line="240" w:lineRule="auto"/>
-        <w:ind w:left="113"/>
-        <w:shd w:val="clear" w:color="auto" w:fill="F2F2F2"/>
-      </w:pPr>
-      <w:r>
-        <w:rPr>
-          <w:rFonts w:ascii="Consolas" w:hAnsi="Consolas"/>
-          <w:sz w:val="18"/>
-        </w:rPr>
-        <w:t xml:space="preserve">    gain_bands:                 # tone for the whole speaker</w:t>
-      </w:r>
-    </w:p>
-    <w:p>
-      <w:pPr>
-        <w:spacing w:before="0" w:after="0" w:line="240" w:lineRule="auto"/>
-        <w:ind w:left="113"/>
-        <w:shd w:val="clear" w:color="auto" w:fill="F2F2F2"/>
-      </w:pPr>
-      <w:r>
-        <w:rPr>
-          <w:rFonts w:ascii="Consolas" w:hAnsi="Consolas"/>
-          <w:sz w:val="18"/>
-        </w:rPr>
-        <w:t xml:space="preserve">      - name: Bass</w:t>
-      </w:r>
-    </w:p>
-    <w:p>
-      <w:pPr>
-        <w:spacing w:before="0" w:after="0" w:line="240" w:lineRule="auto"/>
-        <w:ind w:left="113"/>
-        <w:shd w:val="clear" w:color="auto" w:fill="F2F2F2"/>
-      </w:pPr>
-      <w:r>
-        <w:rPr>
-          <w:rFonts w:ascii="Consolas" w:hAnsi="Consolas"/>
-          <w:sz w:val="18"/>
-        </w:rPr>
-        <w:t xml:space="preserve">        eq_filter: low_shelf</w:t>
-      </w:r>
-    </w:p>
-    <w:p>
-      <w:pPr>
-        <w:spacing w:before="0" w:after="0" w:line="240" w:lineRule="auto"/>
-        <w:ind w:left="113"/>
-        <w:shd w:val="clear" w:color="auto" w:fill="F2F2F2"/>
-      </w:pPr>
-      <w:r>
-        <w:rPr>
-          <w:rFonts w:ascii="Consolas" w:hAnsi="Consolas"/>
-          <w:sz w:val="18"/>
-        </w:rPr>
-        <w:t xml:space="preserve">        frequency: 100Hz</w:t>
-      </w:r>
-    </w:p>
-    <w:p>
-      <w:pPr>
-        <w:spacing w:before="0" w:after="0" w:line="240" w:lineRule="auto"/>
-        <w:ind w:left="113"/>
-        <w:shd w:val="clear" w:color="auto" w:fill="F2F2F2"/>
-      </w:pPr>
-      <w:r>
-        <w:rPr>
-          <w:rFonts w:ascii="Consolas" w:hAnsi="Consolas"/>
-          <w:sz w:val="18"/>
-        </w:rPr>
-        <w:t xml:space="preserve">      - name: Treble</w:t>
-      </w:r>
-    </w:p>
-    <w:p>
-      <w:pPr>
-        <w:spacing w:before="0" w:after="0" w:line="240" w:lineRule="auto"/>
-        <w:ind w:left="113"/>
-        <w:shd w:val="clear" w:color="auto" w:fill="F2F2F2"/>
-      </w:pPr>
-      <w:r>
-        <w:rPr>
-          <w:rFonts w:ascii="Consolas" w:hAnsi="Consolas"/>
-          <w:sz w:val="18"/>
-        </w:rPr>
-        <w:t xml:space="preserve">        eq_filter: high_shelf</w:t>
-      </w:r>
-    </w:p>
-    <w:p>
-      <w:pPr>
-        <w:spacing w:before="0" w:after="0" w:line="240" w:lineRule="auto"/>
-        <w:ind w:left="113"/>
-        <w:shd w:val="clear" w:color="auto" w:fill="F2F2F2"/>
-      </w:pPr>
-      <w:r>
-        <w:rPr>
-          <w:rFonts w:ascii="Consolas" w:hAnsi="Consolas"/>
-          <w:sz w:val="18"/>
-        </w:rPr>
-        <w:t xml:space="preserve">        frequency: 8kHz</w:t>
-      </w:r>
-    </w:p>
-    <w:p>
-      <w:pPr>
-        <w:spacing w:before="0" w:after="0" w:line="240" w:lineRule="auto"/>
-        <w:ind w:left="113"/>
-        <w:shd w:val="clear" w:color="auto" w:fill="F2F2F2"/>
-      </w:pPr>
-      <w:r>
-        <w:rPr>
-          <w:rFonts w:ascii="Consolas" w:hAnsi="Consolas"/>
-          <w:sz w:val="18"/>
-        </w:rPr>
-        <w:t xml:space="preserve">      - name: Woofer 300Hz</w:t>
-      </w:r>
-    </w:p>
-    <w:p>
-      <w:pPr>
-        <w:spacing w:before="0" w:after="0" w:line="240" w:lineRule="auto"/>
-        <w:ind w:left="113"/>
-        <w:shd w:val="clear" w:color="auto" w:fill="F2F2F2"/>
-      </w:pPr>
-      <w:r>
-        <w:rPr>
-          <w:rFonts w:ascii="Consolas" w:hAnsi="Consolas"/>
-          <w:sz w:val="18"/>
-        </w:rPr>
-        <w:t xml:space="preserve">        frequency: 300Hz</w:t>
-      </w:r>
-    </w:p>
-    <w:p>
-      <w:pPr>
-        <w:spacing w:before="0" w:after="0" w:line="240" w:lineRule="auto"/>
-        <w:ind w:left="113"/>
-        <w:shd w:val="clear" w:color="auto" w:fill="F2F2F2"/>
-      </w:pPr>
-      <w:r>
-        <w:rPr>
-          <w:rFonts w:ascii="Consolas" w:hAnsi="Consolas"/>
-          <w:sz w:val="18"/>
-        </w:rPr>
-        <w:t xml:space="preserve">        channel: left</w:t>
-      </w:r>
-    </w:p>
-    <w:p>
-      <w:pPr>
-        <w:spacing w:before="0" w:after="0" w:line="240" w:lineRule="auto"/>
-        <w:ind w:left="113"/>
-        <w:shd w:val="clear" w:color="auto" w:fill="F2F2F2"/>
-      </w:pPr>
-      <w:r>
-        <w:rPr>
-          <w:rFonts w:ascii="Consolas" w:hAnsi="Consolas"/>
-          <w:sz w:val="18"/>
-        </w:rPr>
-        <w:t xml:space="preserve">      - name: Tweeter 5kHz</w:t>
-      </w:r>
-    </w:p>
-    <w:p>
-      <w:pPr>
-        <w:spacing w:before="0" w:after="0" w:line="240" w:lineRule="auto"/>
-        <w:ind w:left="113"/>
-        <w:shd w:val="clear" w:color="auto" w:fill="F2F2F2"/>
-      </w:pPr>
-      <w:r>
-        <w:rPr>
-          <w:rFonts w:ascii="Consolas" w:hAnsi="Consolas"/>
-          <w:sz w:val="18"/>
-        </w:rPr>
-        <w:t xml:space="preserve">        frequency: 5kHz</w:t>
-      </w:r>
-    </w:p>
-    <w:p>
-      <w:pPr>
-        <w:spacing w:before="0" w:after="160" w:line="240" w:lineRule="auto"/>
-        <w:ind w:left="113"/>
-        <w:shd w:val="clear" w:color="auto" w:fill="F2F2F2"/>
-      </w:pPr>
-      <w:r>
-        <w:rPr>
-          <w:rFonts w:ascii="Consolas" w:hAnsi="Consolas"/>
-          <w:sz w:val="18"/>
-        </w:rPr>
-        <w:t xml:space="preserve">        channel: right</w:t>
-      </w:r>
-    </w:p>
-    <w:tbl>
-      <w:tblPr>
-        <w:tblStyle w:val="TableGrid"/>
-        <w:tblW w:type="auto" w:w="0"/>
-        <w:jc w:val="left"/>
-        <w:tblLook w:firstColumn="1" w:firstRow="1" w:lastColumn="0" w:lastRow="0" w:noHBand="0" w:noVBand="1" w:val="04A0"/>
-      </w:tblPr>
-      <w:tblGrid>
-        <w:gridCol w:w="3024"/>
-        <w:gridCol w:w="3024"/>
-        <w:gridCol w:w="3024"/>
-      </w:tblGrid>
-      <w:tr>
-        <w:tc>
-          <w:tcPr>
-            <w:tcW w:type="dxa" w:w="1417"/>
-            <w:shd w:val="clear" w:color="auto" w:fill="D9E2F3"/>
-          </w:tcPr>
-          <w:p>
-            <w:pPr>
-              <w:spacing w:after="0"/>
-            </w:pPr>
-            <w:r>
-              <w:rPr>
-                <w:b/>
-              </w:rPr>
-              <w:t>Biquad</w:t>
-            </w:r>
-          </w:p>
-        </w:tc>
-        <w:tc>
-          <w:tcPr>
-            <w:tcW w:type="dxa" w:w="3827"/>
-            <w:shd w:val="clear" w:color="auto" w:fill="D9E2F3"/>
-          </w:tcPr>
-          <w:p>
-            <w:pPr>
-              <w:spacing w:after="0"/>
-            </w:pPr>
-            <w:r>
-              <w:rPr>
-                <w:b/>
-              </w:rPr>
-              <w:t>Left (woofer)</w:t>
-            </w:r>
-          </w:p>
-        </w:tc>
-        <w:tc>
-          <w:tcPr>
-            <w:tcW w:type="dxa" w:w="3827"/>
-            <w:shd w:val="clear" w:color="auto" w:fill="D9E2F3"/>
-          </w:tcPr>
-          <w:p>
-            <w:pPr>
-              <w:spacing w:after="0"/>
-            </w:pPr>
-            <w:r>
-              <w:rPr>
-                <w:b/>
-              </w:rPr>
-              <w:t>Right (tweeter)</w:t>
-            </w:r>
-          </w:p>
-        </w:tc>
-      </w:tr>
-      <w:tr>
-        <w:tc>
-          <w:tcPr>
-            <w:tcW w:type="dxa" w:w="1417"/>
-          </w:tcPr>
-          <w:p>
-            <w:pPr>
-              <w:spacing w:after="0"/>
-            </w:pPr>
-            <w:r>
-              <w:t>1</w:t>
-            </w:r>
-          </w:p>
-        </w:tc>
-        <w:tc>
-          <w:tcPr>
-            <w:tcW w:type="dxa" w:w="3827"/>
-          </w:tcPr>
-          <w:p>
-            <w:pPr>
-              <w:spacing w:after="0"/>
-            </w:pPr>
-            <w:r>
-              <w:t>LP 2 kHz</w:t>
-            </w:r>
-          </w:p>
-        </w:tc>
-        <w:tc>
-          <w:tcPr>
-            <w:tcW w:type="dxa" w:w="3827"/>
-          </w:tcPr>
-          <w:p>
-            <w:pPr>
-              <w:spacing w:after="0"/>
-            </w:pPr>
-            <w:r>
-              <w:t>HP 2 kHz</w:t>
-            </w:r>
-          </w:p>
-        </w:tc>
-      </w:tr>
-      <w:tr>
-        <w:tc>
-          <w:tcPr>
-            <w:tcW w:type="dxa" w:w="1417"/>
-          </w:tcPr>
-          <w:p>
-            <w:pPr>
-              <w:spacing w:after="0"/>
-            </w:pPr>
-            <w:r>
-              <w:t>2</w:t>
-            </w:r>
-          </w:p>
-        </w:tc>
-        <w:tc>
-          <w:tcPr>
-            <w:tcW w:type="dxa" w:w="3827"/>
-          </w:tcPr>
-          <w:p>
-            <w:pPr>
-              <w:spacing w:after="0"/>
-            </w:pPr>
-            <w:r>
-              <w:t>LP 2 kHz</w:t>
-            </w:r>
-          </w:p>
-        </w:tc>
-        <w:tc>
-          <w:tcPr>
-            <w:tcW w:type="dxa" w:w="3827"/>
-          </w:tcPr>
-          <w:p>
-            <w:pPr>
-              <w:spacing w:after="0"/>
-            </w:pPr>
-            <w:r>
-              <w:t>HP 2 kHz</w:t>
-            </w:r>
-          </w:p>
-        </w:tc>
-      </w:tr>
-      <w:tr>
-        <w:tc>
-          <w:tcPr>
-            <w:tcW w:type="dxa" w:w="1417"/>
-          </w:tcPr>
-          <w:p>
-            <w:pPr>
-              <w:spacing w:after="0"/>
-            </w:pPr>
-            <w:r>
-              <w:t>3</w:t>
-            </w:r>
-          </w:p>
-        </w:tc>
-        <w:tc>
-          <w:tcPr>
-            <w:tcW w:type="dxa" w:w="3827"/>
-          </w:tcPr>
-          <w:p>
-            <w:pPr>
-              <w:spacing w:after="0"/>
-            </w:pPr>
-            <w:r>
-              <w:t>Bass</w:t>
-            </w:r>
-          </w:p>
-        </w:tc>
-        <w:tc>
-          <w:tcPr>
-            <w:tcW w:type="dxa" w:w="3827"/>
-          </w:tcPr>
-          <w:p>
-            <w:pPr>
-              <w:spacing w:after="0"/>
-            </w:pPr>
-            <w:r>
-              <w:t>Bass</w:t>
-            </w:r>
-          </w:p>
-        </w:tc>
-      </w:tr>
-      <w:tr>
-        <w:tc>
-          <w:tcPr>
-            <w:tcW w:type="dxa" w:w="1417"/>
-          </w:tcPr>
-          <w:p>
-            <w:pPr>
-              <w:spacing w:after="0"/>
-            </w:pPr>
-            <w:r>
-              <w:t>4</w:t>
-            </w:r>
-          </w:p>
-        </w:tc>
-        <w:tc>
-          <w:tcPr>
-            <w:tcW w:type="dxa" w:w="3827"/>
-          </w:tcPr>
-          <w:p>
-            <w:pPr>
-              <w:spacing w:after="0"/>
-            </w:pPr>
-            <w:r>
-              <w:t>Treble</w:t>
-            </w:r>
-          </w:p>
-        </w:tc>
-        <w:tc>
-          <w:tcPr>
-            <w:tcW w:type="dxa" w:w="3827"/>
-          </w:tcPr>
-          <w:p>
-            <w:pPr>
-              <w:spacing w:after="0"/>
-            </w:pPr>
-            <w:r>
-              <w:t>Treble</w:t>
-            </w:r>
-          </w:p>
-        </w:tc>
-      </w:tr>
-      <w:tr>
-        <w:tc>
-          <w:tcPr>
-            <w:tcW w:type="dxa" w:w="1417"/>
-          </w:tcPr>
-          <w:p>
-            <w:pPr>
-              <w:spacing w:after="0"/>
-            </w:pPr>
-            <w:r>
-              <w:t>5</w:t>
-            </w:r>
-          </w:p>
-        </w:tc>
-        <w:tc>
-          <w:tcPr>
-            <w:tcW w:type="dxa" w:w="3827"/>
-          </w:tcPr>
-          <w:p>
-            <w:pPr>
-              <w:spacing w:after="0"/>
-            </w:pPr>
-            <w:r>
-              <w:t>Woofer 300Hz</w:t>
-            </w:r>
-          </w:p>
-        </w:tc>
-        <w:tc>
-          <w:tcPr>
-            <w:tcW w:type="dxa" w:w="3827"/>
-          </w:tcPr>
-          <w:p>
-            <w:pPr>
-              <w:spacing w:after="0"/>
-            </w:pPr>
-            <w:r>
-              <w:t>Tweeter 5kHz</w:t>
-            </w:r>
-          </w:p>
-        </w:tc>
-      </w:tr>
-    </w:tbl>
-    <w:p/>
-    <w:p>
-      <w:pPr>
-        <w:pStyle w:val="Heading2"/>
-      </w:pPr>
-      <w:r>
-        <w:t>Adjustable subwoofer cut-off</w:t>
-      </w:r>
-    </w:p>
-    <w:p>
-      <w:pPr>
-        <w:spacing w:before="0" w:after="0" w:line="240" w:lineRule="auto"/>
-        <w:ind w:left="113"/>
-        <w:shd w:val="clear" w:color="auto" w:fill="F2F2F2"/>
-      </w:pPr>
-      <w:r>
-        <w:rPr>
-          <w:rFonts w:ascii="Consolas" w:hAnsi="Consolas"/>
-          <w:sz w:val="18"/>
-        </w:rPr>
-        <w:t>number:</w:t>
-      </w:r>
-    </w:p>
-    <w:p>
-      <w:pPr>
-        <w:spacing w:before="0" w:after="0" w:line="240" w:lineRule="auto"/>
-        <w:ind w:left="113"/>
-        <w:shd w:val="clear" w:color="auto" w:fill="F2F2F2"/>
-      </w:pPr>
-      <w:r>
-        <w:rPr>
-          <w:rFonts w:ascii="Consolas" w:hAnsi="Consolas"/>
-          <w:sz w:val="18"/>
-        </w:rPr>
-        <w:t xml:space="preserve">  - platform: tas58xx</w:t>
-      </w:r>
-    </w:p>
-    <w:p>
-      <w:pPr>
-        <w:spacing w:before="0" w:after="0" w:line="240" w:lineRule="auto"/>
-        <w:ind w:left="113"/>
-        <w:shd w:val="clear" w:color="auto" w:fill="F2F2F2"/>
-      </w:pPr>
-      <w:r>
-        <w:rPr>
-          <w:rFonts w:ascii="Consolas" w:hAnsi="Consolas"/>
-          <w:sz w:val="18"/>
-        </w:rPr>
-        <w:t xml:space="preserve">    frequency_bands:</w:t>
-      </w:r>
-    </w:p>
-    <w:p>
-      <w:pPr>
-        <w:spacing w:before="0" w:after="0" w:line="240" w:lineRule="auto"/>
-        <w:ind w:left="113"/>
-        <w:shd w:val="clear" w:color="auto" w:fill="F2F2F2"/>
-      </w:pPr>
-      <w:r>
-        <w:rPr>
-          <w:rFonts w:ascii="Consolas" w:hAnsi="Consolas"/>
-          <w:sz w:val="18"/>
-        </w:rPr>
-        <w:t xml:space="preserve">      - name: Sub cut-off</w:t>
-      </w:r>
-    </w:p>
-    <w:p>
-      <w:pPr>
-        <w:spacing w:before="0" w:after="0" w:line="240" w:lineRule="auto"/>
-        <w:ind w:left="113"/>
-        <w:shd w:val="clear" w:color="auto" w:fill="F2F2F2"/>
-      </w:pPr>
-      <w:r>
-        <w:rPr>
-          <w:rFonts w:ascii="Consolas" w:hAnsi="Consolas"/>
-          <w:sz w:val="18"/>
-        </w:rPr>
-        <w:t xml:space="preserve">        eq_filter: low_pass</w:t>
-      </w:r>
-    </w:p>
-    <w:p>
-      <w:pPr>
-        <w:spacing w:before="0" w:after="160" w:line="240" w:lineRule="auto"/>
-        <w:ind w:left="113"/>
-        <w:shd w:val="clear" w:color="auto" w:fill="F2F2F2"/>
-      </w:pPr>
-      <w:r>
-        <w:rPr>
-          <w:rFonts w:ascii="Consolas" w:hAnsi="Consolas"/>
-          <w:sz w:val="18"/>
-        </w:rPr>
-        <w:t xml:space="preserve">        always_on: true         # stays in place when EQ is Off</w:t>
-      </w:r>
-    </w:p>
-    <w:p>
-      <w:pPr>
-        <w:pStyle w:val="Heading1"/>
-      </w:pPr>
-      <w:r>
-        <w:t>PBTL</w:t>
-      </w:r>
-    </w:p>
-    <w:p>
-      <w:r>
-        <w:t xml:space="preserve">Only the left channel is output, so </w:t>
-      </w:r>
-      <w:r>
-        <w:rPr>
-          <w:rFonts w:ascii="Consolas" w:hAnsi="Consolas"/>
-          <w:sz w:val="20"/>
-        </w:rPr>
-        <w:t>channel: both</w:t>
-      </w:r>
-      <w:r>
-        <w:t xml:space="preserve"> applies to the left. </w:t>
-      </w:r>
-      <w:r>
-        <w:rPr>
-          <w:rFonts w:ascii="Consolas" w:hAnsi="Consolas"/>
-          <w:sz w:val="20"/>
-        </w:rPr>
-        <w:t>channel: right</w:t>
-      </w:r>
-      <w:r>
-        <w:t xml:space="preserve"> is a config error.</w:t>
-      </w:r>
-    </w:p>
-    <w:p>
-      <w:pPr>
-        <w:pStyle w:val="Heading1"/>
-      </w:pPr>
-      <w:r>
-        <w:t>Breaking Changes (from the fork)</w:t>
-      </w:r>
-    </w:p>
-    <w:p>
-      <w:pPr>
-        <w:pStyle w:val="ListBullet"/>
-        <w:spacing w:after="60"/>
-      </w:pPr>
-      <w:r>
-        <w:rPr>
-          <w:rFonts w:ascii="Consolas" w:hAnsi="Consolas"/>
-          <w:sz w:val="20"/>
-        </w:rPr>
-        <w:t>eq_mode</w:t>
-      </w:r>
-      <w:r>
-        <w:t xml:space="preserve"> moves from </w:t>
-      </w:r>
-      <w:r>
-        <w:rPr>
-          <w:rFonts w:ascii="Consolas" w:hAnsi="Consolas"/>
-          <w:sz w:val="20"/>
-        </w:rPr>
-        <w:t>select:</w:t>
-      </w:r>
-      <w:r>
-        <w:t xml:space="preserve"> to </w:t>
-      </w:r>
-      <w:r>
-        <w:rPr>
-          <w:rFonts w:ascii="Consolas" w:hAnsi="Consolas"/>
-          <w:sz w:val="20"/>
-        </w:rPr>
-        <w:t>switch:</w:t>
-      </w:r>
-      <w:r>
-        <w:t xml:space="preserve"> and only has On and Off.</w:t>
-      </w:r>
-    </w:p>
-    <w:p>
-      <w:pPr>
-        <w:pStyle w:val="ListBullet"/>
-        <w:spacing w:after="60"/>
-      </w:pPr>
-      <w:r>
-        <w:t xml:space="preserve">Number EQ bands become </w:t>
-      </w:r>
-      <w:r>
-        <w:rPr>
-          <w:rFonts w:ascii="Consolas" w:hAnsi="Consolas"/>
-          <w:sz w:val="20"/>
-        </w:rPr>
-        <w:t>gain_bands</w:t>
-      </w:r>
-      <w:r>
-        <w:t xml:space="preserve"> with a </w:t>
-      </w:r>
-      <w:r>
-        <w:rPr>
-          <w:rFonts w:ascii="Consolas" w:hAnsi="Consolas"/>
-          <w:sz w:val="20"/>
-        </w:rPr>
-        <w:t>channel</w:t>
-      </w:r>
-      <w:r>
-        <w:t xml:space="preserve"> option.</w:t>
-      </w:r>
-    </w:p>
-    <w:p>
-      <w:pPr>
-        <w:pStyle w:val="ListBullet"/>
-        <w:spacing w:after="60"/>
-      </w:pPr>
-      <w:r>
-        <w:rPr>
-          <w:rFonts w:ascii="Consolas" w:hAnsi="Consolas"/>
-          <w:sz w:val="20"/>
-        </w:rPr>
-        <w:t>left_fixed_filters</w:t>
-      </w:r>
-      <w:r>
-        <w:t xml:space="preserve"> / </w:t>
-      </w:r>
-      <w:r>
-        <w:rPr>
-          <w:rFonts w:ascii="Consolas" w:hAnsi="Consolas"/>
-          <w:sz w:val="20"/>
-        </w:rPr>
-        <w:t>right_fixed_filters</w:t>
-      </w:r>
-      <w:r>
-        <w:t xml:space="preserve"> become </w:t>
-      </w:r>
-      <w:r>
-        <w:rPr>
-          <w:rFonts w:ascii="Consolas" w:hAnsi="Consolas"/>
-          <w:sz w:val="20"/>
-        </w:rPr>
-        <w:t>fixed_filters</w:t>
-      </w:r>
-      <w:r>
-        <w:t xml:space="preserve"> with a </w:t>
-      </w:r>
-      <w:r>
-        <w:rPr>
-          <w:rFonts w:ascii="Consolas" w:hAnsi="Consolas"/>
-          <w:sz w:val="20"/>
-        </w:rPr>
-        <w:t>channel</w:t>
-      </w:r>
-      <w:r>
-        <w:t xml:space="preserve"> option.</w:t>
-      </w:r>
-    </w:p>
-    <w:p>
-      <w:pPr>
-        <w:pStyle w:val="ListBullet"/>
-        <w:spacing w:after="60"/>
-      </w:pPr>
-      <w:r>
-        <w:t>EQ presets are removed. A crossover preset can be built from fixed filters.</w:t>
-      </w:r>
-    </w:p>
-    <w:p>
-      <w:pPr>
-        <w:pStyle w:val="ListBullet"/>
-        <w:spacing w:after="60"/>
-      </w:pPr>
-      <w:r>
-        <w:t xml:space="preserve">Fixed filters now stay active when EQ is Off unless they have </w:t>
-      </w:r>
-      <w:r>
-        <w:rPr>
-          <w:rFonts w:ascii="Consolas" w:hAnsi="Consolas"/>
-          <w:sz w:val="20"/>
-        </w:rPr>
-        <w:t>always_on: false</w:t>
-      </w:r>
-      <w:r>
-        <w:t>.</w:t>
-      </w:r>
-    </w:p>
-    <w:p>
-      <w:pPr>
-        <w:pStyle w:val="ListBullet"/>
-        <w:spacing w:after="60"/>
-      </w:pPr>
-      <w:r>
-        <w:t>The saved EQ mode is reset once after updating.</w:t>
-      </w:r>
-    </w:p>
-    <w:p>
-      <w:pPr>
-        <w:pStyle w:val="Heading1"/>
-      </w:pPr>
-      <w:r>
-        <w:t>YAML Format Notes</w:t>
-      </w:r>
-    </w:p>
-    <w:p>
-      <w:r>
-        <w:t>Band and fixed filter lists accept either YAML form; both are valid and can be mixed:</w:t>
-      </w:r>
-    </w:p>
-    <w:p>
-      <w:pPr>
-        <w:spacing w:before="0" w:after="0" w:line="240" w:lineRule="auto"/>
-        <w:ind w:left="113"/>
-        <w:shd w:val="clear" w:color="auto" w:fill="F2F2F2"/>
-      </w:pPr>
-      <w:r>
-        <w:rPr>
-          <w:rFonts w:ascii="Consolas" w:hAnsi="Consolas"/>
-          <w:sz w:val="18"/>
-        </w:rPr>
-        <w:t>gain_bands:</w:t>
-      </w:r>
-    </w:p>
-    <w:p>
-      <w:pPr>
-        <w:spacing w:before="0" w:after="0" w:line="240" w:lineRule="auto"/>
-        <w:ind w:left="113"/>
-        <w:shd w:val="clear" w:color="auto" w:fill="F2F2F2"/>
-      </w:pPr>
-      <w:r>
-        <w:rPr>
-          <w:rFonts w:ascii="Consolas" w:hAnsi="Consolas"/>
-          <w:sz w:val="18"/>
-        </w:rPr>
-        <w:t xml:space="preserve">  - name: Left 100Hz</w:t>
-      </w:r>
-    </w:p>
-    <w:p>
-      <w:pPr>
-        <w:spacing w:before="0" w:after="0" w:line="240" w:lineRule="auto"/>
-        <w:ind w:left="113"/>
-        <w:shd w:val="clear" w:color="auto" w:fill="F2F2F2"/>
-      </w:pPr>
-      <w:r>
-        <w:rPr>
-          <w:rFonts w:ascii="Consolas" w:hAnsi="Consolas"/>
-          <w:sz w:val="18"/>
-        </w:rPr>
-        <w:t xml:space="preserve">    frequency: 100Hz</w:t>
-      </w:r>
-    </w:p>
-    <w:p>
-      <w:pPr>
-        <w:spacing w:before="0" w:after="0" w:line="240" w:lineRule="auto"/>
-        <w:ind w:left="113"/>
-        <w:shd w:val="clear" w:color="auto" w:fill="F2F2F2"/>
-      </w:pPr>
-      <w:r>
-        <w:rPr>
-          <w:rFonts w:ascii="Consolas" w:hAnsi="Consolas"/>
-          <w:sz w:val="18"/>
-        </w:rPr>
-        <w:t xml:space="preserve">    channel: left</w:t>
-      </w:r>
-    </w:p>
-    <w:p>
-      <w:pPr>
-        <w:spacing w:before="0" w:after="160" w:line="240" w:lineRule="auto"/>
-        <w:ind w:left="113"/>
-        <w:shd w:val="clear" w:color="auto" w:fill="F2F2F2"/>
-      </w:pPr>
-      <w:r>
-        <w:rPr>
-          <w:rFonts w:ascii="Consolas" w:hAnsi="Consolas"/>
-          <w:sz w:val="18"/>
-        </w:rPr>
-        <w:t xml:space="preserve">  - {name: Left Bass, eq_filter: low_shelf, frequency: 80Hz, channel: left}</w:t>
-      </w:r>
-    </w:p>
-    <w:p>
-      <w:r>
-        <w:t xml:space="preserve">Commas without </w:t>
-      </w:r>
-      <w:r>
-        <w:rPr>
-          <w:rFonts w:ascii="Consolas" w:hAnsi="Consolas"/>
-          <w:sz w:val="20"/>
-        </w:rPr>
-        <w:t>{ }</w:t>
-      </w:r>
-      <w:r>
-        <w:t xml:space="preserve"> are invalid.</w:t>
-      </w:r>
-    </w:p>
-    <w:p>
-      <w:pPr>
-        <w:pStyle w:val="Heading1"/>
-      </w:pPr>
-      <w:r>
-        <w:t>Where the Filter Maths Lives</w:t>
-      </w:r>
-    </w:p>
-    <w:p>
-      <w:r>
-        <w:rPr>
-          <w:rFonts w:ascii="Consolas" w:hAnsi="Consolas"/>
-          <w:sz w:val="20"/>
-        </w:rPr>
-        <w:t>frequency_bands</w:t>
-      </w:r>
-      <w:r>
-        <w:t xml:space="preserve"> can change the frequency of any filter at runtime, so every filter's coefficient formula and the conversion to the DSP's 5.27 fixed point format must run on the device.</w:t>
-      </w:r>
-    </w:p>
-    <w:p>
-      <w:pPr>
-        <w:pStyle w:val="ListBullet"/>
-        <w:spacing w:after="60"/>
-      </w:pPr>
-      <w:r>
-        <w:rPr>
-          <w:b/>
-        </w:rPr>
-        <w:t>All coefficient maths lives in one library, run on the device.</w:t>
-      </w:r>
-      <w:r>
-        <w:t xml:space="preserve"> Python only validates. Calculating fixed filters in Python at compile time would need a second copy of the maths (Python cannot call the ESP32 library), for no real gain: the library is linked as soon as there is a slider, and calculating 30 biquads at boot takes well under a millisecond.</w:t>
-      </w:r>
-    </w:p>
-    <w:p>
-      <w:pPr>
-        <w:pStyle w:val="ListBullet"/>
-        <w:spacing w:after="60"/>
-      </w:pPr>
-      <w:r>
-        <w:t>The library is plain C/C++ with no ESPHome code: biquad design in double precision matching TI PurePath Console for all 8 filter types, and conversion to a fixed point format given as a parameter (5.27 for the TAS58xx), so other DACs could use it. It has its own tests against PurePath Console reference coefficients.</w:t>
-      </w:r>
-    </w:p>
-    <w:p>
-      <w:pPr>
-        <w:pStyle w:val="ListBullet"/>
-        <w:spacing w:after="60"/>
-      </w:pPr>
-      <w:r>
-        <w:t xml:space="preserve">It is published on the ESP Component Registry as </w:t>
-      </w:r>
-      <w:r>
-        <w:rPr>
-          <w:rFonts w:ascii="Consolas" w:hAnsi="Consolas"/>
-          <w:sz w:val="20"/>
-        </w:rPr>
-        <w:t>mrtoy-me/&lt;name&gt;</w:t>
-      </w:r>
-      <w:r>
-        <w:t xml:space="preserve">: sign in with GitHub, add </w:t>
-      </w:r>
-      <w:r>
-        <w:rPr>
-          <w:rFonts w:ascii="Consolas" w:hAnsi="Consolas"/>
-          <w:sz w:val="20"/>
-        </w:rPr>
-        <w:t>idf_component.yml</w:t>
-      </w:r>
-      <w:r>
-        <w:t xml:space="preserve">, </w:t>
-      </w:r>
-      <w:r>
-        <w:rPr>
-          <w:rFonts w:ascii="Consolas" w:hAnsi="Consolas"/>
-          <w:sz w:val="20"/>
-        </w:rPr>
-        <w:t>CMakeLists.txt</w:t>
-      </w:r>
-      <w:r>
-        <w:t xml:space="preserve"> and a licence, upload with Espressif's tool or GitHub action. Espressif does not review uploads.</w:t>
-      </w:r>
-    </w:p>
-    <w:p>
-      <w:pPr>
-        <w:pStyle w:val="Heading2"/>
-      </w:pPr>
-      <w:r>
-        <w:t>Option 2: EQ in core, maths in the library (chosen)</w:t>
-      </w:r>
-    </w:p>
-    <w:p>
-      <w:pPr>
-        <w:pStyle w:val="ListBullet"/>
-        <w:spacing w:after="60"/>
-      </w:pPr>
-      <w:r>
-        <w:t xml:space="preserve">Core tas58xx: the v2 YAML and entities, validation, biquad assignment, EQ switch, raw biquads, and the register writes through the existing </w:t>
-      </w:r>
-      <w:r>
-        <w:rPr>
-          <w:rFonts w:ascii="Consolas" w:hAnsi="Consolas"/>
-          <w:sz w:val="20"/>
-        </w:rPr>
-        <w:t>write_dsp_()</w:t>
-      </w:r>
-      <w:r>
-        <w:t xml:space="preserve"> mechanism.</w:t>
-      </w:r>
-    </w:p>
-    <w:p>
-      <w:pPr>
-        <w:pStyle w:val="ListBullet"/>
-        <w:spacing w:after="60"/>
-      </w:pPr>
-      <w:r>
-        <w:t xml:space="preserve">Core pulls the library in with </w:t>
-      </w:r>
-      <w:r>
-        <w:rPr>
-          <w:rFonts w:ascii="Consolas" w:hAnsi="Consolas"/>
-          <w:sz w:val="20"/>
-        </w:rPr>
-        <w:t>add_idf_component</w:t>
-      </w:r>
-      <w:r>
-        <w:t xml:space="preserve"> and lists it in </w:t>
-      </w:r>
-      <w:r>
-        <w:rPr>
-          <w:rFonts w:ascii="Consolas" w:hAnsi="Consolas"/>
-          <w:sz w:val="20"/>
-        </w:rPr>
-        <w:t>esphome/idf_component.yml</w:t>
-      </w:r>
-      <w:r>
-        <w:t>. EQ (fixed filters and bands) is ESP32 only.</w:t>
-      </w:r>
-    </w:p>
-    <w:p>
-      <w:pPr>
-        <w:pStyle w:val="ListBullet"/>
-        <w:spacing w:after="60"/>
-      </w:pPr>
-      <w:r>
-        <w:t xml:space="preserve">Precedent: espectre (esphome/esphome#19801, merged 2026-10-07) is a thin core component on top of its author's own registry library, </w:t>
-      </w:r>
-      <w:r>
-        <w:rPr>
-          <w:rFonts w:ascii="Consolas" w:hAnsi="Consolas"/>
-          <w:sz w:val="20"/>
-        </w:rPr>
-        <w:t>francescopace/espectre</w:t>
-      </w:r>
-      <w:r>
-        <w:t xml:space="preserve">; sendspin uses </w:t>
-      </w:r>
-      <w:r>
-        <w:rPr>
-          <w:rFonts w:ascii="Consolas" w:hAnsi="Consolas"/>
-          <w:sz w:val="20"/>
-        </w:rPr>
-        <w:t>sendspin/sendspin-cpp</w:t>
-      </w:r>
-      <w:r>
-        <w:t xml:space="preserve"> the same way.</w:t>
-      </w:r>
-    </w:p>
-    <w:p>
-      <w:pPr>
-        <w:pStyle w:val="Heading2"/>
-      </w:pPr>
-      <w:r>
-        <w:t>Likely Risks: Option 2</w:t>
-      </w:r>
-    </w:p>
-    <w:tbl>
-      <w:tblPr>
-        <w:tblStyle w:val="TableGrid"/>
-        <w:tblW w:type="auto" w:w="0"/>
-        <w:jc w:val="left"/>
-        <w:tblLook w:firstColumn="1" w:firstRow="1" w:lastColumn="0" w:lastRow="0" w:noHBand="0" w:noVBand="1" w:val="04A0"/>
-      </w:tblPr>
-      <w:tblGrid>
-        <w:gridCol w:w="4536"/>
-        <w:gridCol w:w="4536"/>
-      </w:tblGrid>
-      <w:tr>
-        <w:tc>
-          <w:tcPr>
-            <w:tcW w:type="dxa" w:w="3969"/>
-            <w:shd w:val="clear" w:color="auto" w:fill="D9E2F3"/>
-          </w:tcPr>
-          <w:p>
-            <w:pPr>
-              <w:spacing w:after="0"/>
-            </w:pPr>
-            <w:r>
-              <w:rPr>
-                <w:b/>
-              </w:rPr>
-              <w:t>Risk</w:t>
-            </w:r>
-          </w:p>
-        </w:tc>
-        <w:tc>
-          <w:tcPr>
-            <w:tcW w:type="dxa" w:w="5102"/>
-            <w:shd w:val="clear" w:color="auto" w:fill="D9E2F3"/>
-          </w:tcPr>
-          <w:p>
-            <w:pPr>
-              <w:spacing w:after="0"/>
-            </w:pPr>
-            <w:r>
-              <w:rPr>
-                <w:b/>
-              </w:rPr>
-              <w:t>Consequence</w:t>
-            </w:r>
-          </w:p>
-        </w:tc>
-      </w:tr>
-      <w:tr>
-        <w:tc>
-          <w:tcPr>
-            <w:tcW w:type="dxa" w:w="3969"/>
-          </w:tcPr>
-          <w:p>
-            <w:pPr>
-              <w:spacing w:after="0"/>
-            </w:pPr>
-            <w:r>
-              <w:t>Maintainers refuse a dependency not owned by ESPHome</w:t>
-            </w:r>
-          </w:p>
-        </w:tc>
-        <w:tc>
-          <w:tcPr>
-            <w:tcW w:type="dxa" w:w="5102"/>
-          </w:tcPr>
-          <w:p>
-            <w:pPr>
-              <w:spacing w:after="0"/>
-            </w:pPr>
-            <w:r>
-              <w:t>Move to option 3. The library and raw biquads are kept; the ESPHome EQ layer moves to an external component.</w:t>
-            </w:r>
-          </w:p>
-        </w:tc>
-      </w:tr>
-      <w:tr>
-        <w:tc>
-          <w:tcPr>
-            <w:tcW w:type="dxa" w:w="3969"/>
-          </w:tcPr>
-          <w:p>
-            <w:pPr>
-              <w:spacing w:after="0"/>
-            </w:pPr>
-            <w:r>
-              <w:t>Maintainers ask for the library to be hosted under the esphome-libs organisation</w:t>
-            </w:r>
-          </w:p>
-        </w:tc>
-        <w:tc>
-          <w:tcPr>
-            <w:tcW w:type="dxa" w:w="5102"/>
-          </w:tcPr>
-          <w:p>
-            <w:pPr>
-              <w:spacing w:after="0"/>
-            </w:pPr>
-            <w:r>
-              <w:t>Shared ownership: releases need their review, so fixes are slower. Otherwise fine.</w:t>
-            </w:r>
-          </w:p>
-        </w:tc>
-      </w:tr>
-      <w:tr>
-        <w:tc>
-          <w:tcPr>
-            <w:tcW w:type="dxa" w:w="3969"/>
-          </w:tcPr>
-          <w:p>
-            <w:pPr>
-              <w:spacing w:after="0"/>
-            </w:pPr>
-            <w:r>
-              <w:t>Every library fix needs a release plus a core PR to bump the version</w:t>
-            </w:r>
-          </w:p>
-        </w:tc>
-        <w:tc>
-          <w:tcPr>
-            <w:tcW w:type="dxa" w:w="5102"/>
-          </w:tcPr>
-          <w:p>
-            <w:pPr>
-              <w:spacing w:after="0"/>
-            </w:pPr>
-            <w:r>
-              <w:t>Slower fixes, two reviews per change.</w:t>
-            </w:r>
-          </w:p>
-        </w:tc>
-      </w:tr>
-      <w:tr>
-        <w:tc>
-          <w:tcPr>
-            <w:tcW w:type="dxa" w:w="3969"/>
-          </w:tcPr>
-          <w:p>
-            <w:pPr>
-              <w:spacing w:after="0"/>
-            </w:pPr>
-            <w:r>
-              <w:t>The ESPHome EQ layer is still large (YAML, entities, biquad assignment)</w:t>
-            </w:r>
-          </w:p>
-        </w:tc>
-        <w:tc>
-          <w:tcPr>
-            <w:tcW w:type="dxa" w:w="5102"/>
-          </w:tcPr>
-          <w:p>
-            <w:pPr>
-              <w:spacing w:after="0"/>
-            </w:pPr>
-            <w:r>
-              <w:t>Several PRs over months, one open at a time.</w:t>
-            </w:r>
-          </w:p>
-        </w:tc>
-      </w:tr>
-      <w:tr>
-        <w:tc>
-          <w:tcPr>
-            <w:tcW w:type="dxa" w:w="3969"/>
-          </w:tcPr>
-          <w:p>
-            <w:pPr>
-              <w:spacing w:after="0"/>
-            </w:pPr>
-            <w:r>
-              <w:t>ESP32 has no double precision hardware</w:t>
-            </w:r>
-          </w:p>
-        </w:tc>
-        <w:tc>
-          <w:tcPr>
-            <w:tcW w:type="dxa" w:w="5102"/>
-          </w:tcPr>
-          <w:p>
-            <w:pPr>
-              <w:spacing w:after="0"/>
-            </w:pPr>
-            <w:r>
-              <w:t>Coefficient calculation is slower, but it only runs at boot and on slider changes: negligible.</w:t>
-            </w:r>
-          </w:p>
-        </w:tc>
-      </w:tr>
-      <w:tr>
-        <w:tc>
-          <w:tcPr>
-            <w:tcW w:type="dxa" w:w="3969"/>
-          </w:tcPr>
-          <w:p>
-            <w:pPr>
-              <w:spacing w:after="0"/>
-            </w:pPr>
-            <w:r>
-              <w:t>EQ is ESP32 only (the library is an ESP-IDF component)</w:t>
-            </w:r>
-          </w:p>
-        </w:tc>
-        <w:tc>
-          <w:tcPr>
-            <w:tcW w:type="dxa" w:w="5102"/>
-          </w:tcPr>
-          <w:p>
-            <w:pPr>
-              <w:spacing w:after="0"/>
-            </w:pPr>
-            <w:r>
-              <w:t>Fixed filters and bands give a config error on other platforms; raw biquads still work everywhere.</w:t>
-            </w:r>
-          </w:p>
-        </w:tc>
-      </w:tr>
-    </w:tbl>
-    <w:p/>
-    <w:p>
-      <w:pPr>
-        <w:pStyle w:val="Heading2"/>
-      </w:pPr>
-      <w:r>
-        <w:t>Option 3: core feature, EQ sliders in an external component (fallback)</w:t>
-      </w:r>
-    </w:p>
-    <w:p>
-      <w:pPr>
-        <w:pStyle w:val="ListBullet"/>
-        <w:spacing w:after="60"/>
-      </w:pPr>
-      <w:r>
-        <w:t xml:space="preserve">Core tas58xx: raw biquads with </w:t>
-      </w:r>
-      <w:r>
-        <w:rPr>
-          <w:rFonts w:ascii="Consolas" w:hAnsi="Consolas"/>
-          <w:sz w:val="20"/>
-        </w:rPr>
-        <w:t>set_biquad()</w:t>
-      </w:r>
-      <w:r>
-        <w:t xml:space="preserve"> and its YAML action, plus the EQ switch. This is one maths-free feature with its own users, so the public API is not a hook without an in-tree user.</w:t>
-      </w:r>
-    </w:p>
-    <w:p>
-      <w:pPr>
-        <w:pStyle w:val="ListBullet"/>
-        <w:spacing w:after="60"/>
-      </w:pPr>
-      <w:r>
-        <w:t xml:space="preserve">An ESPHome external component (added by each user under </w:t>
-      </w:r>
-      <w:r>
-        <w:rPr>
-          <w:rFonts w:ascii="Consolas" w:hAnsi="Consolas"/>
-          <w:sz w:val="20"/>
-        </w:rPr>
-        <w:t>external_components:</w:t>
-      </w:r>
-      <w:r>
-        <w:t xml:space="preserve">) provides the fixed filters, bands and sliders, using the same registry library and feeding coefficients to </w:t>
-      </w:r>
-      <w:r>
-        <w:rPr>
-          <w:rFonts w:ascii="Consolas" w:hAnsi="Consolas"/>
-          <w:sz w:val="20"/>
-        </w:rPr>
-        <w:t>set_biquad()</w:t>
-      </w:r>
-      <w:r>
-        <w:t>.</w:t>
-      </w:r>
-    </w:p>
-    <w:p>
-      <w:pPr>
-        <w:pStyle w:val="ListBullet"/>
-        <w:spacing w:after="60"/>
-      </w:pPr>
-      <w:r>
-        <w:t xml:space="preserve">No "DSP writable" notification is needed: </w:t>
-      </w:r>
-      <w:r>
-        <w:rPr>
-          <w:rFonts w:ascii="Consolas" w:hAnsi="Consolas"/>
-          <w:sz w:val="20"/>
-        </w:rPr>
-        <w:t>set_biquad()</w:t>
-      </w:r>
-      <w:r>
-        <w:t xml:space="preserve"> keeps values pending and </w:t>
-      </w:r>
-      <w:r>
-        <w:rPr>
-          <w:rFonts w:ascii="Consolas" w:hAnsi="Consolas"/>
-          <w:sz w:val="20"/>
-        </w:rPr>
-        <w:t>write_dsp_()</w:t>
-      </w:r>
-      <w:r>
-        <w:t xml:space="preserve"> writes them when the DSP is writable.</w:t>
-      </w:r>
-    </w:p>
-    <w:p>
-      <w:pPr>
-        <w:pStyle w:val="ListBullet"/>
-        <w:spacing w:after="60"/>
-      </w:pPr>
-      <w:r>
-        <w:t>Only users who add the external component get sliders. That is acceptable: it is for those really interested.</w:t>
-      </w:r>
-    </w:p>
-    <w:p>
-      <w:pPr>
-        <w:pStyle w:val="Heading2"/>
-      </w:pPr>
-      <w:r>
-        <w:t>Likely Risks: Option 3</w:t>
-      </w:r>
-    </w:p>
-    <w:tbl>
-      <w:tblPr>
-        <w:tblStyle w:val="TableGrid"/>
-        <w:tblW w:type="auto" w:w="0"/>
-        <w:jc w:val="left"/>
-        <w:tblLook w:firstColumn="1" w:firstRow="1" w:lastColumn="0" w:lastRow="0" w:noHBand="0" w:noVBand="1" w:val="04A0"/>
-      </w:tblPr>
-      <w:tblGrid>
-        <w:gridCol w:w="4536"/>
-        <w:gridCol w:w="4536"/>
-      </w:tblGrid>
-      <w:tr>
-        <w:tc>
-          <w:tcPr>
-            <w:tcW w:type="dxa" w:w="3969"/>
-            <w:shd w:val="clear" w:color="auto" w:fill="D9E2F3"/>
-          </w:tcPr>
-          <w:p>
-            <w:pPr>
-              <w:spacing w:after="0"/>
-            </w:pPr>
-            <w:r>
-              <w:rPr>
-                <w:b/>
-              </w:rPr>
-              <w:t>Risk</w:t>
-            </w:r>
-          </w:p>
-        </w:tc>
-        <w:tc>
-          <w:tcPr>
-            <w:tcW w:type="dxa" w:w="5102"/>
-            <w:shd w:val="clear" w:color="auto" w:fill="D9E2F3"/>
-          </w:tcPr>
-          <w:p>
-            <w:pPr>
-              <w:spacing w:after="0"/>
-            </w:pPr>
-            <w:r>
-              <w:rPr>
-                <w:b/>
-              </w:rPr>
-              <w:t>Consequence</w:t>
-            </w:r>
-          </w:p>
-        </w:tc>
-      </w:tr>
-      <w:tr>
-        <w:tc>
-          <w:tcPr>
-            <w:tcW w:type="dxa" w:w="3969"/>
-          </w:tcPr>
-          <w:p>
-            <w:pPr>
-              <w:spacing w:after="0"/>
-            </w:pPr>
-            <w:r>
-              <w:t xml:space="preserve">Raw biquads or </w:t>
-            </w:r>
-            <w:r>
-              <w:rPr>
-                <w:rFonts w:ascii="Consolas" w:hAnsi="Consolas"/>
-                <w:sz w:val="20"/>
-              </w:rPr>
-              <w:t>set_biquad()</w:t>
-            </w:r>
-            <w:r>
-              <w:t xml:space="preserve"> rejected as not needed in core</w:t>
-            </w:r>
-          </w:p>
-        </w:tc>
-        <w:tc>
-          <w:tcPr>
-            <w:tcW w:type="dxa" w:w="5102"/>
-          </w:tcPr>
-          <w:p>
-            <w:pPr>
-              <w:spacing w:after="0"/>
-            </w:pPr>
-            <w:r>
-              <w:t>Only the fork remains, as a full replacement of the tas58xx component (today's situation).</w:t>
-            </w:r>
-          </w:p>
-        </w:tc>
-      </w:tr>
-      <w:tr>
-        <w:tc>
-          <w:tcPr>
-            <w:tcW w:type="dxa" w:w="3969"/>
-          </w:tcPr>
-          <w:p>
-            <w:pPr>
-              <w:spacing w:after="0"/>
-            </w:pPr>
-            <w:r>
-              <w:t xml:space="preserve">Reviewers keep raw biquads but drop the public action / </w:t>
-            </w:r>
-            <w:r>
-              <w:rPr>
-                <w:rFonts w:ascii="Consolas" w:hAnsi="Consolas"/>
-                <w:sz w:val="20"/>
-              </w:rPr>
-              <w:t>set_biquad()</w:t>
-            </w:r>
-          </w:p>
-        </w:tc>
-        <w:tc>
-          <w:tcPr>
-            <w:tcW w:type="dxa" w:w="5102"/>
-          </w:tcPr>
-          <w:p>
-            <w:pPr>
-              <w:spacing w:after="0"/>
-            </w:pPr>
-            <w:r>
-              <w:t>The external component cannot feed coefficients and must replace the whole component, as the fork does.</w:t>
-            </w:r>
-          </w:p>
-        </w:tc>
-      </w:tr>
-      <w:tr>
-        <w:tc>
-          <w:tcPr>
-            <w:tcW w:type="dxa" w:w="3969"/>
-          </w:tcPr>
-          <w:p>
-            <w:pPr>
-              <w:spacing w:after="0"/>
-            </w:pPr>
-            <w:r>
-              <w:t>RAM for pending coefficients questioned (up to 15 x 2 x 5 values, about 600 bytes)</w:t>
-            </w:r>
-          </w:p>
-        </w:tc>
-        <w:tc>
-          <w:tcPr>
-            <w:tcW w:type="dxa" w:w="5102"/>
-          </w:tcPr>
-          <w:p>
-            <w:pPr>
-              <w:spacing w:after="0"/>
-            </w:pPr>
-            <w:r>
-              <w:t>Store only the raw biquads actually used, allocated at setup.</w:t>
-            </w:r>
-          </w:p>
-        </w:tc>
-      </w:tr>
-      <w:tr>
-        <w:tc>
-          <w:tcPr>
-            <w:tcW w:type="dxa" w:w="3969"/>
-          </w:tcPr>
-          <w:p>
-            <w:pPr>
-              <w:spacing w:after="0"/>
-            </w:pPr>
-            <w:r>
-              <w:t>Later ESPHome refactors change core tas58xx</w:t>
-            </w:r>
-          </w:p>
-        </w:tc>
-        <w:tc>
-          <w:tcPr>
-            <w:tcW w:type="dxa" w:w="5102"/>
-          </w:tcPr>
-          <w:p>
-            <w:pPr>
-              <w:spacing w:after="0"/>
-            </w:pPr>
-            <w:r>
-              <w:t>The external component must follow ESPHome dev releases to keep working.</w:t>
-            </w:r>
-          </w:p>
-        </w:tc>
-      </w:tr>
-      <w:tr>
-        <w:tc>
-          <w:tcPr>
-            <w:tcW w:type="dxa" w:w="3969"/>
-          </w:tcPr>
-          <w:p>
-            <w:pPr>
-              <w:spacing w:after="0"/>
-            </w:pPr>
-            <w:r>
-              <w:t>Coefficient sign conventions confuse users (exports differ)</w:t>
-            </w:r>
-          </w:p>
-        </w:tc>
-        <w:tc>
-          <w:tcPr>
-            <w:tcW w:type="dxa" w:w="5102"/>
-          </w:tcPr>
-          <w:p>
-            <w:pPr>
-              <w:spacing w:after="0"/>
-            </w:pPr>
-            <w:r>
-              <w:t>Wrong or unstable filters; reduced by the stability check, a clear convention and documented exports.</w:t>
-            </w:r>
-          </w:p>
-        </w:tc>
-      </w:tr>
-    </w:tbl>
-    <w:p/>
-    <w:p>
-      <w:pPr>
-        <w:pStyle w:val="Heading2"/>
-      </w:pPr>
-      <w:r>
-        <w:t>Other Options</w:t>
-      </w:r>
-    </w:p>
-    <w:p>
-      <w:pPr>
-        <w:pStyle w:val="ListBullet"/>
-        <w:spacing w:after="60"/>
-      </w:pPr>
-      <w:r>
-        <w:rPr>
-          <w:b/>
-        </w:rPr>
-        <w:t>1. Espressif ESP-DSP:</w:t>
-      </w:r>
-      <w:r>
-        <w:t xml:space="preserve"> out. Single precision float only, so it cannot match PurePath Console in 5.27 (27 fraction bits, a float has 24); no notch or band pass by bandwidth.</w:t>
-      </w:r>
-    </w:p>
-    <w:p>
-      <w:pPr>
-        <w:pStyle w:val="ListBullet"/>
-        <w:spacing w:after="60"/>
-      </w:pPr>
-      <w:r>
-        <w:rPr>
-          <w:b/>
-        </w:rPr>
-        <w:t>5. Existing external libraries:</w:t>
-      </w:r>
-      <w:r>
-        <w:t xml:space="preserve"> out. </w:t>
-      </w:r>
-      <w:r>
-        <w:rPr>
-          <w:rFonts w:ascii="Consolas" w:hAnsi="Consolas"/>
-          <w:sz w:val="20"/>
-        </w:rPr>
-        <w:t>esp_audio_effects</w:t>
-      </w:r>
-      <w:r>
-        <w:t xml:space="preserve"> EQ is a closed binary that processes the audio itself; </w:t>
-      </w:r>
-      <w:r>
-        <w:rPr>
-          <w:rFonts w:ascii="Consolas" w:hAnsi="Consolas"/>
-          <w:sz w:val="20"/>
-        </w:rPr>
-        <w:t>iir1</w:t>
-      </w:r>
-      <w:r>
-        <w:t xml:space="preserve"> is a full processing library, not an IDF component, without PurePath Console's conventions; </w:t>
-      </w:r>
-      <w:r>
-        <w:rPr>
-          <w:rFonts w:ascii="Consolas" w:hAnsi="Consolas"/>
-          <w:sz w:val="20"/>
-        </w:rPr>
-        <w:t>esp-audio-libs</w:t>
-      </w:r>
-      <w:r>
-        <w:t xml:space="preserve"> was reduced to its resampler.</w:t>
-      </w:r>
-    </w:p>
-    <w:p>
-      <w:pPr>
-        <w:pStyle w:val="ListBullet"/>
-        <w:spacing w:after="60"/>
-      </w:pPr>
-      <w:r>
-        <w:rPr>
-          <w:b/>
-        </w:rPr>
-        <w:t>4. All maths in core:</w:t>
-      </w:r>
-      <w:r>
-        <w:t xml:space="preserve"> only as a last resort. It is likely too much code for core review, and acceptance cannot be known before a PR.</w:t>
-      </w:r>
-    </w:p>
-    <w:p>
-      <w:pPr>
-        <w:pStyle w:val="Heading1"/>
-      </w:pPr>
-      <w:r>
-        <w:t>Open Points</w:t>
-      </w:r>
-    </w:p>
-    <w:p>
-      <w:pPr>
-        <w:pStyle w:val="ListBullet"/>
-        <w:spacing w:after="60"/>
-      </w:pPr>
-      <w:r>
-        <w:t xml:space="preserve">Default of </w:t>
-      </w:r>
-      <w:r>
-        <w:rPr>
-          <w:rFonts w:ascii="Consolas" w:hAnsi="Consolas"/>
-          <w:sz w:val="20"/>
-        </w:rPr>
-        <w:t>channel</w:t>
-      </w:r>
-      <w:r>
-        <w:t xml:space="preserve"> (both for now, may change).</w:t>
-      </w:r>
-    </w:p>
-    <w:p>
-      <w:pPr>
-        <w:pStyle w:val="ListBullet"/>
-        <w:spacing w:after="60"/>
-      </w:pPr>
-      <w:r>
-        <w:t xml:space="preserve">Defaults of </w:t>
-      </w:r>
-      <w:r>
-        <w:rPr>
-          <w:rFonts w:ascii="Consolas" w:hAnsi="Consolas"/>
-          <w:sz w:val="20"/>
-        </w:rPr>
-        <w:t>gain_min</w:t>
-      </w:r>
-      <w:r>
-        <w:t xml:space="preserve"> and </w:t>
-      </w:r>
-      <w:r>
-        <w:rPr>
-          <w:rFonts w:ascii="Consolas" w:hAnsi="Consolas"/>
-          <w:sz w:val="20"/>
-        </w:rPr>
-        <w:t>gain_max</w:t>
-      </w:r>
-      <w:r>
-        <w:t>.</w:t>
-      </w:r>
-    </w:p>
-    <w:p>
-      <w:pPr>
-        <w:pStyle w:val="ListBullet"/>
-        <w:spacing w:after="60"/>
-      </w:pPr>
-      <w:r>
-        <w:t>Per-band slider ranges, if the platform-level ranges are not enough.</w:t>
-      </w:r>
-    </w:p>
-    <w:p>
-      <w:pPr>
-        <w:pStyle w:val="ListBullet"/>
-        <w:spacing w:after="60"/>
-      </w:pPr>
-      <w:r>
-        <w:t>An initial value option for sliders.</w:t>
-      </w:r>
-    </w:p>
-    <w:p>
-      <w:pPr>
-        <w:pStyle w:val="ListBullet"/>
-        <w:spacing w:after="60"/>
-      </w:pPr>
-      <w:r>
-        <w:t xml:space="preserve">An optional </w:t>
-      </w:r>
-      <w:r>
-        <w:rPr>
-          <w:rFonts w:ascii="Consolas" w:hAnsi="Consolas"/>
-          <w:sz w:val="20"/>
-        </w:rPr>
-        <w:t>bandwidth</w:t>
-      </w:r>
-      <w:r>
-        <w:t xml:space="preserve"> for </w:t>
-      </w:r>
-      <w:r>
-        <w:rPr>
-          <w:rFonts w:ascii="Consolas" w:hAnsi="Consolas"/>
-          <w:sz w:val="20"/>
-        </w:rPr>
-        <w:t>notch</w:t>
-      </w:r>
-      <w:r>
-        <w:t xml:space="preserve"> and </w:t>
-      </w:r>
-      <w:r>
-        <w:rPr>
-          <w:rFonts w:ascii="Consolas" w:hAnsi="Consolas"/>
-          <w:sz w:val="20"/>
-        </w:rPr>
-        <w:t>band_pass</w:t>
-      </w:r>
-      <w:r>
-        <w:t xml:space="preserve"> (as an alternative to </w:t>
-      </w:r>
-      <w:r>
-        <w:rPr>
-          <w:rFonts w:ascii="Consolas" w:hAnsi="Consolas"/>
-          <w:sz w:val="20"/>
-        </w:rPr>
-        <w:t>q_factor</w:t>
-      </w:r>
-      <w:r>
-        <w:t>), to copy filters from TI PurePath Console.</w:t>
-      </w:r>
-    </w:p>
-    <w:p>
-      <w:pPr>
-        <w:pStyle w:val="ListBullet"/>
-        <w:spacing w:after="60"/>
-      </w:pPr>
-      <w:r>
-        <w:t>Raw biquads: confirm the coefficient order and sign convention of PurePath Console and REW exports, and whether to accept their export format directly.</w:t>
-      </w:r>
-    </w:p>
-    <w:p>
-      <w:pPr>
-        <w:pStyle w:val="ListBullet"/>
-        <w:spacing w:after="60"/>
-      </w:pPr>
-      <w:r>
-        <w:t xml:space="preserve">Raw biquads: the name and options of the YAML action for </w:t>
-      </w:r>
-      <w:r>
-        <w:rPr>
-          <w:rFonts w:ascii="Consolas" w:hAnsi="Consolas"/>
-          <w:sz w:val="20"/>
-        </w:rPr>
-        <w:t>set_biquad()</w:t>
-      </w:r>
-      <w:r>
-        <w:t>.</w:t>
-      </w:r>
-    </w:p>
-    <w:p>
-      <w:pPr>
-        <w:pStyle w:val="ListBullet"/>
-        <w:spacing w:after="60"/>
-      </w:pPr>
-      <w:r>
-        <w:t>The library's name.</w:t>
-      </w:r>
-    </w:p>
-    <w:sectPr>
-      <w:pgSz w:w="11906" w:h="16838"/>
-      <w:pgMar w:top="1247" w:right="1417" w:bottom="1247" w:left="1417" w:header="720" w:footer="720" w:gutter="0"/>
-      <w:cols w:space="720"/>
-      <w:docGrid w:linePitch="360"/>
-    </w:sectPr>
-  </w:body>
-</w:document>
-</file>
 
 <file path=word/numbering.xml><?xml version="1.0" encoding="utf-8"?>
 <w:numbering xmlns:wpc="http://schemas.microsoft.com/office/word/2010/wordprocessingCanvas" xmlns:mo="http://schemas.microsoft.com/office/mac/office/2008/main" xmlns:mc="http://schemas.openxmlformats.org/markup-compatibility/2006" xmlns:mv="urn:schemas-microsoft-com:mac:vml" xmlns:o="urn:schemas-microsoft-com:office:office" xmlns:r="http://schemas.openxmlformats.org/officeDocument/2006/relationships" xmlns:m="http://schemas.openxmlformats.org/officeDocument/2006/math" xmlns:v="urn:schemas-microsoft-com:vml" xmlns:wp14="http://schemas.microsoft.com/office/word/2010/wordprocessingDrawing" xmlns:wp="http://schemas.openxmlformats.org/drawingml/2006/wordprocessingDrawing" xmlns:w10="urn:schemas-microsoft-com:office:word" xmlns:w="http://schemas.openxmlformats.org/wordprocessingml/2006/main" xmlns:w14="http://schemas.microsoft.com/office/word/2010/wordml" xmlns:wpg="http://schemas.microsoft.com/office/word/2010/wordprocessingGroup" xmlns:wpi="http://schemas.microsoft.com/office/word/2010/wordprocessingInk" xmlns:wne="http://schemas.microsoft.com/office/word/2006/wordml" xmlns:wps="http://schemas.microsoft.com/office/word/2010/wordprocessingShape" mc:Ignorable="w14 wp14">

</xml_diff>